<commit_message>
diagram pngs uploaded and some refinements made to report
</commit_message>
<xml_diff>
--- a/Stage1_Report.docx
+++ b/Stage1_Report.docx
@@ -4360,7 +4360,7 @@
           </w:tcPr>
           <w:p>
             <w:r>
-              <w:t>Plot Outline</w:t>
+              <w:t>Pivotal Events</w:t>
             </w:r>
           </w:p>
         </w:tc>
@@ -7498,7 +7498,10 @@
         <w:keepNext/>
       </w:pPr>
       <w:r>
-        <w:t>F06: Plot Outline</w:t>
+        <w:t xml:space="preserve">F06: </w:t>
+      </w:r>
+      <w:r>
+        <w:t>Pivotal Events</w:t>
       </w:r>
     </w:p>
     <w:tbl>
@@ -7571,7 +7574,10 @@
           </w:tcPr>
           <w:p>
             <w:r>
-              <w:t>F06: Plot Outline</w:t>
+              <w:t xml:space="preserve">F06: </w:t>
+            </w:r>
+            <w:r>
+              <w:t>Pivotal Events</w:t>
             </w:r>
           </w:p>
         </w:tc>
@@ -12266,7 +12272,7 @@
         <w:spacing w:after="120"/>
       </w:pPr>
       <w:r>
-        <w:t>At least five patterns covered in the course, each solving an identifiable design problem. Patterns listed in the handout: Strategy, Observer, Factory Method, Abstract Factory, Singleton, Adapter, Facade, Command, State, Template Method, Decorator, Composite, Iterator, MVC.</w:t>
+        <w:t xml:space="preserve">This project will use: Adapter, </w:t>
       </w:r>
     </w:p>
     <w:p>
@@ -13407,7 +13413,6 @@
                 <w:b/>
                 <w:bCs/>
               </w:rPr>
-              <w:lastRenderedPageBreak/>
               <w:t>Related features</w:t>
             </w:r>
           </w:p>
@@ -20021,224 +20026,6 @@
                 <w:szCs w:val="18"/>
               </w:rPr>
               <w:t>AI</w:t>
-            </w:r>
-          </w:p>
-        </w:tc>
-        <w:tc>
-          <w:tcPr>
-            <w:tcW w:w="1400" w:type="dxa"/>
-            <w:tcBorders>
-              <w:top w:val="single" w:sz="4" w:space="0" w:color="BFBFBF"/>
-              <w:left w:val="single" w:sz="4" w:space="0" w:color="BFBFBF"/>
-              <w:bottom w:val="single" w:sz="4" w:space="0" w:color="BFBFBF"/>
-              <w:right w:val="single" w:sz="4" w:space="0" w:color="BFBFBF"/>
-            </w:tcBorders>
-            <w:tcMar>
-              <w:top w:w="70" w:type="dxa"/>
-              <w:left w:w="110" w:type="dxa"/>
-              <w:bottom w:w="70" w:type="dxa"/>
-              <w:right w:w="110" w:type="dxa"/>
-            </w:tcMar>
-          </w:tcPr>
-          <w:p>
-            <w:r>
-              <w:rPr>
-                <w:i/>
-                <w:iCs/>
-                <w:color w:val="7A7A7A"/>
-              </w:rPr>
-              <w:t>[TODO: UC##]</w:t>
-            </w:r>
-          </w:p>
-        </w:tc>
-        <w:tc>
-          <w:tcPr>
-            <w:tcW w:w="2200" w:type="dxa"/>
-            <w:tcBorders>
-              <w:top w:val="single" w:sz="4" w:space="0" w:color="BFBFBF"/>
-              <w:left w:val="single" w:sz="4" w:space="0" w:color="BFBFBF"/>
-              <w:bottom w:val="single" w:sz="4" w:space="0" w:color="BFBFBF"/>
-              <w:right w:val="single" w:sz="4" w:space="0" w:color="BFBFBF"/>
-            </w:tcBorders>
-            <w:tcMar>
-              <w:top w:w="70" w:type="dxa"/>
-              <w:left w:w="110" w:type="dxa"/>
-              <w:bottom w:w="70" w:type="dxa"/>
-              <w:right w:w="110" w:type="dxa"/>
-            </w:tcMar>
-          </w:tcPr>
-          <w:p>
-            <w:r>
-              <w:rPr>
-                <w:i/>
-                <w:iCs/>
-                <w:color w:val="7A7A7A"/>
-              </w:rPr>
-              <w:t>[TODO: classes]</w:t>
-            </w:r>
-          </w:p>
-        </w:tc>
-        <w:tc>
-          <w:tcPr>
-            <w:tcW w:w="2000" w:type="dxa"/>
-            <w:tcBorders>
-              <w:top w:val="single" w:sz="4" w:space="0" w:color="BFBFBF"/>
-              <w:left w:val="single" w:sz="4" w:space="0" w:color="BFBFBF"/>
-              <w:bottom w:val="single" w:sz="4" w:space="0" w:color="BFBFBF"/>
-              <w:right w:val="single" w:sz="4" w:space="0" w:color="BFBFBF"/>
-            </w:tcBorders>
-            <w:tcMar>
-              <w:top w:w="70" w:type="dxa"/>
-              <w:left w:w="110" w:type="dxa"/>
-              <w:bottom w:w="70" w:type="dxa"/>
-              <w:right w:w="110" w:type="dxa"/>
-            </w:tcMar>
-          </w:tcPr>
-          <w:p>
-            <w:r>
-              <w:rPr>
-                <w:i/>
-                <w:iCs/>
-                <w:color w:val="7A7A7A"/>
-              </w:rPr>
-              <w:t>[TODO: methods]</w:t>
-            </w:r>
-          </w:p>
-        </w:tc>
-        <w:tc>
-          <w:tcPr>
-            <w:tcW w:w="1160" w:type="dxa"/>
-            <w:tcBorders>
-              <w:top w:val="single" w:sz="4" w:space="0" w:color="BFBFBF"/>
-              <w:left w:val="single" w:sz="4" w:space="0" w:color="BFBFBF"/>
-              <w:bottom w:val="single" w:sz="4" w:space="0" w:color="BFBFBF"/>
-              <w:right w:val="single" w:sz="4" w:space="0" w:color="BFBFBF"/>
-            </w:tcBorders>
-            <w:tcMar>
-              <w:top w:w="70" w:type="dxa"/>
-              <w:left w:w="110" w:type="dxa"/>
-              <w:bottom w:w="70" w:type="dxa"/>
-              <w:right w:w="110" w:type="dxa"/>
-            </w:tcMar>
-          </w:tcPr>
-          <w:p>
-            <w:r>
-              <w:rPr>
-                <w:i/>
-                <w:iCs/>
-                <w:color w:val="7A7A7A"/>
-              </w:rPr>
-              <w:t>[TODO: SD##]</w:t>
-            </w:r>
-          </w:p>
-        </w:tc>
-        <w:tc>
-          <w:tcPr>
-            <w:tcW w:w="1300" w:type="dxa"/>
-            <w:tcBorders>
-              <w:top w:val="single" w:sz="4" w:space="0" w:color="BFBFBF"/>
-              <w:left w:val="single" w:sz="4" w:space="0" w:color="BFBFBF"/>
-              <w:bottom w:val="single" w:sz="4" w:space="0" w:color="BFBFBF"/>
-              <w:right w:val="single" w:sz="4" w:space="0" w:color="BFBFBF"/>
-            </w:tcBorders>
-            <w:tcMar>
-              <w:top w:w="70" w:type="dxa"/>
-              <w:left w:w="110" w:type="dxa"/>
-              <w:bottom w:w="70" w:type="dxa"/>
-              <w:right w:w="110" w:type="dxa"/>
-            </w:tcMar>
-          </w:tcPr>
-          <w:p>
-            <w:r>
-              <w:rPr>
-                <w:i/>
-                <w:iCs/>
-                <w:color w:val="7A7A7A"/>
-              </w:rPr>
-              <w:t>[TODO: patterns]</w:t>
-            </w:r>
-          </w:p>
-        </w:tc>
-      </w:tr>
-      <w:tr>
-        <w:trPr>
-          <w:cantSplit/>
-        </w:trPr>
-        <w:tc>
-          <w:tcPr>
-            <w:tcW w:w="900" w:type="dxa"/>
-            <w:tcBorders>
-              <w:top w:val="single" w:sz="4" w:space="0" w:color="BFBFBF"/>
-              <w:left w:val="single" w:sz="4" w:space="0" w:color="BFBFBF"/>
-              <w:bottom w:val="single" w:sz="4" w:space="0" w:color="BFBFBF"/>
-              <w:right w:val="single" w:sz="4" w:space="0" w:color="BFBFBF"/>
-            </w:tcBorders>
-            <w:tcMar>
-              <w:top w:w="70" w:type="dxa"/>
-              <w:left w:w="110" w:type="dxa"/>
-              <w:bottom w:w="70" w:type="dxa"/>
-              <w:right w:w="110" w:type="dxa"/>
-            </w:tcMar>
-          </w:tcPr>
-          <w:p>
-            <w:r>
-              <w:rPr>
-                <w:sz w:val="18"/>
-                <w:szCs w:val="18"/>
-              </w:rPr>
-              <w:t>F14</w:t>
-            </w:r>
-          </w:p>
-        </w:tc>
-        <w:tc>
-          <w:tcPr>
-            <w:tcW w:w="2700" w:type="dxa"/>
-            <w:tcBorders>
-              <w:top w:val="single" w:sz="4" w:space="0" w:color="BFBFBF"/>
-              <w:left w:val="single" w:sz="4" w:space="0" w:color="BFBFBF"/>
-              <w:bottom w:val="single" w:sz="4" w:space="0" w:color="BFBFBF"/>
-              <w:right w:val="single" w:sz="4" w:space="0" w:color="BFBFBF"/>
-            </w:tcBorders>
-            <w:tcMar>
-              <w:top w:w="70" w:type="dxa"/>
-              <w:left w:w="110" w:type="dxa"/>
-              <w:bottom w:w="70" w:type="dxa"/>
-              <w:right w:w="110" w:type="dxa"/>
-            </w:tcMar>
-          </w:tcPr>
-          <w:p>
-            <w:r>
-              <w:rPr>
-                <w:sz w:val="18"/>
-                <w:szCs w:val="18"/>
-              </w:rPr>
-              <w:t>Export Story (tentative)</w:t>
-            </w:r>
-          </w:p>
-        </w:tc>
-        <w:tc>
-          <w:tcPr>
-            <w:tcW w:w="1300" w:type="dxa"/>
-            <w:tcBorders>
-              <w:top w:val="single" w:sz="4" w:space="0" w:color="BFBFBF"/>
-              <w:left w:val="single" w:sz="4" w:space="0" w:color="BFBFBF"/>
-              <w:bottom w:val="single" w:sz="4" w:space="0" w:color="BFBFBF"/>
-              <w:right w:val="single" w:sz="4" w:space="0" w:color="BFBFBF"/>
-            </w:tcBorders>
-            <w:tcMar>
-              <w:top w:w="70" w:type="dxa"/>
-              <w:left w:w="110" w:type="dxa"/>
-              <w:bottom w:w="70" w:type="dxa"/>
-              <w:right w:w="110" w:type="dxa"/>
-            </w:tcMar>
-          </w:tcPr>
-          <w:p>
-            <w:r>
-              <w:rPr>
-                <w:sz w:val="18"/>
-                <w:szCs w:val="18"/>
-              </w:rPr>
-              <w:t>Deterministic</w:t>
             </w:r>
           </w:p>
         </w:tc>

</xml_diff>

<commit_message>
Section 2 F01 done
</commit_message>
<xml_diff>
--- a/Stage1_Report.docx
+++ b/Stage1_Report.docx
@@ -3322,19 +3322,7 @@
         <w:spacing w:before="160" w:after="60"/>
       </w:pPr>
       <w:r>
-        <w:t xml:space="preserve">In this application, the user will be able to interact with the agent through either a GUI or a CLI. </w:t>
-      </w:r>
-      <w:r>
-        <w:t>Both</w:t>
-      </w:r>
-      <w:r>
-        <w:t xml:space="preserve"> </w:t>
-      </w:r>
-      <w:r>
-        <w:t xml:space="preserve">will </w:t>
-      </w:r>
-      <w:r>
-        <w:t>send the user’s actions to the same controller, which means that every major feature is available from either one. The controller then works with two things: the story’s state, which is stored and enforced by the application, and the agent, which decides what happens next in the story.</w:t>
+        <w:t>In this application, the user will be able to interact with the agent through either a GUI or a CLI. Both will send the user’s actions to the same controller, which means that every major feature is available from either one. The controller then works with two things: the story’s state, which is stored and enforced by the application, and the agent, which decides what happens next in the story.</w:t>
       </w:r>
     </w:p>
     <w:p>
@@ -3343,22 +3331,13 @@
         <w:spacing w:before="160" w:after="60"/>
       </w:pPr>
       <w:r>
-        <w:t>The agent will communicate with Claude Sonnet 5.5 through</w:t>
-      </w:r>
-      <w:r>
-        <w:t xml:space="preserve"> an adapter</w:t>
-      </w:r>
-      <w:r>
-        <w:t xml:space="preserve">, which allows the model to be swapped out without changing the rest of the </w:t>
+        <w:t xml:space="preserve">The agent will communicate with Claude Sonnet 5.5 through an adapter, which allows the model to be swapped out without changing the rest of the </w:t>
       </w:r>
       <w:r>
         <w:t>app</w:t>
       </w:r>
       <w:r>
-        <w:t>. The agent will not be able to change the story’s state on its own. When it needs to read or change something like a lore entry or a character, it makes a tool call that the application checks and carries out before returning the result. This comes with the benefit of keeping lore and characters under the user’s control, as any new entries are only saved with the user’s approval</w:t>
-      </w:r>
-      <w:r>
-        <w:t xml:space="preserve">. </w:t>
+        <w:t xml:space="preserve">. The agent will not be able to change the story’s state on its own. When it needs to read or change something like a lore entry or a character, it makes a tool call that the application checks and carries out before returning the result. This comes with the benefit of keeping lore and characters under the user’s control, as any new entries are only saved with the user’s approval. </w:t>
       </w:r>
     </w:p>
     <w:p>
@@ -3766,10 +3745,7 @@
               <w:keepNext/>
             </w:pPr>
             <w:r>
-              <w:t>User a</w:t>
-            </w:r>
-            <w:r>
-              <w:t>pproval of proposed lore</w:t>
+              <w:t>User approval of proposed lore</w:t>
             </w:r>
           </w:p>
         </w:tc>
@@ -4963,11 +4939,26 @@
     </w:p>
     <w:p>
       <w:pPr>
+        <w:rPr>
+          <w:b/>
+          <w:bCs/>
+          <w:color w:val="2F5496"/>
+          <w:sz w:val="26"/>
+          <w:szCs w:val="26"/>
+        </w:rPr>
+      </w:pPr>
+      <w:bookmarkStart w:id="8" w:name="_Toc242439982"/>
+      <w:r>
+        <w:br w:type="page"/>
+      </w:r>
+    </w:p>
+    <w:p>
+      <w:pPr>
         <w:pStyle w:val="Heading2"/>
         <w:keepNext/>
       </w:pPr>
-      <w:bookmarkStart w:id="8" w:name="_Toc242439982"/>
-      <w:r>
+      <w:r>
+        <w:lastRenderedPageBreak/>
         <w:t>2.2 Feature Details</w:t>
       </w:r>
       <w:bookmarkEnd w:id="8"/>
@@ -5105,7 +5096,19 @@
           </w:tcPr>
           <w:p>
             <w:r>
-              <w:t>The user creates a scenario (premise, tone, setting, starting situation) by writing it directly or by having the agent generate one from a short prompt.</w:t>
+              <w:t>The user creates a scenario (</w:t>
+            </w:r>
+            <w:r>
+              <w:t xml:space="preserve">title, </w:t>
+            </w:r>
+            <w:r>
+              <w:t xml:space="preserve">premise, tone, setting, </w:t>
+            </w:r>
+            <w:r>
+              <w:t>opening</w:t>
+            </w:r>
+            <w:r>
+              <w:t xml:space="preserve"> situation) by writing it directly or by having the agent generate one from a short prompt.</w:t>
             </w:r>
           </w:p>
         </w:tc>
@@ -5159,12 +5162,30 @@
           </w:tcPr>
           <w:p>
             <w:r>
-              <w:rPr>
-                <w:i/>
-                <w:iCs/>
-                <w:color w:val="7A7A7A"/>
-              </w:rPr>
-              <w:t>[TODO: How does the user access or use this feature through the GUI?]</w:t>
+              <w:t>Accessed after clicking a plus button</w:t>
+            </w:r>
+            <w:r>
+              <w:t xml:space="preserve"> in the </w:t>
+            </w:r>
+            <w:proofErr w:type="spellStart"/>
+            <w:r>
+              <w:t>storylist</w:t>
+            </w:r>
+            <w:proofErr w:type="spellEnd"/>
+            <w:r>
+              <w:t xml:space="preserve">, bringing up a form with </w:t>
+            </w:r>
+            <w:r>
+              <w:t>six</w:t>
+            </w:r>
+            <w:r>
+              <w:t xml:space="preserve"> fields</w:t>
+            </w:r>
+            <w:r>
+              <w:t xml:space="preserve"> (5 for user scenario, 1 for user’s plot basis)</w:t>
+            </w:r>
+            <w:r>
+              <w:t>, prompt text box with a generate button and a start button.</w:t>
             </w:r>
           </w:p>
         </w:tc>
@@ -5218,12 +5239,71 @@
           </w:tcPr>
           <w:p>
             <w:r>
-              <w:rPr>
-                <w:i/>
-                <w:iCs/>
-                <w:color w:val="7A7A7A"/>
-              </w:rPr>
-              <w:t>[TODO: What information does the feature require?]</w:t>
+              <w:t>Requires text input from the user:</w:t>
+            </w:r>
+          </w:p>
+          <w:p>
+            <w:r>
+              <w:t xml:space="preserve">Can be five fields from the user (title, </w:t>
+            </w:r>
+            <w:r>
+              <w:rPr>
+                <w:b/>
+                <w:bCs/>
+              </w:rPr>
+              <w:t>premise</w:t>
+            </w:r>
+            <w:r>
+              <w:t xml:space="preserve">, tone, </w:t>
+            </w:r>
+            <w:r>
+              <w:rPr>
+                <w:b/>
+                <w:bCs/>
+              </w:rPr>
+              <w:t>setting</w:t>
+            </w:r>
+            <w:r>
+              <w:t xml:space="preserve"> and </w:t>
+            </w:r>
+            <w:proofErr w:type="spellStart"/>
+            <w:r>
+              <w:t>openingSituation</w:t>
+            </w:r>
+            <w:proofErr w:type="spellEnd"/>
+            <w:r>
+              <w:t>)</w:t>
+            </w:r>
+            <w:r>
+              <w:t xml:space="preserve"> [premise and setting mandatory</w:t>
+            </w:r>
+            <w:r>
+              <w:t>; title made if left empty</w:t>
+            </w:r>
+            <w:r>
+              <w:t>]</w:t>
+            </w:r>
+          </w:p>
+          <w:p>
+            <w:r>
+              <w:t>OR</w:t>
+            </w:r>
+          </w:p>
+          <w:p>
+            <w:r>
+              <w:t xml:space="preserve">Simple short prompt that </w:t>
+            </w:r>
+            <w:r>
+              <w:t>agent</w:t>
+            </w:r>
+            <w:r>
+              <w:t xml:space="preserve"> uses to generate the fields</w:t>
+            </w:r>
+          </w:p>
+          <w:p/>
+          <w:p>
+            <w:r>
+              <w:t>Can contain a plot basis from the user, but is optional</w:t>
             </w:r>
           </w:p>
         </w:tc>
@@ -5277,12 +5357,42 @@
           </w:tcPr>
           <w:p>
             <w:r>
-              <w:rPr>
-                <w:i/>
-                <w:iCs/>
-                <w:color w:val="7A7A7A"/>
-              </w:rPr>
-              <w:t>[TODO: What does it produce?]</w:t>
+              <w:t xml:space="preserve">Creates a </w:t>
+            </w:r>
+            <w:r>
+              <w:rPr>
+                <w:b/>
+                <w:bCs/>
+                <w:u w:val="single"/>
+              </w:rPr>
+              <w:t>Scenario</w:t>
+            </w:r>
+            <w:r>
+              <w:t xml:space="preserve"> object and a new </w:t>
+            </w:r>
+            <w:proofErr w:type="spellStart"/>
+            <w:r>
+              <w:rPr>
+                <w:b/>
+                <w:bCs/>
+                <w:u w:val="single"/>
+              </w:rPr>
+              <w:t>StorySession</w:t>
+            </w:r>
+            <w:proofErr w:type="spellEnd"/>
+            <w:r>
+              <w:t xml:space="preserve"> that contains the </w:t>
+            </w:r>
+            <w:r>
+              <w:rPr>
+                <w:b/>
+                <w:bCs/>
+                <w:u w:val="single"/>
+              </w:rPr>
+              <w:t>Scenario</w:t>
+            </w:r>
+            <w:r>
+              <w:t xml:space="preserve"> once the story starts.</w:t>
             </w:r>
           </w:p>
         </w:tc>
@@ -5390,12 +5500,33 @@
           </w:tcPr>
           <w:p>
             <w:r>
-              <w:rPr>
-                <w:i/>
-                <w:iCs/>
-                <w:color w:val="7A7A7A"/>
-              </w:rPr>
-              <w:t>[TODO: What happens, step by step, when the feature is executed?]</w:t>
+              <w:t xml:space="preserve">If user inputs fields manually: fields are filled -&gt; </w:t>
+            </w:r>
+            <w:r>
+              <w:t xml:space="preserve">inputs are validated -&gt; scenario created -&gt; </w:t>
+            </w:r>
+            <w:r>
+              <w:t>story starts.</w:t>
+            </w:r>
+          </w:p>
+          <w:p>
+            <w:r>
+              <w:t>If agent generates fields</w:t>
+            </w:r>
+            <w:r>
+              <w:t xml:space="preserve"> from</w:t>
+            </w:r>
+            <w:r>
+              <w:t xml:space="preserve"> prompt: prompt is given -&gt; agent returns a draft scenario -&gt; user approves -&gt; </w:t>
+            </w:r>
+            <w:r>
+              <w:t xml:space="preserve">inputs are validated -&gt; scenario created -&gt; story </w:t>
+            </w:r>
+            <w:r>
+              <w:t>start</w:t>
+            </w:r>
+            <w:r>
+              <w:t>s</w:t>
             </w:r>
           </w:p>
         </w:tc>
@@ -5448,13 +5579,66 @@
             </w:tcMar>
           </w:tcPr>
           <w:p>
-            <w:r>
-              <w:rPr>
-                <w:i/>
-                <w:iCs/>
-                <w:color w:val="7A7A7A"/>
-              </w:rPr>
-              <w:t>[TODO: What could go wrong, and how should the system respond?]</w:t>
+            <w:pPr>
+              <w:pStyle w:val="ListParagraph"/>
+              <w:numPr>
+                <w:ilvl w:val="0"/>
+                <w:numId w:val="4"/>
+              </w:numPr>
+            </w:pPr>
+            <w:r>
+              <w:t>Prompt Refused: show a message and let the user rephrase or write the scenario by hand</w:t>
+            </w:r>
+          </w:p>
+          <w:p>
+            <w:pPr>
+              <w:pStyle w:val="ListParagraph"/>
+              <w:numPr>
+                <w:ilvl w:val="0"/>
+                <w:numId w:val="4"/>
+              </w:numPr>
+            </w:pPr>
+            <w:r>
+              <w:t>Failed Model Call: show a message; allow the user to write by hand</w:t>
+            </w:r>
+          </w:p>
+          <w:p>
+            <w:pPr>
+              <w:pStyle w:val="ListParagraph"/>
+              <w:numPr>
+                <w:ilvl w:val="0"/>
+                <w:numId w:val="4"/>
+              </w:numPr>
+            </w:pPr>
+            <w:r>
+              <w:t xml:space="preserve">Invalid </w:t>
+            </w:r>
+            <w:r>
+              <w:t xml:space="preserve">Fields (manual input; </w:t>
+            </w:r>
+            <w:r>
+              <w:t xml:space="preserve">mandatory </w:t>
+            </w:r>
+            <w:r>
+              <w:t>fields are empty):</w:t>
+            </w:r>
+            <w:r>
+              <w:t xml:space="preserve"> </w:t>
+            </w:r>
+            <w:r>
+              <w:t>show a message to the user</w:t>
+            </w:r>
+          </w:p>
+          <w:p>
+            <w:pPr>
+              <w:pStyle w:val="ListParagraph"/>
+              <w:numPr>
+                <w:ilvl w:val="0"/>
+                <w:numId w:val="4"/>
+              </w:numPr>
+            </w:pPr>
+            <w:r>
+              <w:t>Generated Draft Rejected: user can edit the generated draft or redo it with another prompt (can also be the same).</w:t>
             </w:r>
           </w:p>
         </w:tc>
@@ -5467,10 +5651,25 @@
     </w:p>
     <w:p>
       <w:pPr>
+        <w:rPr>
+          <w:b/>
+          <w:bCs/>
+          <w:color w:val="404040"/>
+          <w:sz w:val="23"/>
+          <w:szCs w:val="23"/>
+        </w:rPr>
+      </w:pPr>
+      <w:r>
+        <w:br w:type="page"/>
+      </w:r>
+    </w:p>
+    <w:p>
+      <w:pPr>
         <w:pStyle w:val="Heading3"/>
         <w:keepNext/>
       </w:pPr>
       <w:r>
+        <w:lastRenderedPageBreak/>
         <w:t>F02: Lore Entry Management</w:t>
       </w:r>
     </w:p>
@@ -6883,7 +7082,6 @@
                 <w:b/>
                 <w:bCs/>
               </w:rPr>
-              <w:lastRenderedPageBreak/>
               <w:t>Expected Workflow</w:t>
             </w:r>
           </w:p>
@@ -8233,7 +8431,6 @@
                 <w:b/>
                 <w:bCs/>
               </w:rPr>
-              <w:lastRenderedPageBreak/>
               <w:t>Input</w:t>
             </w:r>
           </w:p>
@@ -8352,6 +8549,7 @@
                 <w:b/>
                 <w:bCs/>
               </w:rPr>
+              <w:lastRenderedPageBreak/>
               <w:t>AI Involvement</w:t>
             </w:r>
           </w:p>
@@ -9618,7 +9816,6 @@
                 <w:b/>
                 <w:bCs/>
               </w:rPr>
-              <w:lastRenderedPageBreak/>
               <w:t>Description</w:t>
             </w:r>
           </w:p>
@@ -9732,6 +9929,7 @@
                 <w:b/>
                 <w:bCs/>
               </w:rPr>
+              <w:lastRenderedPageBreak/>
               <w:t>Input</w:t>
             </w:r>
           </w:p>
@@ -11011,7 +11209,6 @@
         <w:keepNext/>
       </w:pPr>
       <w:r>
-        <w:lastRenderedPageBreak/>
         <w:t>F13: Ending Generation</w:t>
       </w:r>
     </w:p>
@@ -11171,6 +11368,7 @@
                 <w:b/>
                 <w:bCs/>
               </w:rPr>
+              <w:lastRenderedPageBreak/>
               <w:t>User Interaction (GUI)</w:t>
             </w:r>
           </w:p>
@@ -11519,6 +11717,18 @@
     </w:p>
     <w:p>
       <w:pPr>
+        <w:spacing w:line="20" w:lineRule="exact"/>
+        <w:sectPr>
+          <w:footerReference w:type="default" r:id="rId7"/>
+          <w:pgSz w:w="12240" w:h="15840"/>
+          <w:pgMar w:top="1440" w:right="1440" w:bottom="1440" w:left="1440" w:header="708" w:footer="708" w:gutter="0"/>
+          <w:cols w:space="720"/>
+          <w:docGrid w:linePitch="360"/>
+        </w:sectPr>
+      </w:pPr>
+    </w:p>
+    <w:p>
+      <w:pPr>
         <w:pStyle w:val="Heading1"/>
         <w:pageBreakBefore/>
       </w:pPr>
@@ -11531,74 +11741,62 @@
     </w:p>
     <w:p>
       <w:pPr>
-        <w:spacing w:after="120"/>
+        <w:keepNext/>
+        <w:spacing w:before="60"/>
+        <w:jc w:val="center"/>
       </w:pPr>
       <w:r>
         <w:rPr>
-          <w:i/>
-          <w:iCs/>
-          <w:color w:val="7A7A7A"/>
+          <w:noProof/>
         </w:rPr>
-        <w:t>[TODO: Show major classes and interfaces, important attributes and methods, associations, dependencies, inheritance, aggregation/composition and multiplicities. Include both the traditional components and the AI/agent components, and make the five or more design patterns visible.]</w:t>
-      </w:r>
-    </w:p>
-    <w:tbl>
-      <w:tblPr>
-        <w:tblW w:w="9360" w:type="dxa"/>
-        <w:tblBorders>
-          <w:top w:val="single" w:sz="4" w:space="0" w:color="auto"/>
-          <w:left w:val="single" w:sz="4" w:space="0" w:color="auto"/>
-          <w:bottom w:val="single" w:sz="4" w:space="0" w:color="auto"/>
-          <w:right w:val="single" w:sz="4" w:space="0" w:color="auto"/>
-          <w:insideH w:val="single" w:sz="4" w:space="0" w:color="auto"/>
-          <w:insideV w:val="single" w:sz="4" w:space="0" w:color="auto"/>
-        </w:tblBorders>
-        <w:tblCellMar>
-          <w:left w:w="10" w:type="dxa"/>
-          <w:right w:w="10" w:type="dxa"/>
-        </w:tblCellMar>
-        <w:tblLook w:val="0000" w:firstRow="0" w:lastRow="0" w:firstColumn="0" w:lastColumn="0" w:noHBand="0" w:noVBand="0"/>
-      </w:tblPr>
-      <w:tblGrid>
-        <w:gridCol w:w="9360"/>
-      </w:tblGrid>
-      <w:tr>
-        <w:tc>
-          <w:tcPr>
-            <w:tcW w:w="9360" w:type="dxa"/>
-            <w:tcBorders>
-              <w:top w:val="dashed" w:sz="6" w:space="0" w:color="A6A6A6"/>
-              <w:left w:val="dashed" w:sz="6" w:space="0" w:color="A6A6A6"/>
-              <w:bottom w:val="dashed" w:sz="6" w:space="0" w:color="A6A6A6"/>
-              <w:right w:val="dashed" w:sz="6" w:space="0" w:color="A6A6A6"/>
-            </w:tcBorders>
-            <w:tcMar>
-              <w:top w:w="700" w:type="dxa"/>
-              <w:left w:w="200" w:type="dxa"/>
-              <w:bottom w:w="700" w:type="dxa"/>
-              <w:right w:w="200" w:type="dxa"/>
-            </w:tcMar>
-          </w:tcPr>
-          <w:p>
-            <w:pPr>
-              <w:jc w:val="center"/>
-            </w:pPr>
-            <w:r>
-              <w:rPr>
-                <w:i/>
-                <w:iCs/>
-                <w:color w:val="7A7A7A"/>
-              </w:rPr>
-              <w:t>[TODO: insert UML class diagram here]</w:t>
-            </w:r>
-          </w:p>
-        </w:tc>
-      </w:tr>
-    </w:tbl>
-    <w:p>
-      <w:pPr>
-        <w:spacing w:before="120" w:after="200"/>
+        <w:drawing>
+          <wp:inline distT="0" distB="0" distL="0" distR="0" wp14:anchorId="5AC732C3" wp14:editId="26F3570E">
+            <wp:extent cx="7717536" cy="4982760"/>
+            <wp:effectExtent l="0" t="0" r="0" b="0"/>
+            <wp:docPr id="901" name="Class diagram figure 1" descr="Class diagram overview: all classes by name, with every relationship. Attributes and methods are shown in Figures 2 to 9."/>
+            <wp:cNvGraphicFramePr>
+              <a:graphicFrameLocks xmlns:a="http://schemas.openxmlformats.org/drawingml/2006/main" noChangeAspect="1"/>
+            </wp:cNvGraphicFramePr>
+            <a:graphic xmlns:a="http://schemas.openxmlformats.org/drawingml/2006/main">
+              <a:graphicData uri="http://schemas.openxmlformats.org/drawingml/2006/picture">
+                <pic:pic xmlns:pic="http://schemas.openxmlformats.org/drawingml/2006/picture">
+                  <pic:nvPicPr>
+                    <pic:cNvPr id="901" name="image1.png"/>
+                    <pic:cNvPicPr/>
+                  </pic:nvPicPr>
+                  <pic:blipFill>
+                    <a:blip r:embed="rId8"/>
+                    <a:stretch>
+                      <a:fillRect/>
+                    </a:stretch>
+                  </pic:blipFill>
+                  <pic:spPr>
+                    <a:xfrm>
+                      <a:off x="0" y="0"/>
+                      <a:ext cx="7717536" cy="4982760"/>
+                    </a:xfrm>
+                    <a:prstGeom prst="rect">
+                      <a:avLst/>
+                    </a:prstGeom>
+                  </pic:spPr>
+                </pic:pic>
+              </a:graphicData>
+            </a:graphic>
+          </wp:inline>
+        </w:drawing>
+      </w:r>
+    </w:p>
+    <w:p>
+      <w:pPr>
+        <w:spacing w:before="100" w:after="200"/>
         <w:jc w:val="center"/>
+        <w:sectPr>
+          <w:footerReference w:type="default" r:id="rId9"/>
+          <w:pgSz w:w="15840" w:h="12240" w:orient="landscape"/>
+          <w:pgMar w:top="1440" w:right="1440" w:bottom="1440" w:left="1440" w:header="708" w:footer="708" w:gutter="0"/>
+          <w:cols w:space="720"/>
+          <w:docGrid w:linePitch="360"/>
+        </w:sectPr>
       </w:pPr>
       <w:r>
         <w:rPr>
@@ -11607,7 +11805,557 @@
           <w:sz w:val="20"/>
           <w:szCs w:val="20"/>
         </w:rPr>
-        <w:t>Figure 1. Class diagram</w:t>
+        <w:t>Figure 1. Class diagram overview: all classes by name</w:t>
+      </w:r>
+      <w:r>
+        <w:rPr>
+          <w:i/>
+          <w:iCs/>
+          <w:sz w:val="20"/>
+          <w:szCs w:val="20"/>
+        </w:rPr>
+        <w:t xml:space="preserve"> with relationship arrows</w:t>
+      </w:r>
+      <w:r>
+        <w:rPr>
+          <w:i/>
+          <w:iCs/>
+          <w:sz w:val="20"/>
+          <w:szCs w:val="20"/>
+        </w:rPr>
+        <w:t>. Attributes and methods shown in Figures 2 to 9.</w:t>
+      </w:r>
+    </w:p>
+    <w:p>
+      <w:pPr>
+        <w:keepNext/>
+        <w:spacing w:before="60"/>
+        <w:jc w:val="center"/>
+      </w:pPr>
+      <w:r>
+        <w:rPr>
+          <w:noProof/>
+        </w:rPr>
+        <w:lastRenderedPageBreak/>
+        <w:drawing>
+          <wp:inline distT="0" distB="0" distL="0" distR="0" wp14:anchorId="605F835C" wp14:editId="4B3F4101">
+            <wp:extent cx="5943600" cy="3055749"/>
+            <wp:effectExtent l="0" t="0" r="0" b="0"/>
+            <wp:docPr id="902" name="Class diagram figure 2" descr="Package ui: the two front ends and the observer interface they implement."/>
+            <wp:cNvGraphicFramePr>
+              <a:graphicFrameLocks xmlns:a="http://schemas.openxmlformats.org/drawingml/2006/main" noChangeAspect="1"/>
+            </wp:cNvGraphicFramePr>
+            <a:graphic xmlns:a="http://schemas.openxmlformats.org/drawingml/2006/main">
+              <a:graphicData uri="http://schemas.openxmlformats.org/drawingml/2006/picture">
+                <pic:pic xmlns:pic="http://schemas.openxmlformats.org/drawingml/2006/picture">
+                  <pic:nvPicPr>
+                    <pic:cNvPr id="902" name="image2.png"/>
+                    <pic:cNvPicPr/>
+                  </pic:nvPicPr>
+                  <pic:blipFill>
+                    <a:blip r:embed="rId10"/>
+                    <a:stretch>
+                      <a:fillRect/>
+                    </a:stretch>
+                  </pic:blipFill>
+                  <pic:spPr>
+                    <a:xfrm>
+                      <a:off x="0" y="0"/>
+                      <a:ext cx="5943600" cy="3055749"/>
+                    </a:xfrm>
+                    <a:prstGeom prst="rect">
+                      <a:avLst/>
+                    </a:prstGeom>
+                  </pic:spPr>
+                </pic:pic>
+              </a:graphicData>
+            </a:graphic>
+          </wp:inline>
+        </w:drawing>
+      </w:r>
+    </w:p>
+    <w:p>
+      <w:pPr>
+        <w:spacing w:before="100" w:after="200"/>
+        <w:jc w:val="center"/>
+      </w:pPr>
+      <w:r>
+        <w:rPr>
+          <w:i/>
+          <w:iCs/>
+          <w:sz w:val="20"/>
+          <w:szCs w:val="20"/>
+        </w:rPr>
+        <w:t>Figure 2. Package ui: the two front ends and the observer interface they implement.</w:t>
+      </w:r>
+    </w:p>
+    <w:p>
+      <w:pPr>
+        <w:keepNext/>
+        <w:spacing w:before="60"/>
+        <w:jc w:val="center"/>
+      </w:pPr>
+      <w:r>
+        <w:rPr>
+          <w:noProof/>
+        </w:rPr>
+        <w:lastRenderedPageBreak/>
+        <w:drawing>
+          <wp:inline distT="0" distB="0" distL="0" distR="0" wp14:anchorId="54ADA25F" wp14:editId="243AFCA4">
+            <wp:extent cx="3840480" cy="7319300"/>
+            <wp:effectExtent l="0" t="0" r="0" b="0"/>
+            <wp:docPr id="903" name="Class diagram figure 3" descr="Package controller: the single entry point and the undoable commands."/>
+            <wp:cNvGraphicFramePr>
+              <a:graphicFrameLocks xmlns:a="http://schemas.openxmlformats.org/drawingml/2006/main" noChangeAspect="1"/>
+            </wp:cNvGraphicFramePr>
+            <a:graphic xmlns:a="http://schemas.openxmlformats.org/drawingml/2006/main">
+              <a:graphicData uri="http://schemas.openxmlformats.org/drawingml/2006/picture">
+                <pic:pic xmlns:pic="http://schemas.openxmlformats.org/drawingml/2006/picture">
+                  <pic:nvPicPr>
+                    <pic:cNvPr id="903" name="image3.png"/>
+                    <pic:cNvPicPr/>
+                  </pic:nvPicPr>
+                  <pic:blipFill>
+                    <a:blip r:embed="rId11"/>
+                    <a:stretch>
+                      <a:fillRect/>
+                    </a:stretch>
+                  </pic:blipFill>
+                  <pic:spPr>
+                    <a:xfrm>
+                      <a:off x="0" y="0"/>
+                      <a:ext cx="3840480" cy="7319300"/>
+                    </a:xfrm>
+                    <a:prstGeom prst="rect">
+                      <a:avLst/>
+                    </a:prstGeom>
+                  </pic:spPr>
+                </pic:pic>
+              </a:graphicData>
+            </a:graphic>
+          </wp:inline>
+        </w:drawing>
+      </w:r>
+    </w:p>
+    <w:p>
+      <w:pPr>
+        <w:spacing w:before="100" w:after="200"/>
+        <w:jc w:val="center"/>
+        <w:sectPr>
+          <w:footerReference w:type="default" r:id="rId12"/>
+          <w:pgSz w:w="12240" w:h="15840"/>
+          <w:pgMar w:top="1440" w:right="1440" w:bottom="1440" w:left="1440" w:header="708" w:footer="708" w:gutter="0"/>
+          <w:cols w:space="720"/>
+          <w:docGrid w:linePitch="360"/>
+        </w:sectPr>
+      </w:pPr>
+      <w:r>
+        <w:rPr>
+          <w:i/>
+          <w:iCs/>
+          <w:sz w:val="20"/>
+          <w:szCs w:val="20"/>
+        </w:rPr>
+        <w:t>Figure 3. Package controller: the single entry point and the undoable commands.</w:t>
+      </w:r>
+    </w:p>
+    <w:p>
+      <w:pPr>
+        <w:keepNext/>
+        <w:spacing w:before="60"/>
+        <w:jc w:val="center"/>
+      </w:pPr>
+      <w:r>
+        <w:rPr>
+          <w:noProof/>
+        </w:rPr>
+        <w:lastRenderedPageBreak/>
+        <w:drawing>
+          <wp:inline distT="0" distB="0" distL="0" distR="0" wp14:anchorId="05FAE929" wp14:editId="05CF8B9C">
+            <wp:extent cx="7589520" cy="5151120"/>
+            <wp:effectExtent l="0" t="0" r="0" b="0"/>
+            <wp:docPr id="904" name="Class diagram figure 4" descr="Package model, part 1: the session, its turns, and lore."/>
+            <wp:cNvGraphicFramePr>
+              <a:graphicFrameLocks xmlns:a="http://schemas.openxmlformats.org/drawingml/2006/main" noChangeAspect="1"/>
+            </wp:cNvGraphicFramePr>
+            <a:graphic xmlns:a="http://schemas.openxmlformats.org/drawingml/2006/main">
+              <a:graphicData uri="http://schemas.openxmlformats.org/drawingml/2006/picture">
+                <pic:pic xmlns:pic="http://schemas.openxmlformats.org/drawingml/2006/picture">
+                  <pic:nvPicPr>
+                    <pic:cNvPr id="904" name="image4.png"/>
+                    <pic:cNvPicPr/>
+                  </pic:nvPicPr>
+                  <pic:blipFill>
+                    <a:blip r:embed="rId13"/>
+                    <a:stretch>
+                      <a:fillRect/>
+                    </a:stretch>
+                  </pic:blipFill>
+                  <pic:spPr>
+                    <a:xfrm>
+                      <a:off x="0" y="0"/>
+                      <a:ext cx="7589520" cy="5151120"/>
+                    </a:xfrm>
+                    <a:prstGeom prst="rect">
+                      <a:avLst/>
+                    </a:prstGeom>
+                  </pic:spPr>
+                </pic:pic>
+              </a:graphicData>
+            </a:graphic>
+          </wp:inline>
+        </w:drawing>
+      </w:r>
+    </w:p>
+    <w:p>
+      <w:pPr>
+        <w:spacing w:before="100" w:after="200"/>
+        <w:jc w:val="center"/>
+        <w:sectPr>
+          <w:footerReference w:type="default" r:id="rId14"/>
+          <w:pgSz w:w="15840" w:h="12240" w:orient="landscape"/>
+          <w:pgMar w:top="1440" w:right="1440" w:bottom="1440" w:left="1440" w:header="708" w:footer="708" w:gutter="0"/>
+          <w:cols w:space="720"/>
+          <w:docGrid w:linePitch="360"/>
+        </w:sectPr>
+      </w:pPr>
+      <w:r>
+        <w:rPr>
+          <w:i/>
+          <w:iCs/>
+          <w:sz w:val="20"/>
+          <w:szCs w:val="20"/>
+        </w:rPr>
+        <w:t>Figure 4. Package model, part 1: the session, its turns, and lore.</w:t>
+      </w:r>
+    </w:p>
+    <w:p>
+      <w:pPr>
+        <w:keepNext/>
+        <w:spacing w:before="60"/>
+        <w:jc w:val="center"/>
+      </w:pPr>
+      <w:r>
+        <w:rPr>
+          <w:noProof/>
+        </w:rPr>
+        <w:lastRenderedPageBreak/>
+        <w:drawing>
+          <wp:inline distT="0" distB="0" distL="0" distR="0" wp14:anchorId="062B9E9E" wp14:editId="5270B6B0">
+            <wp:extent cx="5760720" cy="5192761"/>
+            <wp:effectExtent l="0" t="0" r="0" b="0"/>
+            <wp:docPr id="905" name="Class diagram figure 5" descr="Package model, part 2: characters and the hidden pivotal events. StorySession is detailed in Figure 4."/>
+            <wp:cNvGraphicFramePr>
+              <a:graphicFrameLocks xmlns:a="http://schemas.openxmlformats.org/drawingml/2006/main" noChangeAspect="1"/>
+            </wp:cNvGraphicFramePr>
+            <a:graphic xmlns:a="http://schemas.openxmlformats.org/drawingml/2006/main">
+              <a:graphicData uri="http://schemas.openxmlformats.org/drawingml/2006/picture">
+                <pic:pic xmlns:pic="http://schemas.openxmlformats.org/drawingml/2006/picture">
+                  <pic:nvPicPr>
+                    <pic:cNvPr id="905" name="image5.png"/>
+                    <pic:cNvPicPr/>
+                  </pic:nvPicPr>
+                  <pic:blipFill>
+                    <a:blip r:embed="rId15"/>
+                    <a:stretch>
+                      <a:fillRect/>
+                    </a:stretch>
+                  </pic:blipFill>
+                  <pic:spPr>
+                    <a:xfrm>
+                      <a:off x="0" y="0"/>
+                      <a:ext cx="5760720" cy="5192761"/>
+                    </a:xfrm>
+                    <a:prstGeom prst="rect">
+                      <a:avLst/>
+                    </a:prstGeom>
+                  </pic:spPr>
+                </pic:pic>
+              </a:graphicData>
+            </a:graphic>
+          </wp:inline>
+        </w:drawing>
+      </w:r>
+    </w:p>
+    <w:p>
+      <w:pPr>
+        <w:spacing w:before="100" w:after="200"/>
+        <w:jc w:val="center"/>
+        <w:sectPr>
+          <w:footerReference w:type="default" r:id="rId16"/>
+          <w:pgSz w:w="12240" w:h="15840"/>
+          <w:pgMar w:top="1440" w:right="1440" w:bottom="1440" w:left="1440" w:header="708" w:footer="708" w:gutter="0"/>
+          <w:cols w:space="720"/>
+          <w:docGrid w:linePitch="360"/>
+        </w:sectPr>
+      </w:pPr>
+      <w:r>
+        <w:rPr>
+          <w:i/>
+          <w:iCs/>
+          <w:sz w:val="20"/>
+          <w:szCs w:val="20"/>
+        </w:rPr>
+        <w:t>Figure 5. Package model, part 2: characters and the hidden pivotal events. StorySession is detailed in Figure 4.</w:t>
+      </w:r>
+    </w:p>
+    <w:p>
+      <w:pPr>
+        <w:keepNext/>
+        <w:spacing w:before="60"/>
+        <w:jc w:val="center"/>
+      </w:pPr>
+      <w:r>
+        <w:rPr>
+          <w:noProof/>
+        </w:rPr>
+        <w:lastRenderedPageBreak/>
+        <w:drawing>
+          <wp:inline distT="0" distB="0" distL="0" distR="0" wp14:anchorId="491D6CFB" wp14:editId="08EABA5F">
+            <wp:extent cx="8229600" cy="4281334"/>
+            <wp:effectExtent l="0" t="0" r="0" b="0"/>
+            <wp:docPr id="906" name="Class diagram figure 6" descr="Package agent: the facade, its subsystem classes, and the input-mode strategies."/>
+            <wp:cNvGraphicFramePr>
+              <a:graphicFrameLocks xmlns:a="http://schemas.openxmlformats.org/drawingml/2006/main" noChangeAspect="1"/>
+            </wp:cNvGraphicFramePr>
+            <a:graphic xmlns:a="http://schemas.openxmlformats.org/drawingml/2006/main">
+              <a:graphicData uri="http://schemas.openxmlformats.org/drawingml/2006/picture">
+                <pic:pic xmlns:pic="http://schemas.openxmlformats.org/drawingml/2006/picture">
+                  <pic:nvPicPr>
+                    <pic:cNvPr id="906" name="image6.png"/>
+                    <pic:cNvPicPr/>
+                  </pic:nvPicPr>
+                  <pic:blipFill>
+                    <a:blip r:embed="rId17"/>
+                    <a:stretch>
+                      <a:fillRect/>
+                    </a:stretch>
+                  </pic:blipFill>
+                  <pic:spPr>
+                    <a:xfrm>
+                      <a:off x="0" y="0"/>
+                      <a:ext cx="8229600" cy="4281334"/>
+                    </a:xfrm>
+                    <a:prstGeom prst="rect">
+                      <a:avLst/>
+                    </a:prstGeom>
+                  </pic:spPr>
+                </pic:pic>
+              </a:graphicData>
+            </a:graphic>
+          </wp:inline>
+        </w:drawing>
+      </w:r>
+    </w:p>
+    <w:p>
+      <w:pPr>
+        <w:spacing w:before="100" w:after="200"/>
+        <w:jc w:val="center"/>
+      </w:pPr>
+      <w:r>
+        <w:rPr>
+          <w:i/>
+          <w:iCs/>
+          <w:sz w:val="20"/>
+          <w:szCs w:val="20"/>
+        </w:rPr>
+        <w:t>Figure 6. Package agent: the facade, its subsystem classes, and the input-mode strategies.</w:t>
+      </w:r>
+    </w:p>
+    <w:p>
+      <w:pPr>
+        <w:keepNext/>
+        <w:spacing w:before="60"/>
+        <w:jc w:val="center"/>
+      </w:pPr>
+      <w:r>
+        <w:rPr>
+          <w:noProof/>
+        </w:rPr>
+        <w:lastRenderedPageBreak/>
+        <w:drawing>
+          <wp:inline distT="0" distB="0" distL="0" distR="0" wp14:anchorId="2FFC722E" wp14:editId="02B513E0">
+            <wp:extent cx="8229600" cy="3514298"/>
+            <wp:effectExtent l="0" t="0" r="0" b="0"/>
+            <wp:docPr id="907" name="Class diagram figure 7" descr="Package agent.tools: the operations the model may request."/>
+            <wp:cNvGraphicFramePr>
+              <a:graphicFrameLocks xmlns:a="http://schemas.openxmlformats.org/drawingml/2006/main" noChangeAspect="1"/>
+            </wp:cNvGraphicFramePr>
+            <a:graphic xmlns:a="http://schemas.openxmlformats.org/drawingml/2006/main">
+              <a:graphicData uri="http://schemas.openxmlformats.org/drawingml/2006/picture">
+                <pic:pic xmlns:pic="http://schemas.openxmlformats.org/drawingml/2006/picture">
+                  <pic:nvPicPr>
+                    <pic:cNvPr id="907" name="image7.png"/>
+                    <pic:cNvPicPr/>
+                  </pic:nvPicPr>
+                  <pic:blipFill>
+                    <a:blip r:embed="rId18"/>
+                    <a:stretch>
+                      <a:fillRect/>
+                    </a:stretch>
+                  </pic:blipFill>
+                  <pic:spPr>
+                    <a:xfrm>
+                      <a:off x="0" y="0"/>
+                      <a:ext cx="8229600" cy="3514298"/>
+                    </a:xfrm>
+                    <a:prstGeom prst="rect">
+                      <a:avLst/>
+                    </a:prstGeom>
+                  </pic:spPr>
+                </pic:pic>
+              </a:graphicData>
+            </a:graphic>
+          </wp:inline>
+        </w:drawing>
+      </w:r>
+    </w:p>
+    <w:p>
+      <w:pPr>
+        <w:spacing w:before="100" w:after="200"/>
+        <w:jc w:val="center"/>
+      </w:pPr>
+      <w:r>
+        <w:rPr>
+          <w:i/>
+          <w:iCs/>
+          <w:sz w:val="20"/>
+          <w:szCs w:val="20"/>
+        </w:rPr>
+        <w:t>Figure 7. Package agent.tools: the operations the model may request.</w:t>
+      </w:r>
+    </w:p>
+    <w:p>
+      <w:pPr>
+        <w:keepNext/>
+        <w:spacing w:before="60"/>
+        <w:jc w:val="center"/>
+      </w:pPr>
+      <w:r>
+        <w:rPr>
+          <w:noProof/>
+        </w:rPr>
+        <w:lastRenderedPageBreak/>
+        <w:drawing>
+          <wp:inline distT="0" distB="0" distL="0" distR="0" wp14:anchorId="77C81E96" wp14:editId="534A52C2">
+            <wp:extent cx="8229600" cy="4388598"/>
+            <wp:effectExtent l="0" t="0" r="0" b="0"/>
+            <wp:docPr id="908" name="Class diagram figure 8" descr="Package llm: the client interface, the adapter for Claude, and the test double."/>
+            <wp:cNvGraphicFramePr>
+              <a:graphicFrameLocks xmlns:a="http://schemas.openxmlformats.org/drawingml/2006/main" noChangeAspect="1"/>
+            </wp:cNvGraphicFramePr>
+            <a:graphic xmlns:a="http://schemas.openxmlformats.org/drawingml/2006/main">
+              <a:graphicData uri="http://schemas.openxmlformats.org/drawingml/2006/picture">
+                <pic:pic xmlns:pic="http://schemas.openxmlformats.org/drawingml/2006/picture">
+                  <pic:nvPicPr>
+                    <pic:cNvPr id="908" name="image8.png"/>
+                    <pic:cNvPicPr/>
+                  </pic:nvPicPr>
+                  <pic:blipFill>
+                    <a:blip r:embed="rId19"/>
+                    <a:stretch>
+                      <a:fillRect/>
+                    </a:stretch>
+                  </pic:blipFill>
+                  <pic:spPr>
+                    <a:xfrm>
+                      <a:off x="0" y="0"/>
+                      <a:ext cx="8229600" cy="4388598"/>
+                    </a:xfrm>
+                    <a:prstGeom prst="rect">
+                      <a:avLst/>
+                    </a:prstGeom>
+                  </pic:spPr>
+                </pic:pic>
+              </a:graphicData>
+            </a:graphic>
+          </wp:inline>
+        </w:drawing>
+      </w:r>
+    </w:p>
+    <w:p>
+      <w:pPr>
+        <w:spacing w:before="100" w:after="200"/>
+        <w:jc w:val="center"/>
+        <w:sectPr>
+          <w:footerReference w:type="default" r:id="rId20"/>
+          <w:pgSz w:w="15840" w:h="12240" w:orient="landscape"/>
+          <w:pgMar w:top="1440" w:right="1440" w:bottom="1440" w:left="1440" w:header="708" w:footer="708" w:gutter="0"/>
+          <w:cols w:space="720"/>
+          <w:docGrid w:linePitch="360"/>
+        </w:sectPr>
+      </w:pPr>
+      <w:r>
+        <w:rPr>
+          <w:i/>
+          <w:iCs/>
+          <w:sz w:val="20"/>
+          <w:szCs w:val="20"/>
+        </w:rPr>
+        <w:t>Figure 8. Package llm: the client interface, the adapter for Claude, and the test double.</w:t>
+      </w:r>
+    </w:p>
+    <w:p>
+      <w:pPr>
+        <w:keepNext/>
+        <w:spacing w:before="60"/>
+        <w:jc w:val="center"/>
+      </w:pPr>
+      <w:r>
+        <w:rPr>
+          <w:noProof/>
+        </w:rPr>
+        <w:lastRenderedPageBreak/>
+        <w:drawing>
+          <wp:inline distT="0" distB="0" distL="0" distR="0" wp14:anchorId="6555CD64" wp14:editId="27B56B44">
+            <wp:extent cx="5669280" cy="1769271"/>
+            <wp:effectExtent l="0" t="0" r="0" b="0"/>
+            <wp:docPr id="909" name="Class diagram figure 9" descr="Package persistence: saving and loading sessions."/>
+            <wp:cNvGraphicFramePr>
+              <a:graphicFrameLocks xmlns:a="http://schemas.openxmlformats.org/drawingml/2006/main" noChangeAspect="1"/>
+            </wp:cNvGraphicFramePr>
+            <a:graphic xmlns:a="http://schemas.openxmlformats.org/drawingml/2006/main">
+              <a:graphicData uri="http://schemas.openxmlformats.org/drawingml/2006/picture">
+                <pic:pic xmlns:pic="http://schemas.openxmlformats.org/drawingml/2006/picture">
+                  <pic:nvPicPr>
+                    <pic:cNvPr id="909" name="image9.png"/>
+                    <pic:cNvPicPr/>
+                  </pic:nvPicPr>
+                  <pic:blipFill>
+                    <a:blip r:embed="rId21"/>
+                    <a:stretch>
+                      <a:fillRect/>
+                    </a:stretch>
+                  </pic:blipFill>
+                  <pic:spPr>
+                    <a:xfrm>
+                      <a:off x="0" y="0"/>
+                      <a:ext cx="5669280" cy="1769271"/>
+                    </a:xfrm>
+                    <a:prstGeom prst="rect">
+                      <a:avLst/>
+                    </a:prstGeom>
+                  </pic:spPr>
+                </pic:pic>
+              </a:graphicData>
+            </a:graphic>
+          </wp:inline>
+        </w:drawing>
+      </w:r>
+    </w:p>
+    <w:p>
+      <w:pPr>
+        <w:spacing w:before="100" w:after="200"/>
+        <w:jc w:val="center"/>
+      </w:pPr>
+      <w:r>
+        <w:rPr>
+          <w:i/>
+          <w:iCs/>
+          <w:sz w:val="20"/>
+          <w:szCs w:val="20"/>
+        </w:rPr>
+        <w:t>Figure 9. Package persistence: saving and loading sessions.</w:t>
       </w:r>
     </w:p>
     <w:p>
@@ -14325,7 +15073,7 @@
           <w:sz w:val="20"/>
           <w:szCs w:val="20"/>
         </w:rPr>
-        <w:t>Figure 2. Use-case diagram</w:t>
+        <w:t>Figure 10. Use-case diagram</w:t>
       </w:r>
     </w:p>
     <w:p>
@@ -16753,7 +17501,7 @@
           <w:sz w:val="20"/>
           <w:szCs w:val="20"/>
         </w:rPr>
-        <w:t>Figure 3. SD01</w:t>
+        <w:t>Figure 11. SD01</w:t>
       </w:r>
     </w:p>
     <w:p>
@@ -16892,7 +17640,7 @@
           <w:sz w:val="20"/>
           <w:szCs w:val="20"/>
         </w:rPr>
-        <w:t>Figure 4. SD02</w:t>
+        <w:t>Figure 12. SD02</w:t>
       </w:r>
     </w:p>
     <w:p>
@@ -17032,13 +17780,13 @@
           <w:sz w:val="20"/>
           <w:szCs w:val="20"/>
         </w:rPr>
-        <w:t>Figure 5. SD03</w:t>
+        <w:t>Figure 13. SD03</w:t>
       </w:r>
     </w:p>
     <w:p>
       <w:pPr>
         <w:sectPr>
-          <w:footerReference w:type="default" r:id="rId7"/>
+          <w:footerReference w:type="default" r:id="rId22"/>
           <w:pgSz w:w="12240" w:h="15840"/>
           <w:pgMar w:top="1440" w:right="1440" w:bottom="1440" w:left="1440" w:header="708" w:footer="708" w:gutter="0"/>
           <w:cols w:space="720"/>
@@ -20169,7 +20917,7 @@
     <w:p>
       <w:pPr>
         <w:sectPr>
-          <w:footerReference w:type="default" r:id="rId8"/>
+          <w:footerReference w:type="default" r:id="rId23"/>
           <w:pgSz w:w="15840" w:h="12240" w:orient="landscape"/>
           <w:pgMar w:top="1440" w:right="1440" w:bottom="1440" w:left="1440" w:header="708" w:footer="708" w:gutter="0"/>
           <w:cols w:space="720"/>
@@ -22503,183 +23251,11 @@
     </w:p>
     <w:p>
       <w:pPr>
-        <w:pStyle w:val="Heading2"/>
-        <w:keepNext/>
-      </w:pPr>
-      <w:bookmarkStart w:id="42" w:name="_Toc242440016"/>
-      <w:r>
-        <w:t>F14: Export Story (tentative)</w:t>
-      </w:r>
-      <w:bookmarkEnd w:id="42"/>
-    </w:p>
-    <w:p>
-      <w:pPr>
-        <w:keepNext/>
         <w:spacing w:after="120"/>
       </w:pPr>
-      <w:r>
-        <w:rPr>
-          <w:b/>
-          <w:bCs/>
-        </w:rPr>
-        <w:t xml:space="preserve">Related Use Case: </w:t>
-      </w:r>
-      <w:r>
-        <w:rPr>
-          <w:i/>
-          <w:iCs/>
-          <w:color w:val="7A7A7A"/>
-        </w:rPr>
-        <w:t>[TODO: UC## and name]</w:t>
-      </w:r>
-    </w:p>
-    <w:p>
-      <w:pPr>
-        <w:keepNext/>
-        <w:spacing w:after="120"/>
-      </w:pPr>
-      <w:r>
-        <w:rPr>
-          <w:b/>
-          <w:bCs/>
-        </w:rPr>
-        <w:t xml:space="preserve">Related Sequence Diagram: </w:t>
-      </w:r>
-      <w:r>
-        <w:rPr>
-          <w:i/>
-          <w:iCs/>
-          <w:color w:val="7A7A7A"/>
-        </w:rPr>
-        <w:t>[TODO: SD## and name]</w:t>
-      </w:r>
-    </w:p>
-    <w:p>
-      <w:pPr>
-        <w:keepNext/>
-        <w:spacing w:before="120" w:after="60"/>
-      </w:pPr>
-      <w:r>
-        <w:rPr>
-          <w:b/>
-          <w:bCs/>
-        </w:rPr>
-        <w:t>Classes involved</w:t>
-      </w:r>
-    </w:p>
-    <w:p>
-      <w:pPr>
-        <w:pStyle w:val="ListParagraph"/>
-        <w:numPr>
-          <w:ilvl w:val="0"/>
-          <w:numId w:val="2"/>
-        </w:numPr>
-        <w:spacing w:after="60"/>
-      </w:pPr>
-      <w:r>
-        <w:rPr>
-          <w:i/>
-          <w:iCs/>
-          <w:color w:val="7A7A7A"/>
-        </w:rPr>
-        <w:t>[TODO: ClassName: its role in this feature]</w:t>
-      </w:r>
-    </w:p>
-    <w:p>
-      <w:pPr>
-        <w:pStyle w:val="ListParagraph"/>
-        <w:numPr>
-          <w:ilvl w:val="0"/>
-          <w:numId w:val="2"/>
-        </w:numPr>
-        <w:spacing w:after="60"/>
-      </w:pPr>
-      <w:r>
-        <w:rPr>
-          <w:i/>
-          <w:iCs/>
-          <w:color w:val="7A7A7A"/>
-        </w:rPr>
-        <w:t>[TODO: ClassName: its role in this feature]</w:t>
-      </w:r>
-    </w:p>
-    <w:p>
-      <w:pPr>
-        <w:keepNext/>
-        <w:spacing w:before="120" w:after="60"/>
-      </w:pPr>
-      <w:r>
-        <w:rPr>
-          <w:b/>
-          <w:bCs/>
-        </w:rPr>
-        <w:t>Important methods</w:t>
-      </w:r>
-    </w:p>
-    <w:p>
-      <w:pPr>
-        <w:pStyle w:val="ListParagraph"/>
-        <w:numPr>
-          <w:ilvl w:val="0"/>
-          <w:numId w:val="2"/>
-        </w:numPr>
-        <w:spacing w:after="60"/>
-      </w:pPr>
-      <w:r>
-        <w:rPr>
-          <w:i/>
-          <w:iCs/>
-          <w:color w:val="7A7A7A"/>
-        </w:rPr>
-        <w:t>[TODO: ClassName.method()]</w:t>
-      </w:r>
-    </w:p>
-    <w:p>
-      <w:pPr>
-        <w:pStyle w:val="ListParagraph"/>
-        <w:numPr>
-          <w:ilvl w:val="0"/>
-          <w:numId w:val="2"/>
-        </w:numPr>
-        <w:spacing w:after="60"/>
-      </w:pPr>
-      <w:r>
-        <w:rPr>
-          <w:i/>
-          <w:iCs/>
-          <w:color w:val="7A7A7A"/>
-        </w:rPr>
-        <w:t>[TODO: ClassName.method()]</w:t>
-      </w:r>
-    </w:p>
-    <w:p>
-      <w:pPr>
-        <w:keepNext/>
-        <w:spacing w:before="120" w:after="60"/>
-      </w:pPr>
-      <w:r>
-        <w:rPr>
-          <w:b/>
-          <w:bCs/>
-        </w:rPr>
-        <w:t>Execution</w:t>
-      </w:r>
-    </w:p>
-    <w:p>
-      <w:pPr>
-        <w:spacing w:after="120"/>
-      </w:pPr>
-      <w:r>
-        <w:rPr>
-          <w:i/>
-          <w:iCs/>
-          <w:color w:val="7A7A7A"/>
-        </w:rPr>
-        <w:t>[TODO: Short paragraph walking through what happens from the user action to the returned result.]</w:t>
-      </w:r>
     </w:p>
     <w:sectPr>
-      <w:footerReference w:type="default" r:id="rId9"/>
+      <w:footerReference w:type="default" r:id="rId24"/>
       <w:pgSz w:w="12240" w:h="15840"/>
       <w:pgMar w:top="1440" w:right="1440" w:bottom="1440" w:left="1440" w:header="708" w:footer="708" w:gutter="0"/>
       <w:cols w:space="720"/>
@@ -22871,6 +23447,360 @@
         <w:sz w:val="18"/>
         <w:szCs w:val="18"/>
       </w:rPr>
+      <w:t>1</w:t>
+    </w:r>
+    <w:r>
+      <w:rPr>
+        <w:color w:val="7A7A7A"/>
+        <w:sz w:val="18"/>
+        <w:szCs w:val="18"/>
+      </w:rPr>
+      <w:fldChar w:fldCharType="end"/>
+    </w:r>
+  </w:p>
+</w:ftr>
+</file>
+
+<file path=word/footer4.xml><?xml version="1.0" encoding="utf-8"?>
+<w:ftr xmlns:wpc="http://schemas.microsoft.com/office/word/2010/wordprocessingCanvas" xmlns:cx="http://schemas.microsoft.com/office/drawing/2014/chartex" xmlns:cx1="http://schemas.microsoft.com/office/drawing/2015/9/8/chartex" xmlns:cx2="http://schemas.microsoft.com/office/drawing/2015/10/21/chartex" xmlns:cx3="http://schemas.microsoft.com/office/drawing/2016/5/9/chartex" xmlns:cx4="http://schemas.microsoft.com/office/drawing/2016/5/10/chartex" xmlns:cx5="http://schemas.microsoft.com/office/drawing/2016/5/11/chartex" xmlns:cx6="http://schemas.microsoft.com/office/drawing/2016/5/12/chartex" xmlns:cx7="http://schemas.microsoft.com/office/drawing/2016/5/13/chartex" xmlns:cx8="http://schemas.microsoft.com/office/drawing/2016/5/14/chartex" xmlns:mc="http://schemas.openxmlformats.org/markup-compatibility/2006" xmlns:aink="http://schemas.microsoft.com/office/drawing/2016/ink" xmlns:am3d="http://schemas.microsoft.com/office/drawing/2017/model3d" xmlns:o="urn:schemas-microsoft-com:office:office" xmlns:oel="http://schemas.microsoft.com/office/2019/extlst" xmlns:r="http://schemas.openxmlformats.org/officeDocument/2006/relationships" xmlns:m="http://schemas.openxmlformats.org/officeDocument/2006/math" xmlns:v="urn:schemas-microsoft-com:vml" xmlns:wp14="http://schemas.microsoft.com/office/word/2010/wordprocessingDrawing" xmlns:wp="http://schemas.openxmlformats.org/drawingml/2006/wordprocessingDrawing" xmlns:w10="urn:schemas-microsoft-com:office:word" xmlns:w="http://schemas.openxmlformats.org/wordprocessingml/2006/main" xmlns:w14="http://schemas.microsoft.com/office/word/2010/wordml" xmlns:w15="http://schemas.microsoft.com/office/word/2012/wordml" xmlns:w16cex="http://schemas.microsoft.com/office/word/2018/wordml/cex" xmlns:w16cid="http://schemas.microsoft.com/office/word/2016/wordml/cid" xmlns:w16="http://schemas.microsoft.com/office/word/2018/wordml" xmlns:w16du="http://schemas.microsoft.com/office/word/2023/wordml/word16du" xmlns:w16sdtdh="http://schemas.microsoft.com/office/word/2020/wordml/sdtdatahash" xmlns:w16se="http://schemas.microsoft.com/office/word/2015/wordml/symex" xmlns:wpg="http://schemas.microsoft.com/office/word/2010/wordprocessingGroup" xmlns:wpi="http://schemas.microsoft.com/office/word/2010/wordprocessingInk" xmlns:wne="http://schemas.microsoft.com/office/word/2006/wordml" xmlns:wps="http://schemas.microsoft.com/office/word/2010/wordprocessingShape" mc:Ignorable="w14 w15 w16se w16cid w16 w16cex w16sdtdh w16du wp14">
+  <w:p>
+    <w:pPr>
+      <w:jc w:val="center"/>
+    </w:pPr>
+    <w:r>
+      <w:rPr>
+        <w:color w:val="7A7A7A"/>
+        <w:sz w:val="18"/>
+        <w:szCs w:val="18"/>
+      </w:rPr>
+      <w:t xml:space="preserve">Page </w:t>
+    </w:r>
+    <w:r>
+      <w:rPr>
+        <w:color w:val="7A7A7A"/>
+        <w:sz w:val="18"/>
+        <w:szCs w:val="18"/>
+      </w:rPr>
+      <w:fldChar w:fldCharType="begin"/>
+    </w:r>
+    <w:r>
+      <w:rPr>
+        <w:color w:val="7A7A7A"/>
+        <w:sz w:val="18"/>
+        <w:szCs w:val="18"/>
+      </w:rPr>
+      <w:instrText>PAGE</w:instrText>
+    </w:r>
+    <w:r>
+      <w:rPr>
+        <w:color w:val="7A7A7A"/>
+        <w:sz w:val="18"/>
+        <w:szCs w:val="18"/>
+      </w:rPr>
+      <w:fldChar w:fldCharType="separate"/>
+    </w:r>
+    <w:r>
+      <w:rPr>
+        <w:noProof/>
+        <w:color w:val="7A7A7A"/>
+        <w:sz w:val="18"/>
+        <w:szCs w:val="18"/>
+      </w:rPr>
+      <w:t>19</w:t>
+    </w:r>
+    <w:r>
+      <w:rPr>
+        <w:color w:val="7A7A7A"/>
+        <w:sz w:val="18"/>
+        <w:szCs w:val="18"/>
+      </w:rPr>
+      <w:fldChar w:fldCharType="end"/>
+    </w:r>
+  </w:p>
+</w:ftr>
+</file>
+
+<file path=word/footer5.xml><?xml version="1.0" encoding="utf-8"?>
+<w:ftr xmlns:wpc="http://schemas.microsoft.com/office/word/2010/wordprocessingCanvas" xmlns:cx="http://schemas.microsoft.com/office/drawing/2014/chartex" xmlns:cx1="http://schemas.microsoft.com/office/drawing/2015/9/8/chartex" xmlns:cx2="http://schemas.microsoft.com/office/drawing/2015/10/21/chartex" xmlns:cx3="http://schemas.microsoft.com/office/drawing/2016/5/9/chartex" xmlns:cx4="http://schemas.microsoft.com/office/drawing/2016/5/10/chartex" xmlns:cx5="http://schemas.microsoft.com/office/drawing/2016/5/11/chartex" xmlns:cx6="http://schemas.microsoft.com/office/drawing/2016/5/12/chartex" xmlns:cx7="http://schemas.microsoft.com/office/drawing/2016/5/13/chartex" xmlns:cx8="http://schemas.microsoft.com/office/drawing/2016/5/14/chartex" xmlns:mc="http://schemas.openxmlformats.org/markup-compatibility/2006" xmlns:aink="http://schemas.microsoft.com/office/drawing/2016/ink" xmlns:am3d="http://schemas.microsoft.com/office/drawing/2017/model3d" xmlns:o="urn:schemas-microsoft-com:office:office" xmlns:oel="http://schemas.microsoft.com/office/2019/extlst" xmlns:r="http://schemas.openxmlformats.org/officeDocument/2006/relationships" xmlns:m="http://schemas.openxmlformats.org/officeDocument/2006/math" xmlns:v="urn:schemas-microsoft-com:vml" xmlns:wp14="http://schemas.microsoft.com/office/word/2010/wordprocessingDrawing" xmlns:wp="http://schemas.openxmlformats.org/drawingml/2006/wordprocessingDrawing" xmlns:w10="urn:schemas-microsoft-com:office:word" xmlns:w="http://schemas.openxmlformats.org/wordprocessingml/2006/main" xmlns:w14="http://schemas.microsoft.com/office/word/2010/wordml" xmlns:w15="http://schemas.microsoft.com/office/word/2012/wordml" xmlns:w16cex="http://schemas.microsoft.com/office/word/2018/wordml/cex" xmlns:w16cid="http://schemas.microsoft.com/office/word/2016/wordml/cid" xmlns:w16="http://schemas.microsoft.com/office/word/2018/wordml" xmlns:w16du="http://schemas.microsoft.com/office/word/2023/wordml/word16du" xmlns:w16sdtdh="http://schemas.microsoft.com/office/word/2020/wordml/sdtdatahash" xmlns:w16se="http://schemas.microsoft.com/office/word/2015/wordml/symex" xmlns:wpg="http://schemas.microsoft.com/office/word/2010/wordprocessingGroup" xmlns:wpi="http://schemas.microsoft.com/office/word/2010/wordprocessingInk" xmlns:wne="http://schemas.microsoft.com/office/word/2006/wordml" xmlns:wps="http://schemas.microsoft.com/office/word/2010/wordprocessingShape" mc:Ignorable="w14 w15 w16se w16cid w16 w16cex w16sdtdh w16du wp14">
+  <w:p>
+    <w:pPr>
+      <w:jc w:val="center"/>
+    </w:pPr>
+    <w:r>
+      <w:rPr>
+        <w:color w:val="7A7A7A"/>
+        <w:sz w:val="18"/>
+        <w:szCs w:val="18"/>
+      </w:rPr>
+      <w:t xml:space="preserve">Page </w:t>
+    </w:r>
+    <w:r>
+      <w:rPr>
+        <w:color w:val="7A7A7A"/>
+        <w:sz w:val="18"/>
+        <w:szCs w:val="18"/>
+      </w:rPr>
+      <w:fldChar w:fldCharType="begin"/>
+    </w:r>
+    <w:r>
+      <w:rPr>
+        <w:color w:val="7A7A7A"/>
+        <w:sz w:val="18"/>
+        <w:szCs w:val="18"/>
+      </w:rPr>
+      <w:instrText>PAGE</w:instrText>
+    </w:r>
+    <w:r>
+      <w:rPr>
+        <w:color w:val="7A7A7A"/>
+        <w:sz w:val="18"/>
+        <w:szCs w:val="18"/>
+      </w:rPr>
+      <w:fldChar w:fldCharType="separate"/>
+    </w:r>
+    <w:r>
+      <w:rPr>
+        <w:noProof/>
+        <w:color w:val="7A7A7A"/>
+        <w:sz w:val="18"/>
+        <w:szCs w:val="18"/>
+      </w:rPr>
+      <w:t>1</w:t>
+    </w:r>
+    <w:r>
+      <w:rPr>
+        <w:color w:val="7A7A7A"/>
+        <w:sz w:val="18"/>
+        <w:szCs w:val="18"/>
+      </w:rPr>
+      <w:fldChar w:fldCharType="end"/>
+    </w:r>
+  </w:p>
+</w:ftr>
+</file>
+
+<file path=word/footer6.xml><?xml version="1.0" encoding="utf-8"?>
+<w:ftr xmlns:wpc="http://schemas.microsoft.com/office/word/2010/wordprocessingCanvas" xmlns:cx="http://schemas.microsoft.com/office/drawing/2014/chartex" xmlns:cx1="http://schemas.microsoft.com/office/drawing/2015/9/8/chartex" xmlns:cx2="http://schemas.microsoft.com/office/drawing/2015/10/21/chartex" xmlns:cx3="http://schemas.microsoft.com/office/drawing/2016/5/9/chartex" xmlns:cx4="http://schemas.microsoft.com/office/drawing/2016/5/10/chartex" xmlns:cx5="http://schemas.microsoft.com/office/drawing/2016/5/11/chartex" xmlns:cx6="http://schemas.microsoft.com/office/drawing/2016/5/12/chartex" xmlns:cx7="http://schemas.microsoft.com/office/drawing/2016/5/13/chartex" xmlns:cx8="http://schemas.microsoft.com/office/drawing/2016/5/14/chartex" xmlns:mc="http://schemas.openxmlformats.org/markup-compatibility/2006" xmlns:aink="http://schemas.microsoft.com/office/drawing/2016/ink" xmlns:am3d="http://schemas.microsoft.com/office/drawing/2017/model3d" xmlns:o="urn:schemas-microsoft-com:office:office" xmlns:oel="http://schemas.microsoft.com/office/2019/extlst" xmlns:r="http://schemas.openxmlformats.org/officeDocument/2006/relationships" xmlns:m="http://schemas.openxmlformats.org/officeDocument/2006/math" xmlns:v="urn:schemas-microsoft-com:vml" xmlns:wp14="http://schemas.microsoft.com/office/word/2010/wordprocessingDrawing" xmlns:wp="http://schemas.openxmlformats.org/drawingml/2006/wordprocessingDrawing" xmlns:w10="urn:schemas-microsoft-com:office:word" xmlns:w="http://schemas.openxmlformats.org/wordprocessingml/2006/main" xmlns:w14="http://schemas.microsoft.com/office/word/2010/wordml" xmlns:w15="http://schemas.microsoft.com/office/word/2012/wordml" xmlns:w16cex="http://schemas.microsoft.com/office/word/2018/wordml/cex" xmlns:w16cid="http://schemas.microsoft.com/office/word/2016/wordml/cid" xmlns:w16="http://schemas.microsoft.com/office/word/2018/wordml" xmlns:w16du="http://schemas.microsoft.com/office/word/2023/wordml/word16du" xmlns:w16sdtdh="http://schemas.microsoft.com/office/word/2020/wordml/sdtdatahash" xmlns:w16se="http://schemas.microsoft.com/office/word/2015/wordml/symex" xmlns:wpg="http://schemas.microsoft.com/office/word/2010/wordprocessingGroup" xmlns:wpi="http://schemas.microsoft.com/office/word/2010/wordprocessingInk" xmlns:wne="http://schemas.microsoft.com/office/word/2006/wordml" xmlns:wps="http://schemas.microsoft.com/office/word/2010/wordprocessingShape" mc:Ignorable="w14 w15 w16se w16cid w16 w16cex w16sdtdh w16du wp14">
+  <w:p>
+    <w:pPr>
+      <w:jc w:val="center"/>
+    </w:pPr>
+    <w:r>
+      <w:rPr>
+        <w:color w:val="7A7A7A"/>
+        <w:sz w:val="18"/>
+        <w:szCs w:val="18"/>
+      </w:rPr>
+      <w:t xml:space="preserve">Page </w:t>
+    </w:r>
+    <w:r>
+      <w:rPr>
+        <w:color w:val="7A7A7A"/>
+        <w:sz w:val="18"/>
+        <w:szCs w:val="18"/>
+      </w:rPr>
+      <w:fldChar w:fldCharType="begin"/>
+    </w:r>
+    <w:r>
+      <w:rPr>
+        <w:color w:val="7A7A7A"/>
+        <w:sz w:val="18"/>
+        <w:szCs w:val="18"/>
+      </w:rPr>
+      <w:instrText>PAGE</w:instrText>
+    </w:r>
+    <w:r>
+      <w:rPr>
+        <w:color w:val="7A7A7A"/>
+        <w:sz w:val="18"/>
+        <w:szCs w:val="18"/>
+      </w:rPr>
+      <w:fldChar w:fldCharType="separate"/>
+    </w:r>
+    <w:r>
+      <w:rPr>
+        <w:noProof/>
+        <w:color w:val="7A7A7A"/>
+        <w:sz w:val="18"/>
+        <w:szCs w:val="18"/>
+      </w:rPr>
+      <w:t>19</w:t>
+    </w:r>
+    <w:r>
+      <w:rPr>
+        <w:color w:val="7A7A7A"/>
+        <w:sz w:val="18"/>
+        <w:szCs w:val="18"/>
+      </w:rPr>
+      <w:fldChar w:fldCharType="end"/>
+    </w:r>
+  </w:p>
+</w:ftr>
+</file>
+
+<file path=word/footer7.xml><?xml version="1.0" encoding="utf-8"?>
+<w:ftr xmlns:wpc="http://schemas.microsoft.com/office/word/2010/wordprocessingCanvas" xmlns:cx="http://schemas.microsoft.com/office/drawing/2014/chartex" xmlns:cx1="http://schemas.microsoft.com/office/drawing/2015/9/8/chartex" xmlns:cx2="http://schemas.microsoft.com/office/drawing/2015/10/21/chartex" xmlns:cx3="http://schemas.microsoft.com/office/drawing/2016/5/9/chartex" xmlns:cx4="http://schemas.microsoft.com/office/drawing/2016/5/10/chartex" xmlns:cx5="http://schemas.microsoft.com/office/drawing/2016/5/11/chartex" xmlns:cx6="http://schemas.microsoft.com/office/drawing/2016/5/12/chartex" xmlns:cx7="http://schemas.microsoft.com/office/drawing/2016/5/13/chartex" xmlns:cx8="http://schemas.microsoft.com/office/drawing/2016/5/14/chartex" xmlns:mc="http://schemas.openxmlformats.org/markup-compatibility/2006" xmlns:aink="http://schemas.microsoft.com/office/drawing/2016/ink" xmlns:am3d="http://schemas.microsoft.com/office/drawing/2017/model3d" xmlns:o="urn:schemas-microsoft-com:office:office" xmlns:oel="http://schemas.microsoft.com/office/2019/extlst" xmlns:r="http://schemas.openxmlformats.org/officeDocument/2006/relationships" xmlns:m="http://schemas.openxmlformats.org/officeDocument/2006/math" xmlns:v="urn:schemas-microsoft-com:vml" xmlns:wp14="http://schemas.microsoft.com/office/word/2010/wordprocessingDrawing" xmlns:wp="http://schemas.openxmlformats.org/drawingml/2006/wordprocessingDrawing" xmlns:w10="urn:schemas-microsoft-com:office:word" xmlns:w="http://schemas.openxmlformats.org/wordprocessingml/2006/main" xmlns:w14="http://schemas.microsoft.com/office/word/2010/wordml" xmlns:w15="http://schemas.microsoft.com/office/word/2012/wordml" xmlns:w16cex="http://schemas.microsoft.com/office/word/2018/wordml/cex" xmlns:w16cid="http://schemas.microsoft.com/office/word/2016/wordml/cid" xmlns:w16="http://schemas.microsoft.com/office/word/2018/wordml" xmlns:w16du="http://schemas.microsoft.com/office/word/2023/wordml/word16du" xmlns:w16sdtdh="http://schemas.microsoft.com/office/word/2020/wordml/sdtdatahash" xmlns:w16se="http://schemas.microsoft.com/office/word/2015/wordml/symex" xmlns:wpg="http://schemas.microsoft.com/office/word/2010/wordprocessingGroup" xmlns:wpi="http://schemas.microsoft.com/office/word/2010/wordprocessingInk" xmlns:wne="http://schemas.microsoft.com/office/word/2006/wordml" xmlns:wps="http://schemas.microsoft.com/office/word/2010/wordprocessingShape" mc:Ignorable="w14 w15 w16se w16cid w16 w16cex w16sdtdh w16du wp14">
+  <w:p>
+    <w:pPr>
+      <w:jc w:val="center"/>
+    </w:pPr>
+    <w:r>
+      <w:rPr>
+        <w:color w:val="7A7A7A"/>
+        <w:sz w:val="18"/>
+        <w:szCs w:val="18"/>
+      </w:rPr>
+      <w:t xml:space="preserve">Page </w:t>
+    </w:r>
+    <w:r>
+      <w:rPr>
+        <w:color w:val="7A7A7A"/>
+        <w:sz w:val="18"/>
+        <w:szCs w:val="18"/>
+      </w:rPr>
+      <w:fldChar w:fldCharType="begin"/>
+    </w:r>
+    <w:r>
+      <w:rPr>
+        <w:color w:val="7A7A7A"/>
+        <w:sz w:val="18"/>
+        <w:szCs w:val="18"/>
+      </w:rPr>
+      <w:instrText>PAGE</w:instrText>
+    </w:r>
+    <w:r>
+      <w:rPr>
+        <w:color w:val="7A7A7A"/>
+        <w:sz w:val="18"/>
+        <w:szCs w:val="18"/>
+      </w:rPr>
+      <w:fldChar w:fldCharType="separate"/>
+    </w:r>
+    <w:r>
+      <w:rPr>
+        <w:noProof/>
+        <w:color w:val="7A7A7A"/>
+        <w:sz w:val="18"/>
+        <w:szCs w:val="18"/>
+      </w:rPr>
+      <w:t>1</w:t>
+    </w:r>
+    <w:r>
+      <w:rPr>
+        <w:color w:val="7A7A7A"/>
+        <w:sz w:val="18"/>
+        <w:szCs w:val="18"/>
+      </w:rPr>
+      <w:fldChar w:fldCharType="end"/>
+    </w:r>
+  </w:p>
+</w:ftr>
+</file>
+
+<file path=word/footer8.xml><?xml version="1.0" encoding="utf-8"?>
+<w:ftr xmlns:wpc="http://schemas.microsoft.com/office/word/2010/wordprocessingCanvas" xmlns:cx="http://schemas.microsoft.com/office/drawing/2014/chartex" xmlns:cx1="http://schemas.microsoft.com/office/drawing/2015/9/8/chartex" xmlns:cx2="http://schemas.microsoft.com/office/drawing/2015/10/21/chartex" xmlns:cx3="http://schemas.microsoft.com/office/drawing/2016/5/9/chartex" xmlns:cx4="http://schemas.microsoft.com/office/drawing/2016/5/10/chartex" xmlns:cx5="http://schemas.microsoft.com/office/drawing/2016/5/11/chartex" xmlns:cx6="http://schemas.microsoft.com/office/drawing/2016/5/12/chartex" xmlns:cx7="http://schemas.microsoft.com/office/drawing/2016/5/13/chartex" xmlns:cx8="http://schemas.microsoft.com/office/drawing/2016/5/14/chartex" xmlns:mc="http://schemas.openxmlformats.org/markup-compatibility/2006" xmlns:aink="http://schemas.microsoft.com/office/drawing/2016/ink" xmlns:am3d="http://schemas.microsoft.com/office/drawing/2017/model3d" xmlns:o="urn:schemas-microsoft-com:office:office" xmlns:oel="http://schemas.microsoft.com/office/2019/extlst" xmlns:r="http://schemas.openxmlformats.org/officeDocument/2006/relationships" xmlns:m="http://schemas.openxmlformats.org/officeDocument/2006/math" xmlns:v="urn:schemas-microsoft-com:vml" xmlns:wp14="http://schemas.microsoft.com/office/word/2010/wordprocessingDrawing" xmlns:wp="http://schemas.openxmlformats.org/drawingml/2006/wordprocessingDrawing" xmlns:w10="urn:schemas-microsoft-com:office:word" xmlns:w="http://schemas.openxmlformats.org/wordprocessingml/2006/main" xmlns:w14="http://schemas.microsoft.com/office/word/2010/wordml" xmlns:w15="http://schemas.microsoft.com/office/word/2012/wordml" xmlns:w16cex="http://schemas.microsoft.com/office/word/2018/wordml/cex" xmlns:w16cid="http://schemas.microsoft.com/office/word/2016/wordml/cid" xmlns:w16="http://schemas.microsoft.com/office/word/2018/wordml" xmlns:w16du="http://schemas.microsoft.com/office/word/2023/wordml/word16du" xmlns:w16sdtdh="http://schemas.microsoft.com/office/word/2020/wordml/sdtdatahash" xmlns:w16se="http://schemas.microsoft.com/office/word/2015/wordml/symex" xmlns:wpg="http://schemas.microsoft.com/office/word/2010/wordprocessingGroup" xmlns:wpi="http://schemas.microsoft.com/office/word/2010/wordprocessingInk" xmlns:wne="http://schemas.microsoft.com/office/word/2006/wordml" xmlns:wps="http://schemas.microsoft.com/office/word/2010/wordprocessingShape" mc:Ignorable="w14 w15 w16se w16cid w16 w16cex w16sdtdh w16du wp14">
+  <w:p>
+    <w:pPr>
+      <w:jc w:val="center"/>
+    </w:pPr>
+    <w:r>
+      <w:rPr>
+        <w:color w:val="7A7A7A"/>
+        <w:sz w:val="18"/>
+        <w:szCs w:val="18"/>
+      </w:rPr>
+      <w:t xml:space="preserve">Page </w:t>
+    </w:r>
+    <w:r>
+      <w:rPr>
+        <w:color w:val="7A7A7A"/>
+        <w:sz w:val="18"/>
+        <w:szCs w:val="18"/>
+      </w:rPr>
+      <w:fldChar w:fldCharType="begin"/>
+    </w:r>
+    <w:r>
+      <w:rPr>
+        <w:color w:val="7A7A7A"/>
+        <w:sz w:val="18"/>
+        <w:szCs w:val="18"/>
+      </w:rPr>
+      <w:instrText>PAGE</w:instrText>
+    </w:r>
+    <w:r>
+      <w:rPr>
+        <w:color w:val="7A7A7A"/>
+        <w:sz w:val="18"/>
+        <w:szCs w:val="18"/>
+      </w:rPr>
+      <w:fldChar w:fldCharType="separate"/>
+    </w:r>
+    <w:r>
+      <w:rPr>
+        <w:noProof/>
+        <w:color w:val="7A7A7A"/>
+        <w:sz w:val="18"/>
+        <w:szCs w:val="18"/>
+      </w:rPr>
+      <w:t>19</w:t>
+    </w:r>
+    <w:r>
+      <w:rPr>
+        <w:color w:val="7A7A7A"/>
+        <w:sz w:val="18"/>
+        <w:szCs w:val="18"/>
+      </w:rPr>
+      <w:fldChar w:fldCharType="end"/>
+    </w:r>
+  </w:p>
+</w:ftr>
+</file>
+
+<file path=word/footer9.xml><?xml version="1.0" encoding="utf-8"?>
+<w:ftr xmlns:wpc="http://schemas.microsoft.com/office/word/2010/wordprocessingCanvas" xmlns:cx="http://schemas.microsoft.com/office/drawing/2014/chartex" xmlns:cx1="http://schemas.microsoft.com/office/drawing/2015/9/8/chartex" xmlns:cx2="http://schemas.microsoft.com/office/drawing/2015/10/21/chartex" xmlns:cx3="http://schemas.microsoft.com/office/drawing/2016/5/9/chartex" xmlns:cx4="http://schemas.microsoft.com/office/drawing/2016/5/10/chartex" xmlns:cx5="http://schemas.microsoft.com/office/drawing/2016/5/11/chartex" xmlns:cx6="http://schemas.microsoft.com/office/drawing/2016/5/12/chartex" xmlns:cx7="http://schemas.microsoft.com/office/drawing/2016/5/13/chartex" xmlns:cx8="http://schemas.microsoft.com/office/drawing/2016/5/14/chartex" xmlns:mc="http://schemas.openxmlformats.org/markup-compatibility/2006" xmlns:aink="http://schemas.microsoft.com/office/drawing/2016/ink" xmlns:am3d="http://schemas.microsoft.com/office/drawing/2017/model3d" xmlns:o="urn:schemas-microsoft-com:office:office" xmlns:oel="http://schemas.microsoft.com/office/2019/extlst" xmlns:r="http://schemas.openxmlformats.org/officeDocument/2006/relationships" xmlns:m="http://schemas.openxmlformats.org/officeDocument/2006/math" xmlns:v="urn:schemas-microsoft-com:vml" xmlns:wp14="http://schemas.microsoft.com/office/word/2010/wordprocessingDrawing" xmlns:wp="http://schemas.openxmlformats.org/drawingml/2006/wordprocessingDrawing" xmlns:w10="urn:schemas-microsoft-com:office:word" xmlns:w="http://schemas.openxmlformats.org/wordprocessingml/2006/main" xmlns:w14="http://schemas.microsoft.com/office/word/2010/wordml" xmlns:w15="http://schemas.microsoft.com/office/word/2012/wordml" xmlns:w16cex="http://schemas.microsoft.com/office/word/2018/wordml/cex" xmlns:w16cid="http://schemas.microsoft.com/office/word/2016/wordml/cid" xmlns:w16="http://schemas.microsoft.com/office/word/2018/wordml" xmlns:w16du="http://schemas.microsoft.com/office/word/2023/wordml/word16du" xmlns:w16sdtdh="http://schemas.microsoft.com/office/word/2020/wordml/sdtdatahash" xmlns:w16se="http://schemas.microsoft.com/office/word/2015/wordml/symex" xmlns:wpg="http://schemas.microsoft.com/office/word/2010/wordprocessingGroup" xmlns:wpi="http://schemas.microsoft.com/office/word/2010/wordprocessingInk" xmlns:wne="http://schemas.microsoft.com/office/word/2006/wordml" xmlns:wps="http://schemas.microsoft.com/office/word/2010/wordprocessingShape" mc:Ignorable="w14 w15 w16se w16cid w16 w16cex w16sdtdh w16du wp14">
+  <w:p>
+    <w:pPr>
+      <w:jc w:val="center"/>
+    </w:pPr>
+    <w:r>
+      <w:rPr>
+        <w:color w:val="7A7A7A"/>
+        <w:sz w:val="18"/>
+        <w:szCs w:val="18"/>
+      </w:rPr>
+      <w:t xml:space="preserve">Page </w:t>
+    </w:r>
+    <w:r>
+      <w:rPr>
+        <w:color w:val="7A7A7A"/>
+        <w:sz w:val="18"/>
+        <w:szCs w:val="18"/>
+      </w:rPr>
+      <w:fldChar w:fldCharType="begin"/>
+    </w:r>
+    <w:r>
+      <w:rPr>
+        <w:color w:val="7A7A7A"/>
+        <w:sz w:val="18"/>
+        <w:szCs w:val="18"/>
+      </w:rPr>
+      <w:instrText>PAGE</w:instrText>
+    </w:r>
+    <w:r>
+      <w:rPr>
+        <w:color w:val="7A7A7A"/>
+        <w:sz w:val="18"/>
+        <w:szCs w:val="18"/>
+      </w:rPr>
+      <w:fldChar w:fldCharType="separate"/>
+    </w:r>
+    <w:r>
+      <w:rPr>
+        <w:noProof/>
+        <w:color w:val="7A7A7A"/>
+        <w:sz w:val="18"/>
+        <w:szCs w:val="18"/>
+      </w:rPr>
       <w:t>21</w:t>
     </w:r>
     <w:r>
@@ -22907,6 +23837,119 @@
 <file path=word/numbering.xml><?xml version="1.0" encoding="utf-8"?>
 <w:numbering xmlns:wpc="http://schemas.microsoft.com/office/word/2010/wordprocessingCanvas" xmlns:cx="http://schemas.microsoft.com/office/drawing/2014/chartex" xmlns:cx1="http://schemas.microsoft.com/office/drawing/2015/9/8/chartex" xmlns:cx2="http://schemas.microsoft.com/office/drawing/2015/10/21/chartex" xmlns:cx3="http://schemas.microsoft.com/office/drawing/2016/5/9/chartex" xmlns:cx4="http://schemas.microsoft.com/office/drawing/2016/5/10/chartex" xmlns:cx5="http://schemas.microsoft.com/office/drawing/2016/5/11/chartex" xmlns:cx6="http://schemas.microsoft.com/office/drawing/2016/5/12/chartex" xmlns:cx7="http://schemas.microsoft.com/office/drawing/2016/5/13/chartex" xmlns:cx8="http://schemas.microsoft.com/office/drawing/2016/5/14/chartex" xmlns:mc="http://schemas.openxmlformats.org/markup-compatibility/2006" xmlns:aink="http://schemas.microsoft.com/office/drawing/2016/ink" xmlns:am3d="http://schemas.microsoft.com/office/drawing/2017/model3d" xmlns:o="urn:schemas-microsoft-com:office:office" xmlns:oel="http://schemas.microsoft.com/office/2019/extlst" xmlns:r="http://schemas.openxmlformats.org/officeDocument/2006/relationships" xmlns:m="http://schemas.openxmlformats.org/officeDocument/2006/math" xmlns:v="urn:schemas-microsoft-com:vml" xmlns:wp14="http://schemas.microsoft.com/office/word/2010/wordprocessingDrawing" xmlns:wp="http://schemas.openxmlformats.org/drawingml/2006/wordprocessingDrawing" xmlns:w10="urn:schemas-microsoft-com:office:word" xmlns:w="http://schemas.openxmlformats.org/wordprocessingml/2006/main" xmlns:w14="http://schemas.microsoft.com/office/word/2010/wordml" xmlns:w15="http://schemas.microsoft.com/office/word/2012/wordml" xmlns:w16cex="http://schemas.microsoft.com/office/word/2018/wordml/cex" xmlns:w16cid="http://schemas.microsoft.com/office/word/2016/wordml/cid" xmlns:w16="http://schemas.microsoft.com/office/word/2018/wordml" xmlns:w16du="http://schemas.microsoft.com/office/word/2023/wordml/word16du" xmlns:w16sdtdh="http://schemas.microsoft.com/office/word/2020/wordml/sdtdatahash" xmlns:w16se="http://schemas.microsoft.com/office/word/2015/wordml/symex" xmlns:wpg="http://schemas.microsoft.com/office/word/2010/wordprocessingGroup" xmlns:wpi="http://schemas.microsoft.com/office/word/2010/wordprocessingInk" xmlns:wne="http://schemas.microsoft.com/office/word/2006/wordml" xmlns:wps="http://schemas.microsoft.com/office/word/2010/wordprocessingShape" mc:Ignorable="w14 w15 w16se w16cid w16 w16cex w16sdtdh w16du wp14">
   <w:abstractNum w:abstractNumId="0" w15:restartNumberingAfterBreak="0">
+    <w:nsid w:val="690B1D51"/>
+    <w:multiLevelType w:val="hybridMultilevel"/>
+    <w:tmpl w:val="0BF61916"/>
+    <w:lvl w:ilvl="0" w:tplc="49B28A24">
+      <w:start w:val="1"/>
+      <w:numFmt w:val="bullet"/>
+      <w:lvlText w:val="-"/>
+      <w:lvlJc w:val="left"/>
+      <w:pPr>
+        <w:ind w:left="720" w:hanging="360"/>
+      </w:pPr>
+      <w:rPr>
+        <w:rFonts w:ascii="Calibri" w:eastAsia="Calibri" w:hAnsi="Calibri" w:cs="Calibri" w:hint="default"/>
+      </w:rPr>
+    </w:lvl>
+    <w:lvl w:ilvl="1" w:tplc="04090003" w:tentative="1">
+      <w:start w:val="1"/>
+      <w:numFmt w:val="bullet"/>
+      <w:lvlText w:val="o"/>
+      <w:lvlJc w:val="left"/>
+      <w:pPr>
+        <w:ind w:left="1440" w:hanging="360"/>
+      </w:pPr>
+      <w:rPr>
+        <w:rFonts w:ascii="Courier New" w:hAnsi="Courier New" w:hint="default"/>
+      </w:rPr>
+    </w:lvl>
+    <w:lvl w:ilvl="2" w:tplc="04090005" w:tentative="1">
+      <w:start w:val="1"/>
+      <w:numFmt w:val="bullet"/>
+      <w:lvlText w:val=""/>
+      <w:lvlJc w:val="left"/>
+      <w:pPr>
+        <w:ind w:left="2160" w:hanging="360"/>
+      </w:pPr>
+      <w:rPr>
+        <w:rFonts w:ascii="Wingdings" w:hAnsi="Wingdings" w:hint="default"/>
+      </w:rPr>
+    </w:lvl>
+    <w:lvl w:ilvl="3" w:tplc="04090001" w:tentative="1">
+      <w:start w:val="1"/>
+      <w:numFmt w:val="bullet"/>
+      <w:lvlText w:val=""/>
+      <w:lvlJc w:val="left"/>
+      <w:pPr>
+        <w:ind w:left="2880" w:hanging="360"/>
+      </w:pPr>
+      <w:rPr>
+        <w:rFonts w:ascii="Symbol" w:hAnsi="Symbol" w:hint="default"/>
+      </w:rPr>
+    </w:lvl>
+    <w:lvl w:ilvl="4" w:tplc="04090003" w:tentative="1">
+      <w:start w:val="1"/>
+      <w:numFmt w:val="bullet"/>
+      <w:lvlText w:val="o"/>
+      <w:lvlJc w:val="left"/>
+      <w:pPr>
+        <w:ind w:left="3600" w:hanging="360"/>
+      </w:pPr>
+      <w:rPr>
+        <w:rFonts w:ascii="Courier New" w:hAnsi="Courier New" w:hint="default"/>
+      </w:rPr>
+    </w:lvl>
+    <w:lvl w:ilvl="5" w:tplc="04090005" w:tentative="1">
+      <w:start w:val="1"/>
+      <w:numFmt w:val="bullet"/>
+      <w:lvlText w:val=""/>
+      <w:lvlJc w:val="left"/>
+      <w:pPr>
+        <w:ind w:left="4320" w:hanging="360"/>
+      </w:pPr>
+      <w:rPr>
+        <w:rFonts w:ascii="Wingdings" w:hAnsi="Wingdings" w:hint="default"/>
+      </w:rPr>
+    </w:lvl>
+    <w:lvl w:ilvl="6" w:tplc="04090001" w:tentative="1">
+      <w:start w:val="1"/>
+      <w:numFmt w:val="bullet"/>
+      <w:lvlText w:val=""/>
+      <w:lvlJc w:val="left"/>
+      <w:pPr>
+        <w:ind w:left="5040" w:hanging="360"/>
+      </w:pPr>
+      <w:rPr>
+        <w:rFonts w:ascii="Symbol" w:hAnsi="Symbol" w:hint="default"/>
+      </w:rPr>
+    </w:lvl>
+    <w:lvl w:ilvl="7" w:tplc="04090003" w:tentative="1">
+      <w:start w:val="1"/>
+      <w:numFmt w:val="bullet"/>
+      <w:lvlText w:val="o"/>
+      <w:lvlJc w:val="left"/>
+      <w:pPr>
+        <w:ind w:left="5760" w:hanging="360"/>
+      </w:pPr>
+      <w:rPr>
+        <w:rFonts w:ascii="Courier New" w:hAnsi="Courier New" w:hint="default"/>
+      </w:rPr>
+    </w:lvl>
+    <w:lvl w:ilvl="8" w:tplc="04090005" w:tentative="1">
+      <w:start w:val="1"/>
+      <w:numFmt w:val="bullet"/>
+      <w:lvlText w:val=""/>
+      <w:lvlJc w:val="left"/>
+      <w:pPr>
+        <w:ind w:left="6480" w:hanging="360"/>
+      </w:pPr>
+      <w:rPr>
+        <w:rFonts w:ascii="Wingdings" w:hAnsi="Wingdings" w:hint="default"/>
+      </w:rPr>
+    </w:lvl>
+  </w:abstractNum>
+  <w:abstractNum w:abstractNumId="1" w15:restartNumberingAfterBreak="0">
     <w:nsid w:val="6B270401"/>
     <w:multiLevelType w:val="hybridMultilevel"/>
     <w:tmpl w:val="A8381916"/>
@@ -22992,7 +24035,7 @@
       </w:pPr>
     </w:lvl>
   </w:abstractNum>
-  <w:abstractNum w:abstractNumId="1" w15:restartNumberingAfterBreak="0">
+  <w:abstractNum w:abstractNumId="2" w15:restartNumberingAfterBreak="0">
     <w:nsid w:val="725F7C03"/>
     <w:multiLevelType w:val="singleLevel"/>
     <w:tmpl w:val="0409000F"/>
@@ -23006,7 +24049,7 @@
       </w:pPr>
     </w:lvl>
   </w:abstractNum>
-  <w:abstractNum w:abstractNumId="2" w15:restartNumberingAfterBreak="0">
+  <w:abstractNum w:abstractNumId="3" w15:restartNumberingAfterBreak="0">
     <w:nsid w:val="79366CFB"/>
     <w:multiLevelType w:val="hybridMultilevel"/>
     <w:tmpl w:val="55341080"/>
@@ -23061,19 +24104,22 @@
     </w:lvl>
   </w:abstractNum>
   <w:num w:numId="1" w16cid:durableId="1641154694">
-    <w:abstractNumId w:val="0"/>
+    <w:abstractNumId w:val="1"/>
     <w:lvlOverride w:ilvl="0">
       <w:startOverride w:val="1"/>
     </w:lvlOverride>
   </w:num>
   <w:num w:numId="2" w16cid:durableId="806627191">
-    <w:abstractNumId w:val="2"/>
+    <w:abstractNumId w:val="3"/>
     <w:lvlOverride w:ilvl="0">
       <w:startOverride w:val="1"/>
     </w:lvlOverride>
   </w:num>
   <w:num w:numId="3" w16cid:durableId="250089780">
-    <w:abstractNumId w:val="1"/>
+    <w:abstractNumId w:val="2"/>
+  </w:num>
+  <w:num w:numId="4" w16cid:durableId="594943165">
+    <w:abstractNumId w:val="0"/>
   </w:num>
 </w:numbering>
 </file>
@@ -23567,6 +24613,7 @@
   <w:style w:type="character" w:default="1" w:styleId="DefaultParagraphFont">
     <w:name w:val="Default Paragraph Font"/>
     <w:uiPriority w:val="1"/>
+    <w:semiHidden/>
     <w:unhideWhenUsed/>
   </w:style>
   <w:style w:type="table" w:default="1" w:styleId="TableNormal">

</xml_diff>

<commit_message>
Section 2 F02 done
</commit_message>
<xml_diff>
--- a/Stage1_Report.docx
+++ b/Stage1_Report.docx
@@ -5854,9 +5854,11 @@
               <w:rPr>
                 <w:i/>
                 <w:iCs/>
-                <w:color w:val="7A7A7A"/>
-              </w:rPr>
-              <w:t>[TODO: How does the user access or use this feature through the GUI?]</w:t>
+              </w:rPr>
+              <w:t>Lore</w:t>
+            </w:r>
+            <w:r>
+              <w:t xml:space="preserve"> Panel beside the story, listing lore entries. A button opens a form to add an entry; clicking an entry opens the form to edit it. Users can filter the list by using a search box at the top of the panel. </w:t>
             </w:r>
           </w:p>
         </w:tc>
@@ -5910,12 +5912,7 @@
           </w:tcPr>
           <w:p>
             <w:r>
-              <w:rPr>
-                <w:i/>
-                <w:iCs/>
-                <w:color w:val="7A7A7A"/>
-              </w:rPr>
-              <w:t>[TODO: What information does the feature require?]</w:t>
+              <w:t xml:space="preserve">Adding an entry: title, content, tags (all strings) and a pinned status (Boolean; displayed via checkbox) </w:t>
             </w:r>
           </w:p>
         </w:tc>
@@ -5969,12 +5966,22 @@
           </w:tcPr>
           <w:p>
             <w:r>
+              <w:t xml:space="preserve">Entries (both new and edited) are saved in the story’s </w:t>
+            </w:r>
+            <w:r>
               <w:rPr>
                 <w:i/>
                 <w:iCs/>
-                <w:color w:val="7A7A7A"/>
-              </w:rPr>
-              <w:t>[TODO: What does it produce?]</w:t>
+              </w:rPr>
+              <w:t>Lore</w:t>
+            </w:r>
+            <w:r>
+              <w:t xml:space="preserve"> panel and shown in the list.</w:t>
+            </w:r>
+          </w:p>
+          <w:p>
+            <w:r>
+              <w:t>If searching, matching entries are shown.</w:t>
             </w:r>
           </w:p>
         </w:tc>
@@ -6081,13 +6088,35 @@
             </w:tcMar>
           </w:tcPr>
           <w:p>
-            <w:r>
-              <w:rPr>
-                <w:i/>
-                <w:iCs/>
-                <w:color w:val="7A7A7A"/>
-              </w:rPr>
-              <w:t>[TODO: What happens, step by step, when the feature is executed?]</w:t>
+            <w:pPr>
+              <w:pStyle w:val="ListParagraph"/>
+              <w:numPr>
+                <w:ilvl w:val="0"/>
+                <w:numId w:val="4"/>
+              </w:numPr>
+            </w:pPr>
+            <w:r>
+              <w:t xml:space="preserve">Add or </w:t>
+            </w:r>
+            <w:proofErr w:type="gramStart"/>
+            <w:r>
+              <w:t>edit:</w:t>
+            </w:r>
+            <w:proofErr w:type="gramEnd"/>
+            <w:r>
+              <w:t xml:space="preserve"> form is filled, inputs are validated, entry is saved to the lore book, list refreshes. </w:t>
+            </w:r>
+          </w:p>
+          <w:p>
+            <w:pPr>
+              <w:pStyle w:val="ListParagraph"/>
+              <w:numPr>
+                <w:ilvl w:val="0"/>
+                <w:numId w:val="4"/>
+              </w:numPr>
+            </w:pPr>
+            <w:r>
+              <w:t>Search: query is entered, matching entries are listed.</w:t>
             </w:r>
           </w:p>
         </w:tc>
@@ -6140,41 +6169,44 @@
             </w:tcMar>
           </w:tcPr>
           <w:p>
-            <w:r>
-              <w:rPr>
-                <w:i/>
-                <w:iCs/>
-                <w:color w:val="7A7A7A"/>
-              </w:rPr>
-              <w:t>[TODO: What could go wrong, and how should the system respond?]</w:t>
+            <w:pPr>
+              <w:pStyle w:val="ListParagraph"/>
+              <w:numPr>
+                <w:ilvl w:val="0"/>
+                <w:numId w:val="4"/>
+              </w:numPr>
+            </w:pPr>
+            <w:r>
+              <w:t>Empty title/content: show message and name field</w:t>
+            </w:r>
+          </w:p>
+          <w:p>
+            <w:pPr>
+              <w:pStyle w:val="ListParagraph"/>
+              <w:numPr>
+                <w:ilvl w:val="0"/>
+                <w:numId w:val="4"/>
+              </w:numPr>
+            </w:pPr>
+            <w:r>
+              <w:t>Search finds nothing: empty list shown with a message</w:t>
+            </w:r>
+          </w:p>
+          <w:p>
+            <w:pPr>
+              <w:pStyle w:val="ListParagraph"/>
+              <w:numPr>
+                <w:ilvl w:val="0"/>
+                <w:numId w:val="4"/>
+              </w:numPr>
+            </w:pPr>
+            <w:r>
+              <w:t>No story open: panel cannot be selected</w:t>
             </w:r>
           </w:p>
         </w:tc>
       </w:tr>
     </w:tbl>
-    <w:p>
-      <w:pPr>
-        <w:spacing w:before="80" w:after="120"/>
-      </w:pPr>
-      <w:r>
-        <w:rPr>
-          <w:b/>
-          <w:bCs/>
-          <w:i/>
-          <w:iCs/>
-          <w:color w:val="7A7A7A"/>
-        </w:rPr>
-        <w:t xml:space="preserve">Open question: </w:t>
-      </w:r>
-      <w:r>
-        <w:rPr>
-          <w:i/>
-          <w:iCs/>
-          <w:color w:val="7A7A7A"/>
-        </w:rPr>
-        <w:t>Must read as clearly different from F03.</w:t>
-      </w:r>
-    </w:p>
     <w:p>
       <w:pPr>
         <w:pStyle w:val="Heading3"/>
@@ -6910,6 +6942,7 @@
                 <w:b/>
                 <w:bCs/>
               </w:rPr>
+              <w:lastRenderedPageBreak/>
               <w:t>Input</w:t>
             </w:r>
           </w:p>
@@ -8318,6 +8351,7 @@
                 <w:b/>
                 <w:bCs/>
               </w:rPr>
+              <w:lastRenderedPageBreak/>
               <w:t>Description</w:t>
             </w:r>
           </w:p>
@@ -8549,7 +8583,6 @@
                 <w:b/>
                 <w:bCs/>
               </w:rPr>
-              <w:lastRenderedPageBreak/>
               <w:t>AI Involvement</w:t>
             </w:r>
           </w:p>
@@ -9711,6 +9744,7 @@
         <w:keepNext/>
       </w:pPr>
       <w:r>
+        <w:lastRenderedPageBreak/>
         <w:t>F10: Story Memory Summarization</w:t>
       </w:r>
     </w:p>
@@ -9929,7 +9963,6 @@
                 <w:b/>
                 <w:bCs/>
               </w:rPr>
-              <w:lastRenderedPageBreak/>
               <w:t>Input</w:t>
             </w:r>
           </w:p>
@@ -11209,6 +11242,7 @@
         <w:keepNext/>
       </w:pPr>
       <w:r>
+        <w:lastRenderedPageBreak/>
         <w:t>F13: Ending Generation</w:t>
       </w:r>
     </w:p>
@@ -11368,7 +11402,6 @@
                 <w:b/>
                 <w:bCs/>
               </w:rPr>
-              <w:lastRenderedPageBreak/>
               <w:t>User Interaction (GUI)</w:t>
             </w:r>
           </w:p>
@@ -24613,7 +24646,6 @@
   <w:style w:type="character" w:default="1" w:styleId="DefaultParagraphFont">
     <w:name w:val="Default Paragraph Font"/>
     <w:uiPriority w:val="1"/>
-    <w:semiHidden/>
     <w:unhideWhenUsed/>
   </w:style>
   <w:style w:type="table" w:default="1" w:styleId="TableNormal">

</xml_diff>

<commit_message>
Finished section 4: patterns
</commit_message>
<xml_diff>
--- a/Stage1_Report.docx
+++ b/Stage1_Report.docx
@@ -131,7 +131,7 @@
           <w:r>
             <w:fldChar w:fldCharType="separate"/>
           </w:r>
-          <w:hyperlink w:anchor="_Toc242439974" w:history="1">
+          <w:hyperlink w:anchor="_Toc242459787" w:history="1">
             <w:r>
               <w:rPr>
                 <w:rStyle w:val="Hyperlink"/>
@@ -155,7 +155,7 @@
               <w:rPr>
                 <w:noProof/>
               </w:rPr>
-              <w:instrText xml:space="preserve"> PAGEREF _Toc242439974 \h </w:instrText>
+              <w:instrText xml:space="preserve"> PAGEREF _Toc242459787 \h </w:instrText>
             </w:r>
             <w:r>
               <w:rPr>
@@ -197,7 +197,7 @@
               <w14:ligatures w14:val="standardContextual"/>
             </w:rPr>
           </w:pPr>
-          <w:hyperlink w:anchor="_Toc242439975" w:history="1">
+          <w:hyperlink w:anchor="_Toc242459788" w:history="1">
             <w:r>
               <w:rPr>
                 <w:rStyle w:val="Hyperlink"/>
@@ -221,7 +221,7 @@
               <w:rPr>
                 <w:noProof/>
               </w:rPr>
-              <w:instrText xml:space="preserve"> PAGEREF _Toc242439975 \h </w:instrText>
+              <w:instrText xml:space="preserve"> PAGEREF _Toc242459788 \h </w:instrText>
             </w:r>
             <w:r>
               <w:rPr>
@@ -263,7 +263,7 @@
               <w14:ligatures w14:val="standardContextual"/>
             </w:rPr>
           </w:pPr>
-          <w:hyperlink w:anchor="_Toc242439976" w:history="1">
+          <w:hyperlink w:anchor="_Toc242459789" w:history="1">
             <w:r>
               <w:rPr>
                 <w:rStyle w:val="Hyperlink"/>
@@ -287,7 +287,7 @@
               <w:rPr>
                 <w:noProof/>
               </w:rPr>
-              <w:instrText xml:space="preserve"> PAGEREF _Toc242439976 \h </w:instrText>
+              <w:instrText xml:space="preserve"> PAGEREF _Toc242459789 \h </w:instrText>
             </w:r>
             <w:r>
               <w:rPr>
@@ -329,7 +329,7 @@
               <w14:ligatures w14:val="standardContextual"/>
             </w:rPr>
           </w:pPr>
-          <w:hyperlink w:anchor="_Toc242439977" w:history="1">
+          <w:hyperlink w:anchor="_Toc242459790" w:history="1">
             <w:r>
               <w:rPr>
                 <w:rStyle w:val="Hyperlink"/>
@@ -353,7 +353,7 @@
               <w:rPr>
                 <w:noProof/>
               </w:rPr>
-              <w:instrText xml:space="preserve"> PAGEREF _Toc242439977 \h </w:instrText>
+              <w:instrText xml:space="preserve"> PAGEREF _Toc242459790 \h </w:instrText>
             </w:r>
             <w:r>
               <w:rPr>
@@ -395,7 +395,7 @@
               <w14:ligatures w14:val="standardContextual"/>
             </w:rPr>
           </w:pPr>
-          <w:hyperlink w:anchor="_Toc242439978" w:history="1">
+          <w:hyperlink w:anchor="_Toc242459791" w:history="1">
             <w:r>
               <w:rPr>
                 <w:rStyle w:val="Hyperlink"/>
@@ -419,7 +419,7 @@
               <w:rPr>
                 <w:noProof/>
               </w:rPr>
-              <w:instrText xml:space="preserve"> PAGEREF _Toc242439978 \h </w:instrText>
+              <w:instrText xml:space="preserve"> PAGEREF _Toc242459791 \h </w:instrText>
             </w:r>
             <w:r>
               <w:rPr>
@@ -461,7 +461,7 @@
               <w14:ligatures w14:val="standardContextual"/>
             </w:rPr>
           </w:pPr>
-          <w:hyperlink w:anchor="_Toc242439979" w:history="1">
+          <w:hyperlink w:anchor="_Toc242459792" w:history="1">
             <w:r>
               <w:rPr>
                 <w:rStyle w:val="Hyperlink"/>
@@ -485,7 +485,7 @@
               <w:rPr>
                 <w:noProof/>
               </w:rPr>
-              <w:instrText xml:space="preserve"> PAGEREF _Toc242439979 \h </w:instrText>
+              <w:instrText xml:space="preserve"> PAGEREF _Toc242459792 \h </w:instrText>
             </w:r>
             <w:r>
               <w:rPr>
@@ -502,7 +502,7 @@
               <w:rPr>
                 <w:noProof/>
               </w:rPr>
-              <w:t>4</w:t>
+              <w:t>5</w:t>
             </w:r>
             <w:r>
               <w:rPr>
@@ -527,7 +527,7 @@
               <w14:ligatures w14:val="standardContextual"/>
             </w:rPr>
           </w:pPr>
-          <w:hyperlink w:anchor="_Toc242439980" w:history="1">
+          <w:hyperlink w:anchor="_Toc242459793" w:history="1">
             <w:r>
               <w:rPr>
                 <w:rStyle w:val="Hyperlink"/>
@@ -551,7 +551,7 @@
               <w:rPr>
                 <w:noProof/>
               </w:rPr>
-              <w:instrText xml:space="preserve"> PAGEREF _Toc242439980 \h </w:instrText>
+              <w:instrText xml:space="preserve"> PAGEREF _Toc242459793 \h </w:instrText>
             </w:r>
             <w:r>
               <w:rPr>
@@ -568,7 +568,7 @@
               <w:rPr>
                 <w:noProof/>
               </w:rPr>
-              <w:t>5</w:t>
+              <w:t>6</w:t>
             </w:r>
             <w:r>
               <w:rPr>
@@ -593,7 +593,7 @@
               <w14:ligatures w14:val="standardContextual"/>
             </w:rPr>
           </w:pPr>
-          <w:hyperlink w:anchor="_Toc242439981" w:history="1">
+          <w:hyperlink w:anchor="_Toc242459794" w:history="1">
             <w:r>
               <w:rPr>
                 <w:rStyle w:val="Hyperlink"/>
@@ -617,7 +617,7 @@
               <w:rPr>
                 <w:noProof/>
               </w:rPr>
-              <w:instrText xml:space="preserve"> PAGEREF _Toc242439981 \h </w:instrText>
+              <w:instrText xml:space="preserve"> PAGEREF _Toc242459794 \h </w:instrText>
             </w:r>
             <w:r>
               <w:rPr>
@@ -634,7 +634,7 @@
               <w:rPr>
                 <w:noProof/>
               </w:rPr>
-              <w:t>5</w:t>
+              <w:t>6</w:t>
             </w:r>
             <w:r>
               <w:rPr>
@@ -659,7 +659,7 @@
               <w14:ligatures w14:val="standardContextual"/>
             </w:rPr>
           </w:pPr>
-          <w:hyperlink w:anchor="_Toc242439982" w:history="1">
+          <w:hyperlink w:anchor="_Toc242459795" w:history="1">
             <w:r>
               <w:rPr>
                 <w:rStyle w:val="Hyperlink"/>
@@ -683,7 +683,7 @@
               <w:rPr>
                 <w:noProof/>
               </w:rPr>
-              <w:instrText xml:space="preserve"> PAGEREF _Toc242439982 \h </w:instrText>
+              <w:instrText xml:space="preserve"> PAGEREF _Toc242459795 \h </w:instrText>
             </w:r>
             <w:r>
               <w:rPr>
@@ -700,7 +700,7 @@
               <w:rPr>
                 <w:noProof/>
               </w:rPr>
-              <w:t>5</w:t>
+              <w:t>7</w:t>
             </w:r>
             <w:r>
               <w:rPr>
@@ -725,7 +725,7 @@
               <w14:ligatures w14:val="standardContextual"/>
             </w:rPr>
           </w:pPr>
-          <w:hyperlink w:anchor="_Toc242439983" w:history="1">
+          <w:hyperlink w:anchor="_Toc242459796" w:history="1">
             <w:r>
               <w:rPr>
                 <w:rStyle w:val="Hyperlink"/>
@@ -749,7 +749,7 @@
               <w:rPr>
                 <w:noProof/>
               </w:rPr>
-              <w:instrText xml:space="preserve"> PAGEREF _Toc242439983 \h </w:instrText>
+              <w:instrText xml:space="preserve"> PAGEREF _Toc242459796 \h </w:instrText>
             </w:r>
             <w:r>
               <w:rPr>
@@ -766,7 +766,73 @@
               <w:rPr>
                 <w:noProof/>
               </w:rPr>
-              <w:t>11</w:t>
+              <w:t>16</w:t>
+            </w:r>
+            <w:r>
+              <w:rPr>
+                <w:noProof/>
+              </w:rPr>
+              <w:fldChar w:fldCharType="end"/>
+            </w:r>
+          </w:hyperlink>
+        </w:p>
+        <w:p>
+          <w:pPr>
+            <w:pStyle w:val="TOC1"/>
+            <w:tabs>
+              <w:tab w:val="right" w:leader="dot" w:pos="9350"/>
+            </w:tabs>
+            <w:rPr>
+              <w:rFonts w:asciiTheme="minorHAnsi" w:eastAsiaTheme="minorEastAsia" w:hAnsiTheme="minorHAnsi" w:cstheme="minorBidi"/>
+              <w:noProof/>
+              <w:kern w:val="2"/>
+              <w:sz w:val="24"/>
+              <w:szCs w:val="24"/>
+              <w14:ligatures w14:val="standardContextual"/>
+            </w:rPr>
+          </w:pPr>
+          <w:hyperlink w:anchor="_Toc242459797" w:history="1">
+            <w:r>
+              <w:rPr>
+                <w:rStyle w:val="Hyperlink"/>
+                <w:noProof/>
+              </w:rPr>
+              <w:t>4. Design Pattern Explanations</w:t>
+            </w:r>
+            <w:r>
+              <w:rPr>
+                <w:noProof/>
+              </w:rPr>
+              <w:tab/>
+            </w:r>
+            <w:r>
+              <w:rPr>
+                <w:noProof/>
+              </w:rPr>
+              <w:fldChar w:fldCharType="begin"/>
+            </w:r>
+            <w:r>
+              <w:rPr>
+                <w:noProof/>
+              </w:rPr>
+              <w:instrText xml:space="preserve"> PAGEREF _Toc242459797 \h </w:instrText>
+            </w:r>
+            <w:r>
+              <w:rPr>
+                <w:noProof/>
+              </w:rPr>
+            </w:r>
+            <w:r>
+              <w:rPr>
+                <w:noProof/>
+              </w:rPr>
+              <w:fldChar w:fldCharType="separate"/>
+            </w:r>
+            <w:r>
+              <w:rPr>
+                <w:noProof/>
+              </w:rPr>
+              <w:t>25</w:t>
             </w:r>
             <w:r>
               <w:rPr>
@@ -791,13 +857,13 @@
               <w14:ligatures w14:val="standardContextual"/>
             </w:rPr>
           </w:pPr>
-          <w:hyperlink w:anchor="_Toc242439984" w:history="1">
+          <w:hyperlink w:anchor="_Toc242459798" w:history="1">
             <w:r>
               <w:rPr>
                 <w:rStyle w:val="Hyperlink"/>
                 <w:noProof/>
               </w:rPr>
-              <w:t>3.1 Class Summary</w:t>
+              <w:t>4.1 Adapter</w:t>
             </w:r>
             <w:r>
               <w:rPr>
@@ -815,7 +881,7 @@
               <w:rPr>
                 <w:noProof/>
               </w:rPr>
-              <w:instrText xml:space="preserve"> PAGEREF _Toc242439984 \h </w:instrText>
+              <w:instrText xml:space="preserve"> PAGEREF _Toc242459798 \h </w:instrText>
             </w:r>
             <w:r>
               <w:rPr>
@@ -832,7 +898,337 @@
               <w:rPr>
                 <w:noProof/>
               </w:rPr>
-              <w:t>11</w:t>
+              <w:t>25</w:t>
+            </w:r>
+            <w:r>
+              <w:rPr>
+                <w:noProof/>
+              </w:rPr>
+              <w:fldChar w:fldCharType="end"/>
+            </w:r>
+          </w:hyperlink>
+        </w:p>
+        <w:p>
+          <w:pPr>
+            <w:pStyle w:val="TOC2"/>
+            <w:tabs>
+              <w:tab w:val="right" w:leader="dot" w:pos="9350"/>
+            </w:tabs>
+            <w:rPr>
+              <w:rFonts w:asciiTheme="minorHAnsi" w:eastAsiaTheme="minorEastAsia" w:hAnsiTheme="minorHAnsi" w:cstheme="minorBidi"/>
+              <w:noProof/>
+              <w:kern w:val="2"/>
+              <w:sz w:val="24"/>
+              <w:szCs w:val="24"/>
+              <w14:ligatures w14:val="standardContextual"/>
+            </w:rPr>
+          </w:pPr>
+          <w:hyperlink w:anchor="_Toc242459799" w:history="1">
+            <w:r>
+              <w:rPr>
+                <w:rStyle w:val="Hyperlink"/>
+                <w:noProof/>
+              </w:rPr>
+              <w:t>4.2 Command</w:t>
+            </w:r>
+            <w:r>
+              <w:rPr>
+                <w:noProof/>
+              </w:rPr>
+              <w:tab/>
+            </w:r>
+            <w:r>
+              <w:rPr>
+                <w:noProof/>
+              </w:rPr>
+              <w:fldChar w:fldCharType="begin"/>
+            </w:r>
+            <w:r>
+              <w:rPr>
+                <w:noProof/>
+              </w:rPr>
+              <w:instrText xml:space="preserve"> PAGEREF _Toc242459799 \h </w:instrText>
+            </w:r>
+            <w:r>
+              <w:rPr>
+                <w:noProof/>
+              </w:rPr>
+            </w:r>
+            <w:r>
+              <w:rPr>
+                <w:noProof/>
+              </w:rPr>
+              <w:fldChar w:fldCharType="separate"/>
+            </w:r>
+            <w:r>
+              <w:rPr>
+                <w:noProof/>
+              </w:rPr>
+              <w:t>25</w:t>
+            </w:r>
+            <w:r>
+              <w:rPr>
+                <w:noProof/>
+              </w:rPr>
+              <w:fldChar w:fldCharType="end"/>
+            </w:r>
+          </w:hyperlink>
+        </w:p>
+        <w:p>
+          <w:pPr>
+            <w:pStyle w:val="TOC2"/>
+            <w:tabs>
+              <w:tab w:val="right" w:leader="dot" w:pos="9350"/>
+            </w:tabs>
+            <w:rPr>
+              <w:rFonts w:asciiTheme="minorHAnsi" w:eastAsiaTheme="minorEastAsia" w:hAnsiTheme="minorHAnsi" w:cstheme="minorBidi"/>
+              <w:noProof/>
+              <w:kern w:val="2"/>
+              <w:sz w:val="24"/>
+              <w:szCs w:val="24"/>
+              <w14:ligatures w14:val="standardContextual"/>
+            </w:rPr>
+          </w:pPr>
+          <w:hyperlink w:anchor="_Toc242459800" w:history="1">
+            <w:r>
+              <w:rPr>
+                <w:rStyle w:val="Hyperlink"/>
+                <w:noProof/>
+              </w:rPr>
+              <w:t>4.3 Facade</w:t>
+            </w:r>
+            <w:r>
+              <w:rPr>
+                <w:noProof/>
+              </w:rPr>
+              <w:tab/>
+            </w:r>
+            <w:r>
+              <w:rPr>
+                <w:noProof/>
+              </w:rPr>
+              <w:fldChar w:fldCharType="begin"/>
+            </w:r>
+            <w:r>
+              <w:rPr>
+                <w:noProof/>
+              </w:rPr>
+              <w:instrText xml:space="preserve"> PAGEREF _Toc242459800 \h </w:instrText>
+            </w:r>
+            <w:r>
+              <w:rPr>
+                <w:noProof/>
+              </w:rPr>
+            </w:r>
+            <w:r>
+              <w:rPr>
+                <w:noProof/>
+              </w:rPr>
+              <w:fldChar w:fldCharType="separate"/>
+            </w:r>
+            <w:r>
+              <w:rPr>
+                <w:noProof/>
+              </w:rPr>
+              <w:t>26</w:t>
+            </w:r>
+            <w:r>
+              <w:rPr>
+                <w:noProof/>
+              </w:rPr>
+              <w:fldChar w:fldCharType="end"/>
+            </w:r>
+          </w:hyperlink>
+        </w:p>
+        <w:p>
+          <w:pPr>
+            <w:pStyle w:val="TOC2"/>
+            <w:tabs>
+              <w:tab w:val="right" w:leader="dot" w:pos="9350"/>
+            </w:tabs>
+            <w:rPr>
+              <w:rFonts w:asciiTheme="minorHAnsi" w:eastAsiaTheme="minorEastAsia" w:hAnsiTheme="minorHAnsi" w:cstheme="minorBidi"/>
+              <w:noProof/>
+              <w:kern w:val="2"/>
+              <w:sz w:val="24"/>
+              <w:szCs w:val="24"/>
+              <w14:ligatures w14:val="standardContextual"/>
+            </w:rPr>
+          </w:pPr>
+          <w:hyperlink w:anchor="_Toc242459801" w:history="1">
+            <w:r>
+              <w:rPr>
+                <w:rStyle w:val="Hyperlink"/>
+                <w:noProof/>
+              </w:rPr>
+              <w:t>4.4 MVC</w:t>
+            </w:r>
+            <w:r>
+              <w:rPr>
+                <w:noProof/>
+              </w:rPr>
+              <w:tab/>
+            </w:r>
+            <w:r>
+              <w:rPr>
+                <w:noProof/>
+              </w:rPr>
+              <w:fldChar w:fldCharType="begin"/>
+            </w:r>
+            <w:r>
+              <w:rPr>
+                <w:noProof/>
+              </w:rPr>
+              <w:instrText xml:space="preserve"> PAGEREF _Toc242459801 \h </w:instrText>
+            </w:r>
+            <w:r>
+              <w:rPr>
+                <w:noProof/>
+              </w:rPr>
+            </w:r>
+            <w:r>
+              <w:rPr>
+                <w:noProof/>
+              </w:rPr>
+              <w:fldChar w:fldCharType="separate"/>
+            </w:r>
+            <w:r>
+              <w:rPr>
+                <w:noProof/>
+              </w:rPr>
+              <w:t>26</w:t>
+            </w:r>
+            <w:r>
+              <w:rPr>
+                <w:noProof/>
+              </w:rPr>
+              <w:fldChar w:fldCharType="end"/>
+            </w:r>
+          </w:hyperlink>
+        </w:p>
+        <w:p>
+          <w:pPr>
+            <w:pStyle w:val="TOC2"/>
+            <w:tabs>
+              <w:tab w:val="right" w:leader="dot" w:pos="9350"/>
+            </w:tabs>
+            <w:rPr>
+              <w:rFonts w:asciiTheme="minorHAnsi" w:eastAsiaTheme="minorEastAsia" w:hAnsiTheme="minorHAnsi" w:cstheme="minorBidi"/>
+              <w:noProof/>
+              <w:kern w:val="2"/>
+              <w:sz w:val="24"/>
+              <w:szCs w:val="24"/>
+              <w14:ligatures w14:val="standardContextual"/>
+            </w:rPr>
+          </w:pPr>
+          <w:hyperlink w:anchor="_Toc242459802" w:history="1">
+            <w:r>
+              <w:rPr>
+                <w:rStyle w:val="Hyperlink"/>
+                <w:noProof/>
+              </w:rPr>
+              <w:t>4.5 Observer</w:t>
+            </w:r>
+            <w:r>
+              <w:rPr>
+                <w:noProof/>
+              </w:rPr>
+              <w:tab/>
+            </w:r>
+            <w:r>
+              <w:rPr>
+                <w:noProof/>
+              </w:rPr>
+              <w:fldChar w:fldCharType="begin"/>
+            </w:r>
+            <w:r>
+              <w:rPr>
+                <w:noProof/>
+              </w:rPr>
+              <w:instrText xml:space="preserve"> PAGEREF _Toc242459802 \h </w:instrText>
+            </w:r>
+            <w:r>
+              <w:rPr>
+                <w:noProof/>
+              </w:rPr>
+            </w:r>
+            <w:r>
+              <w:rPr>
+                <w:noProof/>
+              </w:rPr>
+              <w:fldChar w:fldCharType="separate"/>
+            </w:r>
+            <w:r>
+              <w:rPr>
+                <w:noProof/>
+              </w:rPr>
+              <w:t>27</w:t>
+            </w:r>
+            <w:r>
+              <w:rPr>
+                <w:noProof/>
+              </w:rPr>
+              <w:fldChar w:fldCharType="end"/>
+            </w:r>
+          </w:hyperlink>
+        </w:p>
+        <w:p>
+          <w:pPr>
+            <w:pStyle w:val="TOC2"/>
+            <w:tabs>
+              <w:tab w:val="right" w:leader="dot" w:pos="9350"/>
+            </w:tabs>
+            <w:rPr>
+              <w:rFonts w:asciiTheme="minorHAnsi" w:eastAsiaTheme="minorEastAsia" w:hAnsiTheme="minorHAnsi" w:cstheme="minorBidi"/>
+              <w:noProof/>
+              <w:kern w:val="2"/>
+              <w:sz w:val="24"/>
+              <w:szCs w:val="24"/>
+              <w14:ligatures w14:val="standardContextual"/>
+            </w:rPr>
+          </w:pPr>
+          <w:hyperlink w:anchor="_Toc242459803" w:history="1">
+            <w:r>
+              <w:rPr>
+                <w:rStyle w:val="Hyperlink"/>
+                <w:noProof/>
+              </w:rPr>
+              <w:t>4.6 Strategy</w:t>
+            </w:r>
+            <w:r>
+              <w:rPr>
+                <w:noProof/>
+              </w:rPr>
+              <w:tab/>
+            </w:r>
+            <w:r>
+              <w:rPr>
+                <w:noProof/>
+              </w:rPr>
+              <w:fldChar w:fldCharType="begin"/>
+            </w:r>
+            <w:r>
+              <w:rPr>
+                <w:noProof/>
+              </w:rPr>
+              <w:instrText xml:space="preserve"> PAGEREF _Toc242459803 \h </w:instrText>
+            </w:r>
+            <w:r>
+              <w:rPr>
+                <w:noProof/>
+              </w:rPr>
+            </w:r>
+            <w:r>
+              <w:rPr>
+                <w:noProof/>
+              </w:rPr>
+              <w:fldChar w:fldCharType="separate"/>
+            </w:r>
+            <w:r>
+              <w:rPr>
+                <w:noProof/>
+              </w:rPr>
+              <w:t>27</w:t>
             </w:r>
             <w:r>
               <w:rPr>
@@ -857,13 +1253,13 @@
               <w14:ligatures w14:val="standardContextual"/>
             </w:rPr>
           </w:pPr>
-          <w:hyperlink w:anchor="_Toc242439985" w:history="1">
+          <w:hyperlink w:anchor="_Toc242459804" w:history="1">
             <w:r>
               <w:rPr>
                 <w:rStyle w:val="Hyperlink"/>
                 <w:noProof/>
               </w:rPr>
-              <w:t>4. Design Pattern Explanations</w:t>
+              <w:t>5. Use-Case Diagram</w:t>
             </w:r>
             <w:r>
               <w:rPr>
@@ -881,7 +1277,7 @@
               <w:rPr>
                 <w:noProof/>
               </w:rPr>
-              <w:instrText xml:space="preserve"> PAGEREF _Toc242439985 \h </w:instrText>
+              <w:instrText xml:space="preserve"> PAGEREF _Toc242459804 \h </w:instrText>
             </w:r>
             <w:r>
               <w:rPr>
@@ -898,7 +1294,7 @@
               <w:rPr>
                 <w:noProof/>
               </w:rPr>
-              <w:t>12</w:t>
+              <w:t>28</w:t>
             </w:r>
             <w:r>
               <w:rPr>
@@ -923,13 +1319,13 @@
               <w14:ligatures w14:val="standardContextual"/>
             </w:rPr>
           </w:pPr>
-          <w:hyperlink w:anchor="_Toc242439986" w:history="1">
+          <w:hyperlink w:anchor="_Toc242459805" w:history="1">
             <w:r>
               <w:rPr>
                 <w:rStyle w:val="Hyperlink"/>
                 <w:noProof/>
               </w:rPr>
-              <w:t>4.1 Pattern 1</w:t>
+              <w:t>5.1 Actors</w:t>
             </w:r>
             <w:r>
               <w:rPr>
@@ -947,7 +1343,7 @@
               <w:rPr>
                 <w:noProof/>
               </w:rPr>
-              <w:instrText xml:space="preserve"> PAGEREF _Toc242439986 \h </w:instrText>
+              <w:instrText xml:space="preserve"> PAGEREF _Toc242459805 \h </w:instrText>
             </w:r>
             <w:r>
               <w:rPr>
@@ -964,7 +1360,73 @@
               <w:rPr>
                 <w:noProof/>
               </w:rPr>
-              <w:t>12</w:t>
+              <w:t>28</w:t>
+            </w:r>
+            <w:r>
+              <w:rPr>
+                <w:noProof/>
+              </w:rPr>
+              <w:fldChar w:fldCharType="end"/>
+            </w:r>
+          </w:hyperlink>
+        </w:p>
+        <w:p>
+          <w:pPr>
+            <w:pStyle w:val="TOC1"/>
+            <w:tabs>
+              <w:tab w:val="right" w:leader="dot" w:pos="9350"/>
+            </w:tabs>
+            <w:rPr>
+              <w:rFonts w:asciiTheme="minorHAnsi" w:eastAsiaTheme="minorEastAsia" w:hAnsiTheme="minorHAnsi" w:cstheme="minorBidi"/>
+              <w:noProof/>
+              <w:kern w:val="2"/>
+              <w:sz w:val="24"/>
+              <w:szCs w:val="24"/>
+              <w14:ligatures w14:val="standardContextual"/>
+            </w:rPr>
+          </w:pPr>
+          <w:hyperlink w:anchor="_Toc242459806" w:history="1">
+            <w:r>
+              <w:rPr>
+                <w:rStyle w:val="Hyperlink"/>
+                <w:noProof/>
+              </w:rPr>
+              <w:t>6. Detailed Use-Case Descriptions</w:t>
+            </w:r>
+            <w:r>
+              <w:rPr>
+                <w:noProof/>
+              </w:rPr>
+              <w:tab/>
+            </w:r>
+            <w:r>
+              <w:rPr>
+                <w:noProof/>
+              </w:rPr>
+              <w:fldChar w:fldCharType="begin"/>
+            </w:r>
+            <w:r>
+              <w:rPr>
+                <w:noProof/>
+              </w:rPr>
+              <w:instrText xml:space="preserve"> PAGEREF _Toc242459806 \h </w:instrText>
+            </w:r>
+            <w:r>
+              <w:rPr>
+                <w:noProof/>
+              </w:rPr>
+            </w:r>
+            <w:r>
+              <w:rPr>
+                <w:noProof/>
+              </w:rPr>
+              <w:fldChar w:fldCharType="separate"/>
+            </w:r>
+            <w:r>
+              <w:rPr>
+                <w:noProof/>
+              </w:rPr>
+              <w:t>29</w:t>
             </w:r>
             <w:r>
               <w:rPr>
@@ -989,13 +1451,13 @@
               <w14:ligatures w14:val="standardContextual"/>
             </w:rPr>
           </w:pPr>
-          <w:hyperlink w:anchor="_Toc242439987" w:history="1">
+          <w:hyperlink w:anchor="_Toc242459807" w:history="1">
             <w:r>
               <w:rPr>
                 <w:rStyle w:val="Hyperlink"/>
                 <w:noProof/>
               </w:rPr>
-              <w:t>4.2 Pattern 2</w:t>
+              <w:t>6.1 UC01</w:t>
             </w:r>
             <w:r>
               <w:rPr>
@@ -1013,7 +1475,7 @@
               <w:rPr>
                 <w:noProof/>
               </w:rPr>
-              <w:instrText xml:space="preserve"> PAGEREF _Toc242439987 \h </w:instrText>
+              <w:instrText xml:space="preserve"> PAGEREF _Toc242459807 \h </w:instrText>
             </w:r>
             <w:r>
               <w:rPr>
@@ -1030,7 +1492,7 @@
               <w:rPr>
                 <w:noProof/>
               </w:rPr>
-              <w:t>12</w:t>
+              <w:t>29</w:t>
             </w:r>
             <w:r>
               <w:rPr>
@@ -1055,13 +1517,13 @@
               <w14:ligatures w14:val="standardContextual"/>
             </w:rPr>
           </w:pPr>
-          <w:hyperlink w:anchor="_Toc242439988" w:history="1">
+          <w:hyperlink w:anchor="_Toc242459808" w:history="1">
             <w:r>
               <w:rPr>
                 <w:rStyle w:val="Hyperlink"/>
                 <w:noProof/>
               </w:rPr>
-              <w:t>4.3 Pattern 3</w:t>
+              <w:t>6.2 UC02</w:t>
             </w:r>
             <w:r>
               <w:rPr>
@@ -1079,7 +1541,7 @@
               <w:rPr>
                 <w:noProof/>
               </w:rPr>
-              <w:instrText xml:space="preserve"> PAGEREF _Toc242439988 \h </w:instrText>
+              <w:instrText xml:space="preserve"> PAGEREF _Toc242459808 \h </w:instrText>
             </w:r>
             <w:r>
               <w:rPr>
@@ -1096,7 +1558,7 @@
               <w:rPr>
                 <w:noProof/>
               </w:rPr>
-              <w:t>12</w:t>
+              <w:t>29</w:t>
             </w:r>
             <w:r>
               <w:rPr>
@@ -1121,13 +1583,13 @@
               <w14:ligatures w14:val="standardContextual"/>
             </w:rPr>
           </w:pPr>
-          <w:hyperlink w:anchor="_Toc242439989" w:history="1">
+          <w:hyperlink w:anchor="_Toc242459809" w:history="1">
             <w:r>
               <w:rPr>
                 <w:rStyle w:val="Hyperlink"/>
                 <w:noProof/>
               </w:rPr>
-              <w:t>4.4 Pattern 4</w:t>
+              <w:t>6.3 UC03</w:t>
             </w:r>
             <w:r>
               <w:rPr>
@@ -1145,7 +1607,7 @@
               <w:rPr>
                 <w:noProof/>
               </w:rPr>
-              <w:instrText xml:space="preserve"> PAGEREF _Toc242439989 \h </w:instrText>
+              <w:instrText xml:space="preserve"> PAGEREF _Toc242459809 \h </w:instrText>
             </w:r>
             <w:r>
               <w:rPr>
@@ -1162,7 +1624,73 @@
               <w:rPr>
                 <w:noProof/>
               </w:rPr>
-              <w:t>13</w:t>
+              <w:t>29</w:t>
+            </w:r>
+            <w:r>
+              <w:rPr>
+                <w:noProof/>
+              </w:rPr>
+              <w:fldChar w:fldCharType="end"/>
+            </w:r>
+          </w:hyperlink>
+        </w:p>
+        <w:p>
+          <w:pPr>
+            <w:pStyle w:val="TOC1"/>
+            <w:tabs>
+              <w:tab w:val="right" w:leader="dot" w:pos="9350"/>
+            </w:tabs>
+            <w:rPr>
+              <w:rFonts w:asciiTheme="minorHAnsi" w:eastAsiaTheme="minorEastAsia" w:hAnsiTheme="minorHAnsi" w:cstheme="minorBidi"/>
+              <w:noProof/>
+              <w:kern w:val="2"/>
+              <w:sz w:val="24"/>
+              <w:szCs w:val="24"/>
+              <w14:ligatures w14:val="standardContextual"/>
+            </w:rPr>
+          </w:pPr>
+          <w:hyperlink w:anchor="_Toc242459810" w:history="1">
+            <w:r>
+              <w:rPr>
+                <w:rStyle w:val="Hyperlink"/>
+                <w:noProof/>
+              </w:rPr>
+              <w:t>7. Sequence Diagrams</w:t>
+            </w:r>
+            <w:r>
+              <w:rPr>
+                <w:noProof/>
+              </w:rPr>
+              <w:tab/>
+            </w:r>
+            <w:r>
+              <w:rPr>
+                <w:noProof/>
+              </w:rPr>
+              <w:fldChar w:fldCharType="begin"/>
+            </w:r>
+            <w:r>
+              <w:rPr>
+                <w:noProof/>
+              </w:rPr>
+              <w:instrText xml:space="preserve"> PAGEREF _Toc242459810 \h </w:instrText>
+            </w:r>
+            <w:r>
+              <w:rPr>
+                <w:noProof/>
+              </w:rPr>
+            </w:r>
+            <w:r>
+              <w:rPr>
+                <w:noProof/>
+              </w:rPr>
+              <w:fldChar w:fldCharType="separate"/>
+            </w:r>
+            <w:r>
+              <w:rPr>
+                <w:noProof/>
+              </w:rPr>
+              <w:t>31</w:t>
             </w:r>
             <w:r>
               <w:rPr>
@@ -1187,13 +1715,13 @@
               <w14:ligatures w14:val="standardContextual"/>
             </w:rPr>
           </w:pPr>
-          <w:hyperlink w:anchor="_Toc242439990" w:history="1">
+          <w:hyperlink w:anchor="_Toc242459811" w:history="1">
             <w:r>
               <w:rPr>
                 <w:rStyle w:val="Hyperlink"/>
                 <w:noProof/>
               </w:rPr>
-              <w:t>4.5 Pattern 5</w:t>
+              <w:t>7.1 SD01</w:t>
             </w:r>
             <w:r>
               <w:rPr>
@@ -1211,7 +1739,7 @@
               <w:rPr>
                 <w:noProof/>
               </w:rPr>
-              <w:instrText xml:space="preserve"> PAGEREF _Toc242439990 \h </w:instrText>
+              <w:instrText xml:space="preserve"> PAGEREF _Toc242459811 \h </w:instrText>
             </w:r>
             <w:r>
               <w:rPr>
@@ -1228,7 +1756,139 @@
               <w:rPr>
                 <w:noProof/>
               </w:rPr>
-              <w:t>13</w:t>
+              <w:t>31</w:t>
+            </w:r>
+            <w:r>
+              <w:rPr>
+                <w:noProof/>
+              </w:rPr>
+              <w:fldChar w:fldCharType="end"/>
+            </w:r>
+          </w:hyperlink>
+        </w:p>
+        <w:p>
+          <w:pPr>
+            <w:pStyle w:val="TOC2"/>
+            <w:tabs>
+              <w:tab w:val="right" w:leader="dot" w:pos="9350"/>
+            </w:tabs>
+            <w:rPr>
+              <w:rFonts w:asciiTheme="minorHAnsi" w:eastAsiaTheme="minorEastAsia" w:hAnsiTheme="minorHAnsi" w:cstheme="minorBidi"/>
+              <w:noProof/>
+              <w:kern w:val="2"/>
+              <w:sz w:val="24"/>
+              <w:szCs w:val="24"/>
+              <w14:ligatures w14:val="standardContextual"/>
+            </w:rPr>
+          </w:pPr>
+          <w:hyperlink w:anchor="_Toc242459812" w:history="1">
+            <w:r>
+              <w:rPr>
+                <w:rStyle w:val="Hyperlink"/>
+                <w:noProof/>
+              </w:rPr>
+              <w:t>7.2 SD02</w:t>
+            </w:r>
+            <w:r>
+              <w:rPr>
+                <w:noProof/>
+              </w:rPr>
+              <w:tab/>
+            </w:r>
+            <w:r>
+              <w:rPr>
+                <w:noProof/>
+              </w:rPr>
+              <w:fldChar w:fldCharType="begin"/>
+            </w:r>
+            <w:r>
+              <w:rPr>
+                <w:noProof/>
+              </w:rPr>
+              <w:instrText xml:space="preserve"> PAGEREF _Toc242459812 \h </w:instrText>
+            </w:r>
+            <w:r>
+              <w:rPr>
+                <w:noProof/>
+              </w:rPr>
+            </w:r>
+            <w:r>
+              <w:rPr>
+                <w:noProof/>
+              </w:rPr>
+              <w:fldChar w:fldCharType="separate"/>
+            </w:r>
+            <w:r>
+              <w:rPr>
+                <w:noProof/>
+              </w:rPr>
+              <w:t>31</w:t>
+            </w:r>
+            <w:r>
+              <w:rPr>
+                <w:noProof/>
+              </w:rPr>
+              <w:fldChar w:fldCharType="end"/>
+            </w:r>
+          </w:hyperlink>
+        </w:p>
+        <w:p>
+          <w:pPr>
+            <w:pStyle w:val="TOC2"/>
+            <w:tabs>
+              <w:tab w:val="right" w:leader="dot" w:pos="9350"/>
+            </w:tabs>
+            <w:rPr>
+              <w:rFonts w:asciiTheme="minorHAnsi" w:eastAsiaTheme="minorEastAsia" w:hAnsiTheme="minorHAnsi" w:cstheme="minorBidi"/>
+              <w:noProof/>
+              <w:kern w:val="2"/>
+              <w:sz w:val="24"/>
+              <w:szCs w:val="24"/>
+              <w14:ligatures w14:val="standardContextual"/>
+            </w:rPr>
+          </w:pPr>
+          <w:hyperlink w:anchor="_Toc242459813" w:history="1">
+            <w:r>
+              <w:rPr>
+                <w:rStyle w:val="Hyperlink"/>
+                <w:noProof/>
+              </w:rPr>
+              <w:t>7.3 SD03</w:t>
+            </w:r>
+            <w:r>
+              <w:rPr>
+                <w:noProof/>
+              </w:rPr>
+              <w:tab/>
+            </w:r>
+            <w:r>
+              <w:rPr>
+                <w:noProof/>
+              </w:rPr>
+              <w:fldChar w:fldCharType="begin"/>
+            </w:r>
+            <w:r>
+              <w:rPr>
+                <w:noProof/>
+              </w:rPr>
+              <w:instrText xml:space="preserve"> PAGEREF _Toc242459813 \h </w:instrText>
+            </w:r>
+            <w:r>
+              <w:rPr>
+                <w:noProof/>
+              </w:rPr>
+            </w:r>
+            <w:r>
+              <w:rPr>
+                <w:noProof/>
+              </w:rPr>
+              <w:fldChar w:fldCharType="separate"/>
+            </w:r>
+            <w:r>
+              <w:rPr>
+                <w:noProof/>
+              </w:rPr>
+              <w:t>31</w:t>
             </w:r>
             <w:r>
               <w:rPr>
@@ -1253,13 +1913,13 @@
               <w14:ligatures w14:val="standardContextual"/>
             </w:rPr>
           </w:pPr>
-          <w:hyperlink w:anchor="_Toc242439991" w:history="1">
+          <w:hyperlink w:anchor="_Toc242459814" w:history="1">
             <w:r>
               <w:rPr>
                 <w:rStyle w:val="Hyperlink"/>
                 <w:noProof/>
               </w:rPr>
-              <w:t>5. Use-Case Diagram</w:t>
+              <w:t>8. Feature-to-Design Traceability Table</w:t>
             </w:r>
             <w:r>
               <w:rPr>
@@ -1277,7 +1937,7 @@
               <w:rPr>
                 <w:noProof/>
               </w:rPr>
-              <w:instrText xml:space="preserve"> PAGEREF _Toc242439991 \h </w:instrText>
+              <w:instrText xml:space="preserve"> PAGEREF _Toc242459814 \h </w:instrText>
             </w:r>
             <w:r>
               <w:rPr>
@@ -1294,7 +1954,73 @@
               <w:rPr>
                 <w:noProof/>
               </w:rPr>
-              <w:t>14</w:t>
+              <w:t>33</w:t>
+            </w:r>
+            <w:r>
+              <w:rPr>
+                <w:noProof/>
+              </w:rPr>
+              <w:fldChar w:fldCharType="end"/>
+            </w:r>
+          </w:hyperlink>
+        </w:p>
+        <w:p>
+          <w:pPr>
+            <w:pStyle w:val="TOC1"/>
+            <w:tabs>
+              <w:tab w:val="right" w:leader="dot" w:pos="9350"/>
+            </w:tabs>
+            <w:rPr>
+              <w:rFonts w:asciiTheme="minorHAnsi" w:eastAsiaTheme="minorEastAsia" w:hAnsiTheme="minorHAnsi" w:cstheme="minorBidi"/>
+              <w:noProof/>
+              <w:kern w:val="2"/>
+              <w:sz w:val="24"/>
+              <w:szCs w:val="24"/>
+              <w14:ligatures w14:val="standardContextual"/>
+            </w:rPr>
+          </w:pPr>
+          <w:hyperlink w:anchor="_Toc242459815" w:history="1">
+            <w:r>
+              <w:rPr>
+                <w:rStyle w:val="Hyperlink"/>
+                <w:noProof/>
+              </w:rPr>
+              <w:t>9. Feature Implementation Explanations</w:t>
+            </w:r>
+            <w:r>
+              <w:rPr>
+                <w:noProof/>
+              </w:rPr>
+              <w:tab/>
+            </w:r>
+            <w:r>
+              <w:rPr>
+                <w:noProof/>
+              </w:rPr>
+              <w:fldChar w:fldCharType="begin"/>
+            </w:r>
+            <w:r>
+              <w:rPr>
+                <w:noProof/>
+              </w:rPr>
+              <w:instrText xml:space="preserve"> PAGEREF _Toc242459815 \h </w:instrText>
+            </w:r>
+            <w:r>
+              <w:rPr>
+                <w:noProof/>
+              </w:rPr>
+            </w:r>
+            <w:r>
+              <w:rPr>
+                <w:noProof/>
+              </w:rPr>
+              <w:fldChar w:fldCharType="separate"/>
+            </w:r>
+            <w:r>
+              <w:rPr>
+                <w:noProof/>
+              </w:rPr>
+              <w:t>35</w:t>
             </w:r>
             <w:r>
               <w:rPr>
@@ -1319,13 +2045,13 @@
               <w14:ligatures w14:val="standardContextual"/>
             </w:rPr>
           </w:pPr>
-          <w:hyperlink w:anchor="_Toc242439992" w:history="1">
+          <w:hyperlink w:anchor="_Toc242459816" w:history="1">
             <w:r>
               <w:rPr>
                 <w:rStyle w:val="Hyperlink"/>
                 <w:noProof/>
               </w:rPr>
-              <w:t>5.1 Actors</w:t>
+              <w:t>F01: Scenario Setup</w:t>
             </w:r>
             <w:r>
               <w:rPr>
@@ -1343,7 +2069,7 @@
               <w:rPr>
                 <w:noProof/>
               </w:rPr>
-              <w:instrText xml:space="preserve"> PAGEREF _Toc242439992 \h </w:instrText>
+              <w:instrText xml:space="preserve"> PAGEREF _Toc242459816 \h </w:instrText>
             </w:r>
             <w:r>
               <w:rPr>
@@ -1360,73 +2086,7 @@
               <w:rPr>
                 <w:noProof/>
               </w:rPr>
-              <w:t>14</w:t>
-            </w:r>
-            <w:r>
-              <w:rPr>
-                <w:noProof/>
-              </w:rPr>
-              <w:fldChar w:fldCharType="end"/>
-            </w:r>
-          </w:hyperlink>
-        </w:p>
-        <w:p>
-          <w:pPr>
-            <w:pStyle w:val="TOC1"/>
-            <w:tabs>
-              <w:tab w:val="right" w:leader="dot" w:pos="9350"/>
-            </w:tabs>
-            <w:rPr>
-              <w:rFonts w:asciiTheme="minorHAnsi" w:eastAsiaTheme="minorEastAsia" w:hAnsiTheme="minorHAnsi" w:cstheme="minorBidi"/>
-              <w:noProof/>
-              <w:kern w:val="2"/>
-              <w:sz w:val="24"/>
-              <w:szCs w:val="24"/>
-              <w14:ligatures w14:val="standardContextual"/>
-            </w:rPr>
-          </w:pPr>
-          <w:hyperlink w:anchor="_Toc242439993" w:history="1">
-            <w:r>
-              <w:rPr>
-                <w:rStyle w:val="Hyperlink"/>
-                <w:noProof/>
-              </w:rPr>
-              <w:t>6. Detailed Use-Case Descriptions</w:t>
-            </w:r>
-            <w:r>
-              <w:rPr>
-                <w:noProof/>
-              </w:rPr>
-              <w:tab/>
-            </w:r>
-            <w:r>
-              <w:rPr>
-                <w:noProof/>
-              </w:rPr>
-              <w:fldChar w:fldCharType="begin"/>
-            </w:r>
-            <w:r>
-              <w:rPr>
-                <w:noProof/>
-              </w:rPr>
-              <w:instrText xml:space="preserve"> PAGEREF _Toc242439993 \h </w:instrText>
-            </w:r>
-            <w:r>
-              <w:rPr>
-                <w:noProof/>
-              </w:rPr>
-            </w:r>
-            <w:r>
-              <w:rPr>
-                <w:noProof/>
-              </w:rPr>
-              <w:fldChar w:fldCharType="separate"/>
-            </w:r>
-            <w:r>
-              <w:rPr>
-                <w:noProof/>
-              </w:rPr>
-              <w:t>15</w:t>
+              <w:t>35</w:t>
             </w:r>
             <w:r>
               <w:rPr>
@@ -1451,13 +2111,13 @@
               <w14:ligatures w14:val="standardContextual"/>
             </w:rPr>
           </w:pPr>
-          <w:hyperlink w:anchor="_Toc242439994" w:history="1">
+          <w:hyperlink w:anchor="_Toc242459817" w:history="1">
             <w:r>
               <w:rPr>
                 <w:rStyle w:val="Hyperlink"/>
                 <w:noProof/>
               </w:rPr>
-              <w:t>6.1 UC01</w:t>
+              <w:t>F02: Lore Entry Management</w:t>
             </w:r>
             <w:r>
               <w:rPr>
@@ -1475,7 +2135,7 @@
               <w:rPr>
                 <w:noProof/>
               </w:rPr>
-              <w:instrText xml:space="preserve"> PAGEREF _Toc242439994 \h </w:instrText>
+              <w:instrText xml:space="preserve"> PAGEREF _Toc242459817 \h </w:instrText>
             </w:r>
             <w:r>
               <w:rPr>
@@ -1492,7 +2152,7 @@
               <w:rPr>
                 <w:noProof/>
               </w:rPr>
-              <w:t>15</w:t>
+              <w:t>35</w:t>
             </w:r>
             <w:r>
               <w:rPr>
@@ -1517,13 +2177,13 @@
               <w14:ligatures w14:val="standardContextual"/>
             </w:rPr>
           </w:pPr>
-          <w:hyperlink w:anchor="_Toc242439995" w:history="1">
+          <w:hyperlink w:anchor="_Toc242459818" w:history="1">
             <w:r>
               <w:rPr>
                 <w:rStyle w:val="Hyperlink"/>
                 <w:noProof/>
               </w:rPr>
-              <w:t>6.2 UC02</w:t>
+              <w:t>F03: Character Management</w:t>
             </w:r>
             <w:r>
               <w:rPr>
@@ -1541,7 +2201,7 @@
               <w:rPr>
                 <w:noProof/>
               </w:rPr>
-              <w:instrText xml:space="preserve"> PAGEREF _Toc242439995 \h </w:instrText>
+              <w:instrText xml:space="preserve"> PAGEREF _Toc242459818 \h </w:instrText>
             </w:r>
             <w:r>
               <w:rPr>
@@ -1558,7 +2218,7 @@
               <w:rPr>
                 <w:noProof/>
               </w:rPr>
-              <w:t>15</w:t>
+              <w:t>35</w:t>
             </w:r>
             <w:r>
               <w:rPr>
@@ -1583,13 +2243,13 @@
               <w14:ligatures w14:val="standardContextual"/>
             </w:rPr>
           </w:pPr>
-          <w:hyperlink w:anchor="_Toc242439996" w:history="1">
+          <w:hyperlink w:anchor="_Toc242459819" w:history="1">
             <w:r>
               <w:rPr>
                 <w:rStyle w:val="Hyperlink"/>
                 <w:noProof/>
               </w:rPr>
-              <w:t>6.3 UC03</w:t>
+              <w:t>F04: Story Turn</w:t>
             </w:r>
             <w:r>
               <w:rPr>
@@ -1607,7 +2267,7 @@
               <w:rPr>
                 <w:noProof/>
               </w:rPr>
-              <w:instrText xml:space="preserve"> PAGEREF _Toc242439996 \h </w:instrText>
+              <w:instrText xml:space="preserve"> PAGEREF _Toc242459819 \h </w:instrText>
             </w:r>
             <w:r>
               <w:rPr>
@@ -1624,73 +2284,7 @@
               <w:rPr>
                 <w:noProof/>
               </w:rPr>
-              <w:t>15</w:t>
-            </w:r>
-            <w:r>
-              <w:rPr>
-                <w:noProof/>
-              </w:rPr>
-              <w:fldChar w:fldCharType="end"/>
-            </w:r>
-          </w:hyperlink>
-        </w:p>
-        <w:p>
-          <w:pPr>
-            <w:pStyle w:val="TOC1"/>
-            <w:tabs>
-              <w:tab w:val="right" w:leader="dot" w:pos="9350"/>
-            </w:tabs>
-            <w:rPr>
-              <w:rFonts w:asciiTheme="minorHAnsi" w:eastAsiaTheme="minorEastAsia" w:hAnsiTheme="minorHAnsi" w:cstheme="minorBidi"/>
-              <w:noProof/>
-              <w:kern w:val="2"/>
-              <w:sz w:val="24"/>
-              <w:szCs w:val="24"/>
-              <w14:ligatures w14:val="standardContextual"/>
-            </w:rPr>
-          </w:pPr>
-          <w:hyperlink w:anchor="_Toc242439997" w:history="1">
-            <w:r>
-              <w:rPr>
-                <w:rStyle w:val="Hyperlink"/>
-                <w:noProof/>
-              </w:rPr>
-              <w:t>7. Sequence Diagrams</w:t>
-            </w:r>
-            <w:r>
-              <w:rPr>
-                <w:noProof/>
-              </w:rPr>
-              <w:tab/>
-            </w:r>
-            <w:r>
-              <w:rPr>
-                <w:noProof/>
-              </w:rPr>
-              <w:fldChar w:fldCharType="begin"/>
-            </w:r>
-            <w:r>
-              <w:rPr>
-                <w:noProof/>
-              </w:rPr>
-              <w:instrText xml:space="preserve"> PAGEREF _Toc242439997 \h </w:instrText>
-            </w:r>
-            <w:r>
-              <w:rPr>
-                <w:noProof/>
-              </w:rPr>
-            </w:r>
-            <w:r>
-              <w:rPr>
-                <w:noProof/>
-              </w:rPr>
-              <w:fldChar w:fldCharType="separate"/>
-            </w:r>
-            <w:r>
-              <w:rPr>
-                <w:noProof/>
-              </w:rPr>
-              <w:t>17</w:t>
+              <w:t>36</w:t>
             </w:r>
             <w:r>
               <w:rPr>
@@ -1715,13 +2309,13 @@
               <w14:ligatures w14:val="standardContextual"/>
             </w:rPr>
           </w:pPr>
-          <w:hyperlink w:anchor="_Toc242439998" w:history="1">
+          <w:hyperlink w:anchor="_Toc242459820" w:history="1">
             <w:r>
               <w:rPr>
                 <w:rStyle w:val="Hyperlink"/>
                 <w:noProof/>
               </w:rPr>
-              <w:t>7.1 SD01</w:t>
+              <w:t>F05: Pivotal Events</w:t>
             </w:r>
             <w:r>
               <w:rPr>
@@ -1739,7 +2333,7 @@
               <w:rPr>
                 <w:noProof/>
               </w:rPr>
-              <w:instrText xml:space="preserve"> PAGEREF _Toc242439998 \h </w:instrText>
+              <w:instrText xml:space="preserve"> PAGEREF _Toc242459820 \h </w:instrText>
             </w:r>
             <w:r>
               <w:rPr>
@@ -1756,7 +2350,7 @@
               <w:rPr>
                 <w:noProof/>
               </w:rPr>
-              <w:t>17</w:t>
+              <w:t>36</w:t>
             </w:r>
             <w:r>
               <w:rPr>
@@ -1781,13 +2375,13 @@
               <w14:ligatures w14:val="standardContextual"/>
             </w:rPr>
           </w:pPr>
-          <w:hyperlink w:anchor="_Toc242439999" w:history="1">
+          <w:hyperlink w:anchor="_Toc242459821" w:history="1">
             <w:r>
               <w:rPr>
                 <w:rStyle w:val="Hyperlink"/>
                 <w:noProof/>
               </w:rPr>
-              <w:t>7.2 SD02</w:t>
+              <w:t>F06: Plot Steering</w:t>
             </w:r>
             <w:r>
               <w:rPr>
@@ -1805,7 +2399,7 @@
               <w:rPr>
                 <w:noProof/>
               </w:rPr>
-              <w:instrText xml:space="preserve"> PAGEREF _Toc242439999 \h </w:instrText>
+              <w:instrText xml:space="preserve"> PAGEREF _Toc242459821 \h </w:instrText>
             </w:r>
             <w:r>
               <w:rPr>
@@ -1822,7 +2416,7 @@
               <w:rPr>
                 <w:noProof/>
               </w:rPr>
-              <w:t>17</w:t>
+              <w:t>36</w:t>
             </w:r>
             <w:r>
               <w:rPr>
@@ -1847,13 +2441,13 @@
               <w14:ligatures w14:val="standardContextual"/>
             </w:rPr>
           </w:pPr>
-          <w:hyperlink w:anchor="_Toc242440000" w:history="1">
+          <w:hyperlink w:anchor="_Toc242459822" w:history="1">
             <w:r>
               <w:rPr>
                 <w:rStyle w:val="Hyperlink"/>
                 <w:noProof/>
               </w:rPr>
-              <w:t>7.3 SD03</w:t>
+              <w:t>F07: Lore Proposals</w:t>
             </w:r>
             <w:r>
               <w:rPr>
@@ -1871,7 +2465,7 @@
               <w:rPr>
                 <w:noProof/>
               </w:rPr>
-              <w:instrText xml:space="preserve"> PAGEREF _Toc242440000 \h </w:instrText>
+              <w:instrText xml:space="preserve"> PAGEREF _Toc242459822 \h </w:instrText>
             </w:r>
             <w:r>
               <w:rPr>
@@ -1888,139 +2482,7 @@
               <w:rPr>
                 <w:noProof/>
               </w:rPr>
-              <w:t>17</w:t>
-            </w:r>
-            <w:r>
-              <w:rPr>
-                <w:noProof/>
-              </w:rPr>
-              <w:fldChar w:fldCharType="end"/>
-            </w:r>
-          </w:hyperlink>
-        </w:p>
-        <w:p>
-          <w:pPr>
-            <w:pStyle w:val="TOC1"/>
-            <w:tabs>
-              <w:tab w:val="right" w:leader="dot" w:pos="9350"/>
-            </w:tabs>
-            <w:rPr>
-              <w:rFonts w:asciiTheme="minorHAnsi" w:eastAsiaTheme="minorEastAsia" w:hAnsiTheme="minorHAnsi" w:cstheme="minorBidi"/>
-              <w:noProof/>
-              <w:kern w:val="2"/>
-              <w:sz w:val="24"/>
-              <w:szCs w:val="24"/>
-              <w14:ligatures w14:val="standardContextual"/>
-            </w:rPr>
-          </w:pPr>
-          <w:hyperlink w:anchor="_Toc242440001" w:history="1">
-            <w:r>
-              <w:rPr>
-                <w:rStyle w:val="Hyperlink"/>
-                <w:noProof/>
-              </w:rPr>
-              <w:t>8. Feature-to-Design Traceability Table</w:t>
-            </w:r>
-            <w:r>
-              <w:rPr>
-                <w:noProof/>
-              </w:rPr>
-              <w:tab/>
-            </w:r>
-            <w:r>
-              <w:rPr>
-                <w:noProof/>
-              </w:rPr>
-              <w:fldChar w:fldCharType="begin"/>
-            </w:r>
-            <w:r>
-              <w:rPr>
-                <w:noProof/>
-              </w:rPr>
-              <w:instrText xml:space="preserve"> PAGEREF _Toc242440001 \h </w:instrText>
-            </w:r>
-            <w:r>
-              <w:rPr>
-                <w:noProof/>
-              </w:rPr>
-            </w:r>
-            <w:r>
-              <w:rPr>
-                <w:noProof/>
-              </w:rPr>
-              <w:fldChar w:fldCharType="separate"/>
-            </w:r>
-            <w:r>
-              <w:rPr>
-                <w:noProof/>
-              </w:rPr>
-              <w:t>19</w:t>
-            </w:r>
-            <w:r>
-              <w:rPr>
-                <w:noProof/>
-              </w:rPr>
-              <w:fldChar w:fldCharType="end"/>
-            </w:r>
-          </w:hyperlink>
-        </w:p>
-        <w:p>
-          <w:pPr>
-            <w:pStyle w:val="TOC1"/>
-            <w:tabs>
-              <w:tab w:val="right" w:leader="dot" w:pos="9350"/>
-            </w:tabs>
-            <w:rPr>
-              <w:rFonts w:asciiTheme="minorHAnsi" w:eastAsiaTheme="minorEastAsia" w:hAnsiTheme="minorHAnsi" w:cstheme="minorBidi"/>
-              <w:noProof/>
-              <w:kern w:val="2"/>
-              <w:sz w:val="24"/>
-              <w:szCs w:val="24"/>
-              <w14:ligatures w14:val="standardContextual"/>
-            </w:rPr>
-          </w:pPr>
-          <w:hyperlink w:anchor="_Toc242440002" w:history="1">
-            <w:r>
-              <w:rPr>
-                <w:rStyle w:val="Hyperlink"/>
-                <w:noProof/>
-              </w:rPr>
-              <w:t>9. Feature Implementation Explanations</w:t>
-            </w:r>
-            <w:r>
-              <w:rPr>
-                <w:noProof/>
-              </w:rPr>
-              <w:tab/>
-            </w:r>
-            <w:r>
-              <w:rPr>
-                <w:noProof/>
-              </w:rPr>
-              <w:fldChar w:fldCharType="begin"/>
-            </w:r>
-            <w:r>
-              <w:rPr>
-                <w:noProof/>
-              </w:rPr>
-              <w:instrText xml:space="preserve"> PAGEREF _Toc242440002 \h </w:instrText>
-            </w:r>
-            <w:r>
-              <w:rPr>
-                <w:noProof/>
-              </w:rPr>
-            </w:r>
-            <w:r>
-              <w:rPr>
-                <w:noProof/>
-              </w:rPr>
-              <w:fldChar w:fldCharType="separate"/>
-            </w:r>
-            <w:r>
-              <w:rPr>
-                <w:noProof/>
-              </w:rPr>
-              <w:t>21</w:t>
+              <w:t>37</w:t>
             </w:r>
             <w:r>
               <w:rPr>
@@ -2045,13 +2507,13 @@
               <w14:ligatures w14:val="standardContextual"/>
             </w:rPr>
           </w:pPr>
-          <w:hyperlink w:anchor="_Toc242440003" w:history="1">
+          <w:hyperlink w:anchor="_Toc242459823" w:history="1">
             <w:r>
               <w:rPr>
                 <w:rStyle w:val="Hyperlink"/>
                 <w:noProof/>
               </w:rPr>
-              <w:t>F01: Scenario Setup</w:t>
+              <w:t>F08: Consistency Check</w:t>
             </w:r>
             <w:r>
               <w:rPr>
@@ -2069,7 +2531,7 @@
               <w:rPr>
                 <w:noProof/>
               </w:rPr>
-              <w:instrText xml:space="preserve"> PAGEREF _Toc242440003 \h </w:instrText>
+              <w:instrText xml:space="preserve"> PAGEREF _Toc242459823 \h </w:instrText>
             </w:r>
             <w:r>
               <w:rPr>
@@ -2086,7 +2548,7 @@
               <w:rPr>
                 <w:noProof/>
               </w:rPr>
-              <w:t>21</w:t>
+              <w:t>37</w:t>
             </w:r>
             <w:r>
               <w:rPr>
@@ -2111,13 +2573,13 @@
               <w14:ligatures w14:val="standardContextual"/>
             </w:rPr>
           </w:pPr>
-          <w:hyperlink w:anchor="_Toc242440004" w:history="1">
+          <w:hyperlink w:anchor="_Toc242459824" w:history="1">
             <w:r>
               <w:rPr>
                 <w:rStyle w:val="Hyperlink"/>
                 <w:noProof/>
               </w:rPr>
-              <w:t>F02: Lore Entry Management</w:t>
+              <w:t>F09: Story Memory Summarization</w:t>
             </w:r>
             <w:r>
               <w:rPr>
@@ -2135,7 +2597,7 @@
               <w:rPr>
                 <w:noProof/>
               </w:rPr>
-              <w:instrText xml:space="preserve"> PAGEREF _Toc242440004 \h </w:instrText>
+              <w:instrText xml:space="preserve"> PAGEREF _Toc242459824 \h </w:instrText>
             </w:r>
             <w:r>
               <w:rPr>
@@ -2152,7 +2614,7 @@
               <w:rPr>
                 <w:noProof/>
               </w:rPr>
-              <w:t>21</w:t>
+              <w:t>37</w:t>
             </w:r>
             <w:r>
               <w:rPr>
@@ -2177,13 +2639,13 @@
               <w14:ligatures w14:val="standardContextual"/>
             </w:rPr>
           </w:pPr>
-          <w:hyperlink w:anchor="_Toc242440005" w:history="1">
+          <w:hyperlink w:anchor="_Toc242459825" w:history="1">
             <w:r>
               <w:rPr>
                 <w:rStyle w:val="Hyperlink"/>
                 <w:noProof/>
               </w:rPr>
-              <w:t>F03: Character Management</w:t>
+              <w:t>F10: Undo / Retry / Edit Turn</w:t>
             </w:r>
             <w:r>
               <w:rPr>
@@ -2201,7 +2663,7 @@
               <w:rPr>
                 <w:noProof/>
               </w:rPr>
-              <w:instrText xml:space="preserve"> PAGEREF _Toc242440005 \h </w:instrText>
+              <w:instrText xml:space="preserve"> PAGEREF _Toc242459825 \h </w:instrText>
             </w:r>
             <w:r>
               <w:rPr>
@@ -2218,7 +2680,7 @@
               <w:rPr>
                 <w:noProof/>
               </w:rPr>
-              <w:t>21</w:t>
+              <w:t>38</w:t>
             </w:r>
             <w:r>
               <w:rPr>
@@ -2243,13 +2705,13 @@
               <w14:ligatures w14:val="standardContextual"/>
             </w:rPr>
           </w:pPr>
-          <w:hyperlink w:anchor="_Toc242440006" w:history="1">
+          <w:hyperlink w:anchor="_Toc242459826" w:history="1">
             <w:r>
               <w:rPr>
                 <w:rStyle w:val="Hyperlink"/>
                 <w:noProof/>
               </w:rPr>
-              <w:t>F04: Story Turn</w:t>
+              <w:t>F11: Save and Load Session</w:t>
             </w:r>
             <w:r>
               <w:rPr>
@@ -2267,7 +2729,7 @@
               <w:rPr>
                 <w:noProof/>
               </w:rPr>
-              <w:instrText xml:space="preserve"> PAGEREF _Toc242440006 \h </w:instrText>
+              <w:instrText xml:space="preserve"> PAGEREF _Toc242459826 \h </w:instrText>
             </w:r>
             <w:r>
               <w:rPr>
@@ -2284,7 +2746,7 @@
               <w:rPr>
                 <w:noProof/>
               </w:rPr>
-              <w:t>22</w:t>
+              <w:t>38</w:t>
             </w:r>
             <w:r>
               <w:rPr>
@@ -2309,13 +2771,13 @@
               <w14:ligatures w14:val="standardContextual"/>
             </w:rPr>
           </w:pPr>
-          <w:hyperlink w:anchor="_Toc242440008" w:history="1">
+          <w:hyperlink w:anchor="_Toc242459827" w:history="1">
             <w:r>
               <w:rPr>
                 <w:rStyle w:val="Hyperlink"/>
                 <w:noProof/>
               </w:rPr>
-              <w:t>F05: Pivotal Events</w:t>
+              <w:t>F12: Ending Generation</w:t>
             </w:r>
             <w:r>
               <w:rPr>
@@ -2333,7 +2795,7 @@
               <w:rPr>
                 <w:noProof/>
               </w:rPr>
-              <w:instrText xml:space="preserve"> PAGEREF _Toc242440008 \h </w:instrText>
+              <w:instrText xml:space="preserve"> PAGEREF _Toc242459827 \h </w:instrText>
             </w:r>
             <w:r>
               <w:rPr>
@@ -2350,469 +2812,7 @@
               <w:rPr>
                 <w:noProof/>
               </w:rPr>
-              <w:t>22</w:t>
-            </w:r>
-            <w:r>
-              <w:rPr>
-                <w:noProof/>
-              </w:rPr>
-              <w:fldChar w:fldCharType="end"/>
-            </w:r>
-          </w:hyperlink>
-        </w:p>
-        <w:p>
-          <w:pPr>
-            <w:pStyle w:val="TOC2"/>
-            <w:tabs>
-              <w:tab w:val="right" w:leader="dot" w:pos="9350"/>
-            </w:tabs>
-            <w:rPr>
-              <w:rFonts w:asciiTheme="minorHAnsi" w:eastAsiaTheme="minorEastAsia" w:hAnsiTheme="minorHAnsi" w:cstheme="minorBidi"/>
-              <w:noProof/>
-              <w:kern w:val="2"/>
-              <w:sz w:val="24"/>
-              <w:szCs w:val="24"/>
-              <w14:ligatures w14:val="standardContextual"/>
-            </w:rPr>
-          </w:pPr>
-          <w:hyperlink w:anchor="_Toc242440009" w:history="1">
-            <w:r>
-              <w:rPr>
-                <w:rStyle w:val="Hyperlink"/>
-                <w:noProof/>
-              </w:rPr>
-              <w:t>F06: Plot Steering</w:t>
-            </w:r>
-            <w:r>
-              <w:rPr>
-                <w:noProof/>
-              </w:rPr>
-              <w:tab/>
-            </w:r>
-            <w:r>
-              <w:rPr>
-                <w:noProof/>
-              </w:rPr>
-              <w:fldChar w:fldCharType="begin"/>
-            </w:r>
-            <w:r>
-              <w:rPr>
-                <w:noProof/>
-              </w:rPr>
-              <w:instrText xml:space="preserve"> PAGEREF _Toc242440009 \h </w:instrText>
-            </w:r>
-            <w:r>
-              <w:rPr>
-                <w:noProof/>
-              </w:rPr>
-            </w:r>
-            <w:r>
-              <w:rPr>
-                <w:noProof/>
-              </w:rPr>
-              <w:fldChar w:fldCharType="separate"/>
-            </w:r>
-            <w:r>
-              <w:rPr>
-                <w:noProof/>
-              </w:rPr>
-              <w:t>23</w:t>
-            </w:r>
-            <w:r>
-              <w:rPr>
-                <w:noProof/>
-              </w:rPr>
-              <w:fldChar w:fldCharType="end"/>
-            </w:r>
-          </w:hyperlink>
-        </w:p>
-        <w:p>
-          <w:pPr>
-            <w:pStyle w:val="TOC2"/>
-            <w:tabs>
-              <w:tab w:val="right" w:leader="dot" w:pos="9350"/>
-            </w:tabs>
-            <w:rPr>
-              <w:rFonts w:asciiTheme="minorHAnsi" w:eastAsiaTheme="minorEastAsia" w:hAnsiTheme="minorHAnsi" w:cstheme="minorBidi"/>
-              <w:noProof/>
-              <w:kern w:val="2"/>
-              <w:sz w:val="24"/>
-              <w:szCs w:val="24"/>
-              <w14:ligatures w14:val="standardContextual"/>
-            </w:rPr>
-          </w:pPr>
-          <w:hyperlink w:anchor="_Toc242440010" w:history="1">
-            <w:r>
-              <w:rPr>
-                <w:rStyle w:val="Hyperlink"/>
-                <w:noProof/>
-              </w:rPr>
-              <w:t>F07: Lore Proposals</w:t>
-            </w:r>
-            <w:r>
-              <w:rPr>
-                <w:noProof/>
-              </w:rPr>
-              <w:tab/>
-            </w:r>
-            <w:r>
-              <w:rPr>
-                <w:noProof/>
-              </w:rPr>
-              <w:fldChar w:fldCharType="begin"/>
-            </w:r>
-            <w:r>
-              <w:rPr>
-                <w:noProof/>
-              </w:rPr>
-              <w:instrText xml:space="preserve"> PAGEREF _Toc242440010 \h </w:instrText>
-            </w:r>
-            <w:r>
-              <w:rPr>
-                <w:noProof/>
-              </w:rPr>
-            </w:r>
-            <w:r>
-              <w:rPr>
-                <w:noProof/>
-              </w:rPr>
-              <w:fldChar w:fldCharType="separate"/>
-            </w:r>
-            <w:r>
-              <w:rPr>
-                <w:noProof/>
-              </w:rPr>
-              <w:t>23</w:t>
-            </w:r>
-            <w:r>
-              <w:rPr>
-                <w:noProof/>
-              </w:rPr>
-              <w:fldChar w:fldCharType="end"/>
-            </w:r>
-          </w:hyperlink>
-        </w:p>
-        <w:p>
-          <w:pPr>
-            <w:pStyle w:val="TOC2"/>
-            <w:tabs>
-              <w:tab w:val="right" w:leader="dot" w:pos="9350"/>
-            </w:tabs>
-            <w:rPr>
-              <w:rFonts w:asciiTheme="minorHAnsi" w:eastAsiaTheme="minorEastAsia" w:hAnsiTheme="minorHAnsi" w:cstheme="minorBidi"/>
-              <w:noProof/>
-              <w:kern w:val="2"/>
-              <w:sz w:val="24"/>
-              <w:szCs w:val="24"/>
-              <w14:ligatures w14:val="standardContextual"/>
-            </w:rPr>
-          </w:pPr>
-          <w:hyperlink w:anchor="_Toc242440011" w:history="1">
-            <w:r>
-              <w:rPr>
-                <w:rStyle w:val="Hyperlink"/>
-                <w:noProof/>
-              </w:rPr>
-              <w:t>F08: Consistency Check</w:t>
-            </w:r>
-            <w:r>
-              <w:rPr>
-                <w:noProof/>
-              </w:rPr>
-              <w:tab/>
-            </w:r>
-            <w:r>
-              <w:rPr>
-                <w:noProof/>
-              </w:rPr>
-              <w:fldChar w:fldCharType="begin"/>
-            </w:r>
-            <w:r>
-              <w:rPr>
-                <w:noProof/>
-              </w:rPr>
-              <w:instrText xml:space="preserve"> PAGEREF _Toc242440011 \h </w:instrText>
-            </w:r>
-            <w:r>
-              <w:rPr>
-                <w:noProof/>
-              </w:rPr>
-            </w:r>
-            <w:r>
-              <w:rPr>
-                <w:noProof/>
-              </w:rPr>
-              <w:fldChar w:fldCharType="separate"/>
-            </w:r>
-            <w:r>
-              <w:rPr>
-                <w:noProof/>
-              </w:rPr>
-              <w:t>23</w:t>
-            </w:r>
-            <w:r>
-              <w:rPr>
-                <w:noProof/>
-              </w:rPr>
-              <w:fldChar w:fldCharType="end"/>
-            </w:r>
-          </w:hyperlink>
-        </w:p>
-        <w:p>
-          <w:pPr>
-            <w:pStyle w:val="TOC2"/>
-            <w:tabs>
-              <w:tab w:val="right" w:leader="dot" w:pos="9350"/>
-            </w:tabs>
-            <w:rPr>
-              <w:rFonts w:asciiTheme="minorHAnsi" w:eastAsiaTheme="minorEastAsia" w:hAnsiTheme="minorHAnsi" w:cstheme="minorBidi"/>
-              <w:noProof/>
-              <w:kern w:val="2"/>
-              <w:sz w:val="24"/>
-              <w:szCs w:val="24"/>
-              <w14:ligatures w14:val="standardContextual"/>
-            </w:rPr>
-          </w:pPr>
-          <w:hyperlink w:anchor="_Toc242440012" w:history="1">
-            <w:r>
-              <w:rPr>
-                <w:rStyle w:val="Hyperlink"/>
-                <w:noProof/>
-              </w:rPr>
-              <w:t>F09: Story Memory Summarization</w:t>
-            </w:r>
-            <w:r>
-              <w:rPr>
-                <w:noProof/>
-              </w:rPr>
-              <w:tab/>
-            </w:r>
-            <w:r>
-              <w:rPr>
-                <w:noProof/>
-              </w:rPr>
-              <w:fldChar w:fldCharType="begin"/>
-            </w:r>
-            <w:r>
-              <w:rPr>
-                <w:noProof/>
-              </w:rPr>
-              <w:instrText xml:space="preserve"> PAGEREF _Toc242440012 \h </w:instrText>
-            </w:r>
-            <w:r>
-              <w:rPr>
-                <w:noProof/>
-              </w:rPr>
-            </w:r>
-            <w:r>
-              <w:rPr>
-                <w:noProof/>
-              </w:rPr>
-              <w:fldChar w:fldCharType="separate"/>
-            </w:r>
-            <w:r>
-              <w:rPr>
-                <w:noProof/>
-              </w:rPr>
-              <w:t>24</w:t>
-            </w:r>
-            <w:r>
-              <w:rPr>
-                <w:noProof/>
-              </w:rPr>
-              <w:fldChar w:fldCharType="end"/>
-            </w:r>
-          </w:hyperlink>
-        </w:p>
-        <w:p>
-          <w:pPr>
-            <w:pStyle w:val="TOC2"/>
-            <w:tabs>
-              <w:tab w:val="right" w:leader="dot" w:pos="9350"/>
-            </w:tabs>
-            <w:rPr>
-              <w:rFonts w:asciiTheme="minorHAnsi" w:eastAsiaTheme="minorEastAsia" w:hAnsiTheme="minorHAnsi" w:cstheme="minorBidi"/>
-              <w:noProof/>
-              <w:kern w:val="2"/>
-              <w:sz w:val="24"/>
-              <w:szCs w:val="24"/>
-              <w14:ligatures w14:val="standardContextual"/>
-            </w:rPr>
-          </w:pPr>
-          <w:hyperlink w:anchor="_Toc242440013" w:history="1">
-            <w:r>
-              <w:rPr>
-                <w:rStyle w:val="Hyperlink"/>
-                <w:noProof/>
-              </w:rPr>
-              <w:t>F10: Undo / Retry / Edit Turn</w:t>
-            </w:r>
-            <w:r>
-              <w:rPr>
-                <w:noProof/>
-              </w:rPr>
-              <w:tab/>
-            </w:r>
-            <w:r>
-              <w:rPr>
-                <w:noProof/>
-              </w:rPr>
-              <w:fldChar w:fldCharType="begin"/>
-            </w:r>
-            <w:r>
-              <w:rPr>
-                <w:noProof/>
-              </w:rPr>
-              <w:instrText xml:space="preserve"> PAGEREF _Toc242440013 \h </w:instrText>
-            </w:r>
-            <w:r>
-              <w:rPr>
-                <w:noProof/>
-              </w:rPr>
-            </w:r>
-            <w:r>
-              <w:rPr>
-                <w:noProof/>
-              </w:rPr>
-              <w:fldChar w:fldCharType="separate"/>
-            </w:r>
-            <w:r>
-              <w:rPr>
-                <w:noProof/>
-              </w:rPr>
-              <w:t>24</w:t>
-            </w:r>
-            <w:r>
-              <w:rPr>
-                <w:noProof/>
-              </w:rPr>
-              <w:fldChar w:fldCharType="end"/>
-            </w:r>
-          </w:hyperlink>
-        </w:p>
-        <w:p>
-          <w:pPr>
-            <w:pStyle w:val="TOC2"/>
-            <w:tabs>
-              <w:tab w:val="right" w:leader="dot" w:pos="9350"/>
-            </w:tabs>
-            <w:rPr>
-              <w:rFonts w:asciiTheme="minorHAnsi" w:eastAsiaTheme="minorEastAsia" w:hAnsiTheme="minorHAnsi" w:cstheme="minorBidi"/>
-              <w:noProof/>
-              <w:kern w:val="2"/>
-              <w:sz w:val="24"/>
-              <w:szCs w:val="24"/>
-              <w14:ligatures w14:val="standardContextual"/>
-            </w:rPr>
-          </w:pPr>
-          <w:hyperlink w:anchor="_Toc242440014" w:history="1">
-            <w:r>
-              <w:rPr>
-                <w:rStyle w:val="Hyperlink"/>
-                <w:noProof/>
-              </w:rPr>
-              <w:t>F11: Save and Load Session</w:t>
-            </w:r>
-            <w:r>
-              <w:rPr>
-                <w:noProof/>
-              </w:rPr>
-              <w:tab/>
-            </w:r>
-            <w:r>
-              <w:rPr>
-                <w:noProof/>
-              </w:rPr>
-              <w:fldChar w:fldCharType="begin"/>
-            </w:r>
-            <w:r>
-              <w:rPr>
-                <w:noProof/>
-              </w:rPr>
-              <w:instrText xml:space="preserve"> PAGEREF _Toc242440014 \h </w:instrText>
-            </w:r>
-            <w:r>
-              <w:rPr>
-                <w:noProof/>
-              </w:rPr>
-            </w:r>
-            <w:r>
-              <w:rPr>
-                <w:noProof/>
-              </w:rPr>
-              <w:fldChar w:fldCharType="separate"/>
-            </w:r>
-            <w:r>
-              <w:rPr>
-                <w:noProof/>
-              </w:rPr>
-              <w:t>24</w:t>
-            </w:r>
-            <w:r>
-              <w:rPr>
-                <w:noProof/>
-              </w:rPr>
-              <w:fldChar w:fldCharType="end"/>
-            </w:r>
-          </w:hyperlink>
-        </w:p>
-        <w:p>
-          <w:pPr>
-            <w:pStyle w:val="TOC2"/>
-            <w:tabs>
-              <w:tab w:val="right" w:leader="dot" w:pos="9350"/>
-            </w:tabs>
-            <w:rPr>
-              <w:rFonts w:asciiTheme="minorHAnsi" w:eastAsiaTheme="minorEastAsia" w:hAnsiTheme="minorHAnsi" w:cstheme="minorBidi"/>
-              <w:noProof/>
-              <w:kern w:val="2"/>
-              <w:sz w:val="24"/>
-              <w:szCs w:val="24"/>
-              <w14:ligatures w14:val="standardContextual"/>
-            </w:rPr>
-          </w:pPr>
-          <w:hyperlink w:anchor="_Toc242440015" w:history="1">
-            <w:r>
-              <w:rPr>
-                <w:rStyle w:val="Hyperlink"/>
-                <w:noProof/>
-              </w:rPr>
-              <w:t>F12: Ending Generation</w:t>
-            </w:r>
-            <w:r>
-              <w:rPr>
-                <w:noProof/>
-              </w:rPr>
-              <w:tab/>
-            </w:r>
-            <w:r>
-              <w:rPr>
-                <w:noProof/>
-              </w:rPr>
-              <w:fldChar w:fldCharType="begin"/>
-            </w:r>
-            <w:r>
-              <w:rPr>
-                <w:noProof/>
-              </w:rPr>
-              <w:instrText xml:space="preserve"> PAGEREF _Toc242440015 \h </w:instrText>
-            </w:r>
-            <w:r>
-              <w:rPr>
-                <w:noProof/>
-              </w:rPr>
-            </w:r>
-            <w:r>
-              <w:rPr>
-                <w:noProof/>
-              </w:rPr>
-              <w:fldChar w:fldCharType="separate"/>
-            </w:r>
-            <w:r>
-              <w:rPr>
-                <w:noProof/>
-              </w:rPr>
-              <w:t>25</w:t>
+              <w:t>38</w:t>
             </w:r>
             <w:r>
               <w:rPr>
@@ -2834,7 +2834,7 @@
         <w:pStyle w:val="Heading1"/>
         <w:pageBreakBefore/>
       </w:pPr>
-      <w:bookmarkStart w:id="0" w:name="_Toc242439974"/>
+      <w:bookmarkStart w:id="0" w:name="_Toc242459787"/>
       <w:r>
         <w:lastRenderedPageBreak/>
         <w:t>1. Project Overview</w:t>
@@ -2846,7 +2846,7 @@
         <w:pStyle w:val="Heading2"/>
         <w:keepNext/>
       </w:pPr>
-      <w:bookmarkStart w:id="1" w:name="_Toc242439975"/>
+      <w:bookmarkStart w:id="1" w:name="_Toc242459788"/>
       <w:r>
         <w:t>1.1 Problem and Motivation</w:t>
       </w:r>
@@ -2886,7 +2886,7 @@
         <w:pStyle w:val="Heading2"/>
         <w:keepNext/>
       </w:pPr>
-      <w:bookmarkStart w:id="2" w:name="_Toc242439976"/>
+      <w:bookmarkStart w:id="2" w:name="_Toc242459789"/>
       <w:r>
         <w:t>1.2 Target Users</w:t>
       </w:r>
@@ -2905,7 +2905,7 @@
         <w:pStyle w:val="Heading2"/>
         <w:keepNext/>
       </w:pPr>
-      <w:bookmarkStart w:id="3" w:name="_Toc242439977"/>
+      <w:bookmarkStart w:id="3" w:name="_Toc242459790"/>
       <w:r>
         <w:t>1.3 Agent Description</w:t>
       </w:r>
@@ -2994,7 +2994,6 @@
         </w:rPr>
         <w:t>gent?</w:t>
       </w:r>
-      <w:bookmarkStart w:id="4" w:name="_Toc242439978"/>
     </w:p>
     <w:p>
       <w:pPr>
@@ -3019,10 +3018,10 @@
         <w:pStyle w:val="Heading2"/>
         <w:keepNext/>
       </w:pPr>
+      <w:bookmarkStart w:id="4" w:name="_Toc242459791"/>
       <w:r>
         <w:t>1.4 AI/LLM Model(s)</w:t>
       </w:r>
-      <w:bookmarkStart w:id="5" w:name="_Toc242439979"/>
       <w:bookmarkEnd w:id="4"/>
     </w:p>
     <w:p>
@@ -3178,6 +3177,7 @@
         <w:pStyle w:val="Heading2"/>
         <w:keepNext/>
       </w:pPr>
+      <w:bookmarkStart w:id="5" w:name="_Toc242459792"/>
       <w:r>
         <w:lastRenderedPageBreak/>
         <w:t>1.5 Overall Architecture</w:t>
@@ -3678,7 +3678,7 @@
         <w:pStyle w:val="Heading1"/>
         <w:pageBreakBefore/>
       </w:pPr>
-      <w:bookmarkStart w:id="6" w:name="_Toc242439980"/>
+      <w:bookmarkStart w:id="6" w:name="_Toc242459793"/>
       <w:r>
         <w:lastRenderedPageBreak/>
         <w:t>2. Detailed Feature Specifications</w:t>
@@ -3690,7 +3690,7 @@
         <w:pStyle w:val="Heading2"/>
         <w:keepNext/>
       </w:pPr>
-      <w:bookmarkStart w:id="7" w:name="_Toc242439981"/>
+      <w:bookmarkStart w:id="7" w:name="_Toc242459794"/>
       <w:r>
         <w:t>2.1 Feature Summary</w:t>
       </w:r>
@@ -4673,7 +4673,6 @@
           <w:szCs w:val="26"/>
         </w:rPr>
       </w:pPr>
-      <w:bookmarkStart w:id="8" w:name="_Toc242439982"/>
       <w:r>
         <w:br w:type="page"/>
       </w:r>
@@ -4683,6 +4682,7 @@
         <w:pStyle w:val="Heading2"/>
         <w:keepNext/>
       </w:pPr>
+      <w:bookmarkStart w:id="8" w:name="_Toc242459795"/>
       <w:r>
         <w:lastRenderedPageBreak/>
         <w:t>2.2 Feature Details</w:t>
@@ -6726,12 +6726,12 @@
           </w:tcPr>
           <w:p>
             <w:r>
-              <w:t xml:space="preserve">Used from the main story screen. A text box under the story takes the user’s input, with a selector for the mode (Do, Say or Story) and a send button. The agent’s narration is added to the story above it.</w:t>
-            </w:r>
-          </w:p>
-          <w:p>
-            <w:r>
-              <w:t xml:space="preserve">After a turn, the lore entries the agent drew on are listed under that turn’s narration, and clicking one opens it in the Lore panel.</w:t>
+              <w:t>Used from the main story screen. A text box under the story takes the user’s input, with a selector for the mode (Do, Say or Story) and a send button. The agent’s narration is added to the story above it.</w:t>
+            </w:r>
+          </w:p>
+          <w:p>
+            <w:r>
+              <w:t>After a turn, the lore entries the agent drew on are listed under that turn’s narration, and clicking one opens it in the Lore panel.</w:t>
             </w:r>
           </w:p>
         </w:tc>
@@ -6844,17 +6844,17 @@
           </w:tcPr>
           <w:p>
             <w:r>
-              <w:t xml:space="preserve">A new turn added to the story, holding the user’s input and the agent’s narration.</w:t>
-            </w:r>
-          </w:p>
-          <w:p>
-            <w:r>
-              <w:t xml:space="preserve">A record on the turn of which lore entries were used.</w:t>
-            </w:r>
-          </w:p>
-          <w:p>
-            <w:r>
-              <w:t xml:space="preserve">Any consistency warnings (F08) and lore proposals (F07) raised during the turn.</w:t>
+              <w:t>A new turn added to the story, holding the user’s input and the agent’s narration.</w:t>
+            </w:r>
+          </w:p>
+          <w:p>
+            <w:r>
+              <w:t>A record on the turn of which lore entries were used.</w:t>
+            </w:r>
+          </w:p>
+          <w:p>
+            <w:r>
+              <w:t>Any consistency warnings (F08) and lore proposals (F07) raised during the turn.</w:t>
             </w:r>
           </w:p>
         </w:tc>
@@ -6962,7 +6962,7 @@
           </w:tcPr>
           <w:p>
             <w:r>
-              <w:t xml:space="preserve">Input and mode are submitted, the input is framed according to the mode, the agent looks up the relevant lore entries and characters through tool calls that the application validates and runs, the agent draws on the story summary (F09) and checks the pivotal events (F06), the agent writes the narration, the narration is checked for consistency (F08), the turn is saved with the lore entries it used, the story display refreshes.</w:t>
+              <w:t>Input and mode are submitted, the input is framed according to the mode, the agent looks up the relevant lore entries and characters through tool calls that the application validates and runs, the agent draws on the story summary (F09) and checks the pivotal events (F06), the agent writes the narration, the narration is checked for consistency (F08), the turn is saved with the lore entries it used, the story display refreshes.</w:t>
             </w:r>
           </w:p>
         </w:tc>
@@ -7016,32 +7016,32 @@
           </w:tcPr>
           <w:p>
             <w:r>
-              <w:t xml:space="preserve">Empty input: show a message; nothing is sent.</w:t>
-            </w:r>
-          </w:p>
-          <w:p>
-            <w:r>
-              <w:t xml:space="preserve">Agent declines: show a message; no turn is added and the user can rephrase.</w:t>
-            </w:r>
-          </w:p>
-          <w:p>
-            <w:r>
-              <w:t xml:space="preserve">Failed model call: show a message; no turn is added and the input stays in the text box so it can be resent.</w:t>
-            </w:r>
-          </w:p>
-          <w:p>
-            <w:r>
-              <w:t xml:space="preserve">Nothing relevant found in the lore: the agent continues without it and the used-entries list is empty.</w:t>
-            </w:r>
-          </w:p>
-          <w:p>
-            <w:r>
-              <w:t xml:space="preserve">Invalid tool request: the application rejects it and reports the error back to the agent.</w:t>
-            </w:r>
-          </w:p>
-          <w:p>
-            <w:r>
-              <w:t xml:space="preserve">No story open: the input box is unavailable.</w:t>
+              <w:t>Empty input: show a message; nothing is sent.</w:t>
+            </w:r>
+          </w:p>
+          <w:p>
+            <w:r>
+              <w:t>Agent declines: show a message; no turn is added and the user can rephrase.</w:t>
+            </w:r>
+          </w:p>
+          <w:p>
+            <w:r>
+              <w:t>Failed model call: show a message; no turn is added and the input stays in the text box so it can be resent.</w:t>
+            </w:r>
+          </w:p>
+          <w:p>
+            <w:r>
+              <w:t>Nothing relevant found in the lore: the agent continues without it and the used-entries list is empty.</w:t>
+            </w:r>
+          </w:p>
+          <w:p>
+            <w:r>
+              <w:t>Invalid tool request: the application rejects it and reports the error back to the agent.</w:t>
+            </w:r>
+          </w:p>
+          <w:p>
+            <w:r>
+              <w:t>No story open: the input box is unavailable.</w:t>
             </w:r>
           </w:p>
         </w:tc>
@@ -7223,6 +7223,7 @@
                 <w:b/>
                 <w:bCs/>
               </w:rPr>
+              <w:lastRenderedPageBreak/>
               <w:t>User Interaction (GUI)</w:t>
             </w:r>
           </w:p>
@@ -7657,7 +7658,6 @@
                 <w:b/>
                 <w:bCs/>
               </w:rPr>
-              <w:lastRenderedPageBreak/>
               <w:t>Description</w:t>
             </w:r>
           </w:p>
@@ -7987,6 +7987,7 @@
                 <w:b/>
                 <w:bCs/>
               </w:rPr>
+              <w:lastRenderedPageBreak/>
               <w:t>Error / Alternative Cases</w:t>
             </w:r>
           </w:p>
@@ -8426,7 +8427,6 @@
                 <w:b/>
                 <w:bCs/>
               </w:rPr>
-              <w:lastRenderedPageBreak/>
               <w:t>Expected Workflow</w:t>
             </w:r>
           </w:p>
@@ -8748,6 +8748,7 @@
                 <w:b/>
                 <w:bCs/>
               </w:rPr>
+              <w:lastRenderedPageBreak/>
               <w:t>Input</w:t>
             </w:r>
           </w:p>
@@ -9133,7 +9134,6 @@
                 <w:b/>
                 <w:bCs/>
               </w:rPr>
-              <w:lastRenderedPageBreak/>
               <w:t>Description</w:t>
             </w:r>
           </w:p>
@@ -9517,6 +9517,7 @@
         <w:keepNext/>
       </w:pPr>
       <w:r>
+        <w:lastRenderedPageBreak/>
         <w:t>F10: Undo / Retry / Edit Turn</w:t>
       </w:r>
     </w:p>
@@ -9971,7 +9972,6 @@
                 <w:b/>
                 <w:bCs/>
               </w:rPr>
-              <w:lastRenderedPageBreak/>
               <w:t>Error / Alternative Cases</w:t>
             </w:r>
           </w:p>
@@ -10416,6 +10416,7 @@
                 <w:b/>
                 <w:bCs/>
               </w:rPr>
+              <w:lastRenderedPageBreak/>
               <w:t>Expected Workflow</w:t>
             </w:r>
           </w:p>
@@ -10747,7 +10748,6 @@
                 <w:b/>
                 <w:bCs/>
               </w:rPr>
-              <w:lastRenderedPageBreak/>
               <w:t>Input</w:t>
             </w:r>
           </w:p>
@@ -11029,7 +11029,7 @@
         <w:pStyle w:val="Heading1"/>
         <w:pageBreakBefore/>
       </w:pPr>
-      <w:bookmarkStart w:id="9" w:name="_Toc242439983"/>
+      <w:bookmarkStart w:id="9" w:name="_Toc242459796"/>
       <w:r>
         <w:lastRenderedPageBreak/>
         <w:t>3. UML Class Diagram</w:t>
@@ -11047,7 +11047,7 @@
           <w:noProof/>
         </w:rPr>
         <w:drawing>
-          <wp:inline distT="0" distB="0" distL="0" distR="0" wp14:anchorId="4F2BF98D" wp14:editId="651188C9">
+          <wp:inline distT="0" distB="0" distL="0" distR="0" wp14:anchorId="67B61007" wp14:editId="4E91C272">
             <wp:extent cx="7717536" cy="4982760"/>
             <wp:effectExtent l="0" t="0" r="0" b="0"/>
             <wp:docPr id="901" name="Class diagram figure 1" descr="Class diagram overview: all classes by name, with every relationship. Attributes and methods are shown in Figures 2 to 9."/>
@@ -11135,7 +11135,7 @@
         </w:rPr>
         <w:lastRenderedPageBreak/>
         <w:drawing>
-          <wp:inline distT="0" distB="0" distL="0" distR="0" wp14:anchorId="6CB97CCE" wp14:editId="22F5D95B">
+          <wp:inline distT="0" distB="0" distL="0" distR="0" wp14:anchorId="48DD6A74" wp14:editId="7149B237">
             <wp:extent cx="5943600" cy="3055749"/>
             <wp:effectExtent l="0" t="0" r="0" b="0"/>
             <wp:docPr id="902" name="Class diagram figure 2" descr="Package ui: the two front ends and the observer interface they implement."/>
@@ -11198,7 +11198,7 @@
         </w:rPr>
         <w:lastRenderedPageBreak/>
         <w:drawing>
-          <wp:inline distT="0" distB="0" distL="0" distR="0" wp14:anchorId="4CA04EE6" wp14:editId="3CFFBB66">
+          <wp:inline distT="0" distB="0" distL="0" distR="0" wp14:anchorId="3346CC29" wp14:editId="3E131530">
             <wp:extent cx="3840480" cy="7319300"/>
             <wp:effectExtent l="0" t="0" r="0" b="0"/>
             <wp:docPr id="903" name="Class diagram figure 3" descr="Package controller: the single entry point and the undoable commands."/>
@@ -11268,7 +11268,7 @@
         </w:rPr>
         <w:lastRenderedPageBreak/>
         <w:drawing>
-          <wp:inline distT="0" distB="0" distL="0" distR="0" wp14:anchorId="39C51CD5" wp14:editId="59EFFCFB">
+          <wp:inline distT="0" distB="0" distL="0" distR="0" wp14:anchorId="7D20B989" wp14:editId="6B7ABA92">
             <wp:extent cx="7589520" cy="5151120"/>
             <wp:effectExtent l="0" t="0" r="0" b="0"/>
             <wp:docPr id="904" name="Class diagram figure 4" descr="Package model, part 1: the session, its turns, and lore."/>
@@ -11338,7 +11338,7 @@
         </w:rPr>
         <w:lastRenderedPageBreak/>
         <w:drawing>
-          <wp:inline distT="0" distB="0" distL="0" distR="0" wp14:anchorId="66C90EB6" wp14:editId="4A463AAD">
+          <wp:inline distT="0" distB="0" distL="0" distR="0" wp14:anchorId="5E547257" wp14:editId="68B364D2">
             <wp:extent cx="5760720" cy="5192761"/>
             <wp:effectExtent l="0" t="0" r="0" b="0"/>
             <wp:docPr id="905" name="Class diagram figure 5" descr="Package model, part 2: characters and the hidden pivotal events. StorySession is detailed in Figure 4."/>
@@ -11408,7 +11408,7 @@
         </w:rPr>
         <w:lastRenderedPageBreak/>
         <w:drawing>
-          <wp:inline distT="0" distB="0" distL="0" distR="0" wp14:anchorId="0345E188" wp14:editId="2AE9DA5A">
+          <wp:inline distT="0" distB="0" distL="0" distR="0" wp14:anchorId="452FB7BC" wp14:editId="52A89345">
             <wp:extent cx="8229600" cy="4281334"/>
             <wp:effectExtent l="0" t="0" r="0" b="0"/>
             <wp:docPr id="906" name="Class diagram figure 6" descr="Package agent: the facade, its subsystem classes, and the input-mode strategies."/>
@@ -11471,7 +11471,7 @@
         </w:rPr>
         <w:lastRenderedPageBreak/>
         <w:drawing>
-          <wp:inline distT="0" distB="0" distL="0" distR="0" wp14:anchorId="686A6E29" wp14:editId="561105F7">
+          <wp:inline distT="0" distB="0" distL="0" distR="0" wp14:anchorId="28268E17" wp14:editId="6A25E1E4">
             <wp:extent cx="8229600" cy="3514298"/>
             <wp:effectExtent l="0" t="0" r="0" b="0"/>
             <wp:docPr id="907" name="Class diagram figure 7" descr="Package agent.tools: the operations the model may request."/>
@@ -11534,7 +11534,7 @@
         </w:rPr>
         <w:lastRenderedPageBreak/>
         <w:drawing>
-          <wp:inline distT="0" distB="0" distL="0" distR="0" wp14:anchorId="661EC439" wp14:editId="455AA356">
+          <wp:inline distT="0" distB="0" distL="0" distR="0" wp14:anchorId="4A57EA5A" wp14:editId="29C66892">
             <wp:extent cx="8229600" cy="4388598"/>
             <wp:effectExtent l="0" t="0" r="0" b="0"/>
             <wp:docPr id="908" name="Class diagram figure 8" descr="Package llm: the client interface, the adapter for Claude, and the test double."/>
@@ -11604,7 +11604,7 @@
         </w:rPr>
         <w:lastRenderedPageBreak/>
         <w:drawing>
-          <wp:inline distT="0" distB="0" distL="0" distR="0" wp14:anchorId="4138F1E9" wp14:editId="40A53F0D">
+          <wp:inline distT="0" distB="0" distL="0" distR="0" wp14:anchorId="3BA675C4" wp14:editId="7C00BA0A">
             <wp:extent cx="5669280" cy="1769271"/>
             <wp:effectExtent l="0" t="0" r="0" b="0"/>
             <wp:docPr id="909" name="Class diagram figure 9" descr="Package persistence: saving and loading sessions."/>
@@ -11657,679 +11657,34 @@
     </w:p>
     <w:p>
       <w:pPr>
+        <w:pStyle w:val="Heading1"/>
+        <w:pageBreakBefore/>
+      </w:pPr>
+      <w:bookmarkStart w:id="10" w:name="_Toc242459797"/>
+      <w:r>
+        <w:lastRenderedPageBreak/>
+        <w:t>4. Design Pattern Explanations</w:t>
+      </w:r>
+      <w:bookmarkEnd w:id="10"/>
+    </w:p>
+    <w:p>
+      <w:pPr>
+        <w:spacing w:after="120"/>
+      </w:pPr>
+      <w:r>
+        <w:t>This project will use six design patterns: Adapter, Command, Facade, MVC, Observer and Strategy. The role each class plays in a pattern is marked under its name in Figures 2 to 9.</w:t>
+      </w:r>
+    </w:p>
+    <w:p>
+      <w:pPr>
         <w:pStyle w:val="Heading2"/>
         <w:keepNext/>
       </w:pPr>
-      <w:bookmarkStart w:id="10" w:name="_Toc242439984"/>
-      <w:r>
-        <w:t>3.1 Class Summary</w:t>
-      </w:r>
-      <w:bookmarkEnd w:id="10"/>
-    </w:p>
-    <w:p>
-      <w:pPr>
-        <w:spacing w:after="120"/>
-      </w:pPr>
-      <w:r>
-        <w:t>Name each class once here and reuse the exact names in the sequence diagrams, traceability table and feature explanations.</w:t>
-      </w:r>
-    </w:p>
-    <w:tbl>
-      <w:tblPr>
-        <w:tblW w:w="9360" w:type="dxa"/>
-        <w:tblBorders>
-          <w:top w:val="single" w:sz="4" w:space="0" w:color="auto"/>
-          <w:left w:val="single" w:sz="4" w:space="0" w:color="auto"/>
-          <w:bottom w:val="single" w:sz="4" w:space="0" w:color="auto"/>
-          <w:right w:val="single" w:sz="4" w:space="0" w:color="auto"/>
-          <w:insideH w:val="single" w:sz="4" w:space="0" w:color="auto"/>
-          <w:insideV w:val="single" w:sz="4" w:space="0" w:color="auto"/>
-        </w:tblBorders>
-        <w:tblCellMar>
-          <w:left w:w="10" w:type="dxa"/>
-          <w:right w:w="10" w:type="dxa"/>
-        </w:tblCellMar>
-        <w:tblLook w:val="0000" w:firstRow="0" w:lastRow="0" w:firstColumn="0" w:lastColumn="0" w:noHBand="0" w:noVBand="0"/>
-      </w:tblPr>
-      <w:tblGrid>
-        <w:gridCol w:w="2800"/>
-        <w:gridCol w:w="1800"/>
-        <w:gridCol w:w="4760"/>
-      </w:tblGrid>
-      <w:tr>
-        <w:trPr>
-          <w:cantSplit/>
-          <w:tblHeader/>
-        </w:trPr>
-        <w:tc>
-          <w:tcPr>
-            <w:tcW w:w="2800" w:type="dxa"/>
-            <w:tcBorders>
-              <w:top w:val="single" w:sz="4" w:space="0" w:color="BFBFBF"/>
-              <w:left w:val="single" w:sz="4" w:space="0" w:color="BFBFBF"/>
-              <w:bottom w:val="single" w:sz="4" w:space="0" w:color="BFBFBF"/>
-              <w:right w:val="single" w:sz="4" w:space="0" w:color="BFBFBF"/>
-            </w:tcBorders>
-            <w:shd w:val="clear" w:color="auto" w:fill="E7E6E6"/>
-            <w:tcMar>
-              <w:top w:w="70" w:type="dxa"/>
-              <w:left w:w="110" w:type="dxa"/>
-              <w:bottom w:w="70" w:type="dxa"/>
-              <w:right w:w="110" w:type="dxa"/>
-            </w:tcMar>
-          </w:tcPr>
-          <w:p>
-            <w:r>
-              <w:rPr>
-                <w:b/>
-                <w:bCs/>
-              </w:rPr>
-              <w:t>Class / Interface</w:t>
-            </w:r>
-          </w:p>
-        </w:tc>
-        <w:tc>
-          <w:tcPr>
-            <w:tcW w:w="1800" w:type="dxa"/>
-            <w:tcBorders>
-              <w:top w:val="single" w:sz="4" w:space="0" w:color="BFBFBF"/>
-              <w:left w:val="single" w:sz="4" w:space="0" w:color="BFBFBF"/>
-              <w:bottom w:val="single" w:sz="4" w:space="0" w:color="BFBFBF"/>
-              <w:right w:val="single" w:sz="4" w:space="0" w:color="BFBFBF"/>
-            </w:tcBorders>
-            <w:shd w:val="clear" w:color="auto" w:fill="E7E6E6"/>
-            <w:tcMar>
-              <w:top w:w="70" w:type="dxa"/>
-              <w:left w:w="110" w:type="dxa"/>
-              <w:bottom w:w="70" w:type="dxa"/>
-              <w:right w:w="110" w:type="dxa"/>
-            </w:tcMar>
-          </w:tcPr>
-          <w:p>
-            <w:r>
-              <w:rPr>
-                <w:b/>
-                <w:bCs/>
-              </w:rPr>
-              <w:t>Layer</w:t>
-            </w:r>
-          </w:p>
-        </w:tc>
-        <w:tc>
-          <w:tcPr>
-            <w:tcW w:w="4760" w:type="dxa"/>
-            <w:tcBorders>
-              <w:top w:val="single" w:sz="4" w:space="0" w:color="BFBFBF"/>
-              <w:left w:val="single" w:sz="4" w:space="0" w:color="BFBFBF"/>
-              <w:bottom w:val="single" w:sz="4" w:space="0" w:color="BFBFBF"/>
-              <w:right w:val="single" w:sz="4" w:space="0" w:color="BFBFBF"/>
-            </w:tcBorders>
-            <w:shd w:val="clear" w:color="auto" w:fill="E7E6E6"/>
-            <w:tcMar>
-              <w:top w:w="70" w:type="dxa"/>
-              <w:left w:w="110" w:type="dxa"/>
-              <w:bottom w:w="70" w:type="dxa"/>
-              <w:right w:w="110" w:type="dxa"/>
-            </w:tcMar>
-          </w:tcPr>
-          <w:p>
-            <w:r>
-              <w:rPr>
-                <w:b/>
-                <w:bCs/>
-              </w:rPr>
-              <w:t>Responsibility</w:t>
-            </w:r>
-          </w:p>
-        </w:tc>
-      </w:tr>
-      <w:tr>
-        <w:trPr>
-          <w:cantSplit/>
-        </w:trPr>
-        <w:tc>
-          <w:tcPr>
-            <w:tcW w:w="2800" w:type="dxa"/>
-            <w:tcBorders>
-              <w:top w:val="single" w:sz="4" w:space="0" w:color="BFBFBF"/>
-              <w:left w:val="single" w:sz="4" w:space="0" w:color="BFBFBF"/>
-              <w:bottom w:val="single" w:sz="4" w:space="0" w:color="BFBFBF"/>
-              <w:right w:val="single" w:sz="4" w:space="0" w:color="BFBFBF"/>
-            </w:tcBorders>
-            <w:tcMar>
-              <w:top w:w="70" w:type="dxa"/>
-              <w:left w:w="110" w:type="dxa"/>
-              <w:bottom w:w="70" w:type="dxa"/>
-              <w:right w:w="110" w:type="dxa"/>
-            </w:tcMar>
-          </w:tcPr>
-          <w:p>
-            <w:r>
-              <w:rPr>
-                <w:i/>
-                <w:iCs/>
-                <w:color w:val="7A7A7A"/>
-              </w:rPr>
-              <w:t>[TODO: name]</w:t>
-            </w:r>
-          </w:p>
-        </w:tc>
-        <w:tc>
-          <w:tcPr>
-            <w:tcW w:w="1800" w:type="dxa"/>
-            <w:tcBorders>
-              <w:top w:val="single" w:sz="4" w:space="0" w:color="BFBFBF"/>
-              <w:left w:val="single" w:sz="4" w:space="0" w:color="BFBFBF"/>
-              <w:bottom w:val="single" w:sz="4" w:space="0" w:color="BFBFBF"/>
-              <w:right w:val="single" w:sz="4" w:space="0" w:color="BFBFBF"/>
-            </w:tcBorders>
-            <w:tcMar>
-              <w:top w:w="70" w:type="dxa"/>
-              <w:left w:w="110" w:type="dxa"/>
-              <w:bottom w:w="70" w:type="dxa"/>
-              <w:right w:w="110" w:type="dxa"/>
-            </w:tcMar>
-          </w:tcPr>
-          <w:p>
-            <w:r>
-              <w:rPr>
-                <w:i/>
-                <w:iCs/>
-                <w:color w:val="7A7A7A"/>
-              </w:rPr>
-              <w:t>[TODO: GUI / CLI / controller / domain / agent / persistence]</w:t>
-            </w:r>
-          </w:p>
-        </w:tc>
-        <w:tc>
-          <w:tcPr>
-            <w:tcW w:w="4760" w:type="dxa"/>
-            <w:tcBorders>
-              <w:top w:val="single" w:sz="4" w:space="0" w:color="BFBFBF"/>
-              <w:left w:val="single" w:sz="4" w:space="0" w:color="BFBFBF"/>
-              <w:bottom w:val="single" w:sz="4" w:space="0" w:color="BFBFBF"/>
-              <w:right w:val="single" w:sz="4" w:space="0" w:color="BFBFBF"/>
-            </w:tcBorders>
-            <w:tcMar>
-              <w:top w:w="70" w:type="dxa"/>
-              <w:left w:w="110" w:type="dxa"/>
-              <w:bottom w:w="70" w:type="dxa"/>
-              <w:right w:w="110" w:type="dxa"/>
-            </w:tcMar>
-          </w:tcPr>
-          <w:p>
-            <w:r>
-              <w:rPr>
-                <w:i/>
-                <w:iCs/>
-                <w:color w:val="7A7A7A"/>
-              </w:rPr>
-              <w:t>[TODO: one-line responsibility]</w:t>
-            </w:r>
-          </w:p>
-        </w:tc>
-      </w:tr>
-      <w:tr>
-        <w:trPr>
-          <w:cantSplit/>
-        </w:trPr>
-        <w:tc>
-          <w:tcPr>
-            <w:tcW w:w="2800" w:type="dxa"/>
-            <w:tcBorders>
-              <w:top w:val="single" w:sz="4" w:space="0" w:color="BFBFBF"/>
-              <w:left w:val="single" w:sz="4" w:space="0" w:color="BFBFBF"/>
-              <w:bottom w:val="single" w:sz="4" w:space="0" w:color="BFBFBF"/>
-              <w:right w:val="single" w:sz="4" w:space="0" w:color="BFBFBF"/>
-            </w:tcBorders>
-            <w:tcMar>
-              <w:top w:w="70" w:type="dxa"/>
-              <w:left w:w="110" w:type="dxa"/>
-              <w:bottom w:w="70" w:type="dxa"/>
-              <w:right w:w="110" w:type="dxa"/>
-            </w:tcMar>
-          </w:tcPr>
-          <w:p>
-            <w:r>
-              <w:rPr>
-                <w:i/>
-                <w:iCs/>
-                <w:color w:val="7A7A7A"/>
-              </w:rPr>
-              <w:t>[TODO: name]</w:t>
-            </w:r>
-          </w:p>
-        </w:tc>
-        <w:tc>
-          <w:tcPr>
-            <w:tcW w:w="1800" w:type="dxa"/>
-            <w:tcBorders>
-              <w:top w:val="single" w:sz="4" w:space="0" w:color="BFBFBF"/>
-              <w:left w:val="single" w:sz="4" w:space="0" w:color="BFBFBF"/>
-              <w:bottom w:val="single" w:sz="4" w:space="0" w:color="BFBFBF"/>
-              <w:right w:val="single" w:sz="4" w:space="0" w:color="BFBFBF"/>
-            </w:tcBorders>
-            <w:tcMar>
-              <w:top w:w="70" w:type="dxa"/>
-              <w:left w:w="110" w:type="dxa"/>
-              <w:bottom w:w="70" w:type="dxa"/>
-              <w:right w:w="110" w:type="dxa"/>
-            </w:tcMar>
-          </w:tcPr>
-          <w:p>
-            <w:r>
-              <w:rPr>
-                <w:i/>
-                <w:iCs/>
-                <w:color w:val="7A7A7A"/>
-              </w:rPr>
-              <w:t>[TODO: GUI / CLI / controller / domain / agent / persistence]</w:t>
-            </w:r>
-          </w:p>
-        </w:tc>
-        <w:tc>
-          <w:tcPr>
-            <w:tcW w:w="4760" w:type="dxa"/>
-            <w:tcBorders>
-              <w:top w:val="single" w:sz="4" w:space="0" w:color="BFBFBF"/>
-              <w:left w:val="single" w:sz="4" w:space="0" w:color="BFBFBF"/>
-              <w:bottom w:val="single" w:sz="4" w:space="0" w:color="BFBFBF"/>
-              <w:right w:val="single" w:sz="4" w:space="0" w:color="BFBFBF"/>
-            </w:tcBorders>
-            <w:tcMar>
-              <w:top w:w="70" w:type="dxa"/>
-              <w:left w:w="110" w:type="dxa"/>
-              <w:bottom w:w="70" w:type="dxa"/>
-              <w:right w:w="110" w:type="dxa"/>
-            </w:tcMar>
-          </w:tcPr>
-          <w:p>
-            <w:r>
-              <w:rPr>
-                <w:i/>
-                <w:iCs/>
-                <w:color w:val="7A7A7A"/>
-              </w:rPr>
-              <w:t>[TODO: one-line responsibility]</w:t>
-            </w:r>
-          </w:p>
-        </w:tc>
-      </w:tr>
-      <w:tr>
-        <w:trPr>
-          <w:cantSplit/>
-        </w:trPr>
-        <w:tc>
-          <w:tcPr>
-            <w:tcW w:w="2800" w:type="dxa"/>
-            <w:tcBorders>
-              <w:top w:val="single" w:sz="4" w:space="0" w:color="BFBFBF"/>
-              <w:left w:val="single" w:sz="4" w:space="0" w:color="BFBFBF"/>
-              <w:bottom w:val="single" w:sz="4" w:space="0" w:color="BFBFBF"/>
-              <w:right w:val="single" w:sz="4" w:space="0" w:color="BFBFBF"/>
-            </w:tcBorders>
-            <w:tcMar>
-              <w:top w:w="70" w:type="dxa"/>
-              <w:left w:w="110" w:type="dxa"/>
-              <w:bottom w:w="70" w:type="dxa"/>
-              <w:right w:w="110" w:type="dxa"/>
-            </w:tcMar>
-          </w:tcPr>
-          <w:p>
-            <w:r>
-              <w:rPr>
-                <w:i/>
-                <w:iCs/>
-                <w:color w:val="7A7A7A"/>
-              </w:rPr>
-              <w:t>[TODO: name]</w:t>
-            </w:r>
-          </w:p>
-        </w:tc>
-        <w:tc>
-          <w:tcPr>
-            <w:tcW w:w="1800" w:type="dxa"/>
-            <w:tcBorders>
-              <w:top w:val="single" w:sz="4" w:space="0" w:color="BFBFBF"/>
-              <w:left w:val="single" w:sz="4" w:space="0" w:color="BFBFBF"/>
-              <w:bottom w:val="single" w:sz="4" w:space="0" w:color="BFBFBF"/>
-              <w:right w:val="single" w:sz="4" w:space="0" w:color="BFBFBF"/>
-            </w:tcBorders>
-            <w:tcMar>
-              <w:top w:w="70" w:type="dxa"/>
-              <w:left w:w="110" w:type="dxa"/>
-              <w:bottom w:w="70" w:type="dxa"/>
-              <w:right w:w="110" w:type="dxa"/>
-            </w:tcMar>
-          </w:tcPr>
-          <w:p>
-            <w:r>
-              <w:rPr>
-                <w:i/>
-                <w:iCs/>
-                <w:color w:val="7A7A7A"/>
-              </w:rPr>
-              <w:t>[TODO: GUI / CLI / controller / domain / agent / persistence]</w:t>
-            </w:r>
-          </w:p>
-        </w:tc>
-        <w:tc>
-          <w:tcPr>
-            <w:tcW w:w="4760" w:type="dxa"/>
-            <w:tcBorders>
-              <w:top w:val="single" w:sz="4" w:space="0" w:color="BFBFBF"/>
-              <w:left w:val="single" w:sz="4" w:space="0" w:color="BFBFBF"/>
-              <w:bottom w:val="single" w:sz="4" w:space="0" w:color="BFBFBF"/>
-              <w:right w:val="single" w:sz="4" w:space="0" w:color="BFBFBF"/>
-            </w:tcBorders>
-            <w:tcMar>
-              <w:top w:w="70" w:type="dxa"/>
-              <w:left w:w="110" w:type="dxa"/>
-              <w:bottom w:w="70" w:type="dxa"/>
-              <w:right w:w="110" w:type="dxa"/>
-            </w:tcMar>
-          </w:tcPr>
-          <w:p>
-            <w:r>
-              <w:rPr>
-                <w:i/>
-                <w:iCs/>
-                <w:color w:val="7A7A7A"/>
-              </w:rPr>
-              <w:t>[TODO: one-line responsibility]</w:t>
-            </w:r>
-          </w:p>
-        </w:tc>
-      </w:tr>
-      <w:tr>
-        <w:trPr>
-          <w:cantSplit/>
-        </w:trPr>
-        <w:tc>
-          <w:tcPr>
-            <w:tcW w:w="2800" w:type="dxa"/>
-            <w:tcBorders>
-              <w:top w:val="single" w:sz="4" w:space="0" w:color="BFBFBF"/>
-              <w:left w:val="single" w:sz="4" w:space="0" w:color="BFBFBF"/>
-              <w:bottom w:val="single" w:sz="4" w:space="0" w:color="BFBFBF"/>
-              <w:right w:val="single" w:sz="4" w:space="0" w:color="BFBFBF"/>
-            </w:tcBorders>
-            <w:tcMar>
-              <w:top w:w="70" w:type="dxa"/>
-              <w:left w:w="110" w:type="dxa"/>
-              <w:bottom w:w="70" w:type="dxa"/>
-              <w:right w:w="110" w:type="dxa"/>
-            </w:tcMar>
-          </w:tcPr>
-          <w:p>
-            <w:r>
-              <w:rPr>
-                <w:i/>
-                <w:iCs/>
-                <w:color w:val="7A7A7A"/>
-              </w:rPr>
-              <w:t>[TODO: name]</w:t>
-            </w:r>
-          </w:p>
-        </w:tc>
-        <w:tc>
-          <w:tcPr>
-            <w:tcW w:w="1800" w:type="dxa"/>
-            <w:tcBorders>
-              <w:top w:val="single" w:sz="4" w:space="0" w:color="BFBFBF"/>
-              <w:left w:val="single" w:sz="4" w:space="0" w:color="BFBFBF"/>
-              <w:bottom w:val="single" w:sz="4" w:space="0" w:color="BFBFBF"/>
-              <w:right w:val="single" w:sz="4" w:space="0" w:color="BFBFBF"/>
-            </w:tcBorders>
-            <w:tcMar>
-              <w:top w:w="70" w:type="dxa"/>
-              <w:left w:w="110" w:type="dxa"/>
-              <w:bottom w:w="70" w:type="dxa"/>
-              <w:right w:w="110" w:type="dxa"/>
-            </w:tcMar>
-          </w:tcPr>
-          <w:p>
-            <w:r>
-              <w:rPr>
-                <w:i/>
-                <w:iCs/>
-                <w:color w:val="7A7A7A"/>
-              </w:rPr>
-              <w:t>[TODO: GUI / CLI / controller / domain / agent / persistence]</w:t>
-            </w:r>
-          </w:p>
-        </w:tc>
-        <w:tc>
-          <w:tcPr>
-            <w:tcW w:w="4760" w:type="dxa"/>
-            <w:tcBorders>
-              <w:top w:val="single" w:sz="4" w:space="0" w:color="BFBFBF"/>
-              <w:left w:val="single" w:sz="4" w:space="0" w:color="BFBFBF"/>
-              <w:bottom w:val="single" w:sz="4" w:space="0" w:color="BFBFBF"/>
-              <w:right w:val="single" w:sz="4" w:space="0" w:color="BFBFBF"/>
-            </w:tcBorders>
-            <w:tcMar>
-              <w:top w:w="70" w:type="dxa"/>
-              <w:left w:w="110" w:type="dxa"/>
-              <w:bottom w:w="70" w:type="dxa"/>
-              <w:right w:w="110" w:type="dxa"/>
-            </w:tcMar>
-          </w:tcPr>
-          <w:p>
-            <w:r>
-              <w:rPr>
-                <w:i/>
-                <w:iCs/>
-                <w:color w:val="7A7A7A"/>
-              </w:rPr>
-              <w:t>[TODO: one-line responsibility]</w:t>
-            </w:r>
-          </w:p>
-        </w:tc>
-      </w:tr>
-      <w:tr>
-        <w:trPr>
-          <w:cantSplit/>
-        </w:trPr>
-        <w:tc>
-          <w:tcPr>
-            <w:tcW w:w="2800" w:type="dxa"/>
-            <w:tcBorders>
-              <w:top w:val="single" w:sz="4" w:space="0" w:color="BFBFBF"/>
-              <w:left w:val="single" w:sz="4" w:space="0" w:color="BFBFBF"/>
-              <w:bottom w:val="single" w:sz="4" w:space="0" w:color="BFBFBF"/>
-              <w:right w:val="single" w:sz="4" w:space="0" w:color="BFBFBF"/>
-            </w:tcBorders>
-            <w:tcMar>
-              <w:top w:w="70" w:type="dxa"/>
-              <w:left w:w="110" w:type="dxa"/>
-              <w:bottom w:w="70" w:type="dxa"/>
-              <w:right w:w="110" w:type="dxa"/>
-            </w:tcMar>
-          </w:tcPr>
-          <w:p>
-            <w:r>
-              <w:rPr>
-                <w:i/>
-                <w:iCs/>
-                <w:color w:val="7A7A7A"/>
-              </w:rPr>
-              <w:t>[TODO: name]</w:t>
-            </w:r>
-          </w:p>
-        </w:tc>
-        <w:tc>
-          <w:tcPr>
-            <w:tcW w:w="1800" w:type="dxa"/>
-            <w:tcBorders>
-              <w:top w:val="single" w:sz="4" w:space="0" w:color="BFBFBF"/>
-              <w:left w:val="single" w:sz="4" w:space="0" w:color="BFBFBF"/>
-              <w:bottom w:val="single" w:sz="4" w:space="0" w:color="BFBFBF"/>
-              <w:right w:val="single" w:sz="4" w:space="0" w:color="BFBFBF"/>
-            </w:tcBorders>
-            <w:tcMar>
-              <w:top w:w="70" w:type="dxa"/>
-              <w:left w:w="110" w:type="dxa"/>
-              <w:bottom w:w="70" w:type="dxa"/>
-              <w:right w:w="110" w:type="dxa"/>
-            </w:tcMar>
-          </w:tcPr>
-          <w:p>
-            <w:r>
-              <w:rPr>
-                <w:i/>
-                <w:iCs/>
-                <w:color w:val="7A7A7A"/>
-              </w:rPr>
-              <w:t>[TODO: GUI / CLI / controller / domain / agent / persistence]</w:t>
-            </w:r>
-          </w:p>
-        </w:tc>
-        <w:tc>
-          <w:tcPr>
-            <w:tcW w:w="4760" w:type="dxa"/>
-            <w:tcBorders>
-              <w:top w:val="single" w:sz="4" w:space="0" w:color="BFBFBF"/>
-              <w:left w:val="single" w:sz="4" w:space="0" w:color="BFBFBF"/>
-              <w:bottom w:val="single" w:sz="4" w:space="0" w:color="BFBFBF"/>
-              <w:right w:val="single" w:sz="4" w:space="0" w:color="BFBFBF"/>
-            </w:tcBorders>
-            <w:tcMar>
-              <w:top w:w="70" w:type="dxa"/>
-              <w:left w:w="110" w:type="dxa"/>
-              <w:bottom w:w="70" w:type="dxa"/>
-              <w:right w:w="110" w:type="dxa"/>
-            </w:tcMar>
-          </w:tcPr>
-          <w:p>
-            <w:r>
-              <w:rPr>
-                <w:i/>
-                <w:iCs/>
-                <w:color w:val="7A7A7A"/>
-              </w:rPr>
-              <w:t>[TODO: one-line responsibility]</w:t>
-            </w:r>
-          </w:p>
-        </w:tc>
-      </w:tr>
-      <w:tr>
-        <w:trPr>
-          <w:cantSplit/>
-        </w:trPr>
-        <w:tc>
-          <w:tcPr>
-            <w:tcW w:w="2800" w:type="dxa"/>
-            <w:tcBorders>
-              <w:top w:val="single" w:sz="4" w:space="0" w:color="BFBFBF"/>
-              <w:left w:val="single" w:sz="4" w:space="0" w:color="BFBFBF"/>
-              <w:bottom w:val="single" w:sz="4" w:space="0" w:color="BFBFBF"/>
-              <w:right w:val="single" w:sz="4" w:space="0" w:color="BFBFBF"/>
-            </w:tcBorders>
-            <w:tcMar>
-              <w:top w:w="70" w:type="dxa"/>
-              <w:left w:w="110" w:type="dxa"/>
-              <w:bottom w:w="70" w:type="dxa"/>
-              <w:right w:w="110" w:type="dxa"/>
-            </w:tcMar>
-          </w:tcPr>
-          <w:p>
-            <w:r>
-              <w:rPr>
-                <w:i/>
-                <w:iCs/>
-                <w:color w:val="7A7A7A"/>
-              </w:rPr>
-              <w:t>[TODO: name]</w:t>
-            </w:r>
-          </w:p>
-        </w:tc>
-        <w:tc>
-          <w:tcPr>
-            <w:tcW w:w="1800" w:type="dxa"/>
-            <w:tcBorders>
-              <w:top w:val="single" w:sz="4" w:space="0" w:color="BFBFBF"/>
-              <w:left w:val="single" w:sz="4" w:space="0" w:color="BFBFBF"/>
-              <w:bottom w:val="single" w:sz="4" w:space="0" w:color="BFBFBF"/>
-              <w:right w:val="single" w:sz="4" w:space="0" w:color="BFBFBF"/>
-            </w:tcBorders>
-            <w:tcMar>
-              <w:top w:w="70" w:type="dxa"/>
-              <w:left w:w="110" w:type="dxa"/>
-              <w:bottom w:w="70" w:type="dxa"/>
-              <w:right w:w="110" w:type="dxa"/>
-            </w:tcMar>
-          </w:tcPr>
-          <w:p>
-            <w:r>
-              <w:rPr>
-                <w:i/>
-                <w:iCs/>
-                <w:color w:val="7A7A7A"/>
-              </w:rPr>
-              <w:t>[TODO: GUI / CLI / controller / domain / agent / persistence]</w:t>
-            </w:r>
-          </w:p>
-        </w:tc>
-        <w:tc>
-          <w:tcPr>
-            <w:tcW w:w="4760" w:type="dxa"/>
-            <w:tcBorders>
-              <w:top w:val="single" w:sz="4" w:space="0" w:color="BFBFBF"/>
-              <w:left w:val="single" w:sz="4" w:space="0" w:color="BFBFBF"/>
-              <w:bottom w:val="single" w:sz="4" w:space="0" w:color="BFBFBF"/>
-              <w:right w:val="single" w:sz="4" w:space="0" w:color="BFBFBF"/>
-            </w:tcBorders>
-            <w:tcMar>
-              <w:top w:w="70" w:type="dxa"/>
-              <w:left w:w="110" w:type="dxa"/>
-              <w:bottom w:w="70" w:type="dxa"/>
-              <w:right w:w="110" w:type="dxa"/>
-            </w:tcMar>
-          </w:tcPr>
-          <w:p>
-            <w:r>
-              <w:rPr>
-                <w:i/>
-                <w:iCs/>
-                <w:color w:val="7A7A7A"/>
-              </w:rPr>
-              <w:t>[TODO: one-line responsibility]</w:t>
-            </w:r>
-          </w:p>
-        </w:tc>
-      </w:tr>
-    </w:tbl>
-    <w:p>
-      <w:pPr>
-        <w:pStyle w:val="Heading1"/>
-        <w:pageBreakBefore/>
-      </w:pPr>
-      <w:bookmarkStart w:id="11" w:name="_Toc242439985"/>
-      <w:r>
-        <w:lastRenderedPageBreak/>
-        <w:t>4. Design Pattern Explanations</w:t>
+      <w:bookmarkStart w:id="11" w:name="_Toc242459798"/>
+      <w:r>
+        <w:t>4.1 Adapter</w:t>
       </w:r>
       <w:bookmarkEnd w:id="11"/>
-    </w:p>
-    <w:p>
-      <w:pPr>
-        <w:spacing w:after="120"/>
-      </w:pPr>
-      <w:r>
-        <w:t xml:space="preserve">This project will use: Adapter, </w:t>
-      </w:r>
-    </w:p>
-    <w:p>
-      <w:pPr>
-        <w:pStyle w:val="Heading2"/>
-        <w:keepNext/>
-      </w:pPr>
-      <w:bookmarkStart w:id="12" w:name="_Toc242439986"/>
-      <w:r>
-        <w:t>4.1 Pattern 1</w:t>
-      </w:r>
-      <w:bookmarkEnd w:id="12"/>
     </w:p>
     <w:tbl>
       <w:tblPr>
@@ -12401,12 +11756,7 @@
           </w:tcPr>
           <w:p>
             <w:r>
-              <w:rPr>
-                <w:i/>
-                <w:iCs/>
-                <w:color w:val="7A7A7A"/>
-              </w:rPr>
-              <w:t>[TODO: pattern name]</w:t>
+              <w:t>Adapter</w:t>
             </w:r>
           </w:p>
         </w:tc>
@@ -12460,12 +11810,7 @@
           </w:tcPr>
           <w:p>
             <w:r>
-              <w:rPr>
-                <w:i/>
-                <w:iCs/>
-                <w:color w:val="7A7A7A"/>
-              </w:rPr>
-              <w:t>[TODO: What design problem does the pattern address?]</w:t>
+              <w:t>Anthropic’s API has its own request and response format, which the agent should not depend on.</w:t>
             </w:r>
           </w:p>
         </w:tc>
@@ -12519,12 +11864,27 @@
           </w:tcPr>
           <w:p>
             <w:r>
-              <w:rPr>
-                <w:i/>
-                <w:iCs/>
-                <w:color w:val="7A7A7A"/>
-              </w:rPr>
-              <w:t>[TODO: Which classes participate, and what role does each play?]</w:t>
+              <w:t>Target: LLMClient</w:t>
+            </w:r>
+          </w:p>
+          <w:p>
+            <w:r>
+              <w:t>Adapter: ClaudeAdapter</w:t>
+            </w:r>
+          </w:p>
+          <w:p>
+            <w:r>
+              <w:t>Adaptee: AnthropicApi (Anthropic’s Messages API, which is external to this project)</w:t>
+            </w:r>
+          </w:p>
+          <w:p>
+            <w:r>
+              <w:t>Clients: StoryAgent, PlotPlanner, MemoryManager and ConsistencyChecker</w:t>
+            </w:r>
+          </w:p>
+          <w:p>
+            <w:r>
+              <w:t>FakeLLMClient is a second implementation of the target, used for testing.</w:t>
             </w:r>
           </w:p>
         </w:tc>
@@ -12578,12 +11938,7 @@
           </w:tcPr>
           <w:p>
             <w:r>
-              <w:rPr>
-                <w:i/>
-                <w:iCs/>
-                <w:color w:val="7A7A7A"/>
-              </w:rPr>
-              <w:t>[TODO: Why is this pattern appropriate here?]</w:t>
+              <w:t>The API is a third-party interface that this project cannot change, and the agent needs only one operation from it: generate a response to a request. An adapter does the translation between the two in a single class, so the rest of the application is written against LLMClient alone.</w:t>
             </w:r>
           </w:p>
         </w:tc>
@@ -12637,12 +11992,13 @@
           </w:tcPr>
           <w:p>
             <w:r>
-              <w:rPr>
-                <w:i/>
-                <w:iCs/>
-                <w:color w:val="7A7A7A"/>
-              </w:rPr>
-              <w:t>[TODO: What would be more difficult if the pattern were not used?]</w:t>
+              <w:t>Provider-specific request and response handling would spread through the agent classes</w:t>
+            </w:r>
+            <w:r>
+              <w:t xml:space="preserve">; </w:t>
+            </w:r>
+            <w:r>
+              <w:t>switching models would mean editing each of them, and the agent could not be tested without live, paid calls.</w:t>
             </w:r>
           </w:p>
         </w:tc>
@@ -12696,12 +12052,7 @@
           </w:tcPr>
           <w:p>
             <w:r>
-              <w:rPr>
-                <w:i/>
-                <w:iCs/>
-                <w:color w:val="7A7A7A"/>
-              </w:rPr>
-              <w:t>[TODO: F## list]</w:t>
+              <w:t>Every feature that calls the model: F01, F04, F05, F06, F07, F08, F09, F12</w:t>
             </w:r>
           </w:p>
         </w:tc>
@@ -12714,14 +12065,29 @@
     </w:p>
     <w:p>
       <w:pPr>
+        <w:rPr>
+          <w:b/>
+          <w:bCs/>
+          <w:color w:val="2F5496"/>
+          <w:sz w:val="26"/>
+          <w:szCs w:val="26"/>
+        </w:rPr>
+      </w:pPr>
+      <w:bookmarkStart w:id="12" w:name="_Toc242459799"/>
+      <w:r>
+        <w:br w:type="page"/>
+      </w:r>
+    </w:p>
+    <w:p>
+      <w:pPr>
         <w:pStyle w:val="Heading2"/>
         <w:keepNext/>
       </w:pPr>
-      <w:bookmarkStart w:id="13" w:name="_Toc242439987"/>
-      <w:r>
-        <w:t>4.2 Pattern 2</w:t>
-      </w:r>
-      <w:bookmarkEnd w:id="13"/>
+      <w:r>
+        <w:lastRenderedPageBreak/>
+        <w:t>4.2 Command</w:t>
+      </w:r>
+      <w:bookmarkEnd w:id="12"/>
     </w:p>
     <w:tbl>
       <w:tblPr>
@@ -12793,12 +12159,7 @@
           </w:tcPr>
           <w:p>
             <w:r>
-              <w:rPr>
-                <w:i/>
-                <w:iCs/>
-                <w:color w:val="7A7A7A"/>
-              </w:rPr>
-              <w:t>[TODO: pattern name]</w:t>
+              <w:t>Command</w:t>
             </w:r>
           </w:p>
         </w:tc>
@@ -12852,12 +12213,7 @@
           </w:tcPr>
           <w:p>
             <w:r>
-              <w:rPr>
-                <w:i/>
-                <w:iCs/>
-                <w:color w:val="7A7A7A"/>
-              </w:rPr>
-              <w:t>[TODO: What design problem does the pattern address?]</w:t>
+              <w:t>The most recent turn has to be undoable, retryable and editable, including the changes it made to the pivotal events.</w:t>
             </w:r>
           </w:p>
         </w:tc>
@@ -12911,12 +12267,27 @@
           </w:tcPr>
           <w:p>
             <w:r>
-              <w:rPr>
-                <w:i/>
-                <w:iCs/>
-                <w:color w:val="7A7A7A"/>
-              </w:rPr>
-              <w:t>[TODO: Which classes participate, and what role does each play?]</w:t>
+              <w:t>Command: StoryCommand</w:t>
+            </w:r>
+          </w:p>
+          <w:p>
+            <w:r>
+              <w:t>Concrete commands: SubmitTurnCommand, EditTurnCommand</w:t>
+            </w:r>
+          </w:p>
+          <w:p>
+            <w:r>
+              <w:t>Invoker: CommandHistory</w:t>
+            </w:r>
+          </w:p>
+          <w:p>
+            <w:r>
+              <w:t>Client: StoryController, which creates the commands</w:t>
+            </w:r>
+          </w:p>
+          <w:p>
+            <w:r>
+              <w:t>Receivers: StorySession, StoryAgent</w:t>
             </w:r>
           </w:p>
         </w:tc>
@@ -12970,12 +12341,7 @@
           </w:tcPr>
           <w:p>
             <w:r>
-              <w:rPr>
-                <w:i/>
-                <w:iCs/>
-                <w:color w:val="7A7A7A"/>
-              </w:rPr>
-              <w:t>[TODO: Why is this pattern appropriate here?]</w:t>
+              <w:t>Each turn is a self-contained action with a clear inverse. Wrapping it in an object lets the command remember what it changed (the turn it added, and the pivotal events as they were before), which is what undo needs. Retry reuses the same mechanism: undo, then run a new command with the same input.</w:t>
             </w:r>
           </w:p>
         </w:tc>
@@ -13029,12 +12395,7 @@
           </w:tcPr>
           <w:p>
             <w:r>
-              <w:rPr>
-                <w:i/>
-                <w:iCs/>
-                <w:color w:val="7A7A7A"/>
-              </w:rPr>
-              <w:t>[TODO: What would be more difficult if the pattern were not used?]</w:t>
+              <w:t>Undo logic would be scattered through the controller with no record of what each turn changed, and restoring the pivotal events after an undo would have to be handled separately.</w:t>
             </w:r>
           </w:p>
         </w:tc>
@@ -13088,12 +12449,7 @@
           </w:tcPr>
           <w:p>
             <w:r>
-              <w:rPr>
-                <w:i/>
-                <w:iCs/>
-                <w:color w:val="7A7A7A"/>
-              </w:rPr>
-              <w:t>[TODO: F## list]</w:t>
+              <w:t>F04, F10</w:t>
             </w:r>
           </w:p>
         </w:tc>
@@ -13109,11 +12465,11 @@
         <w:pStyle w:val="Heading2"/>
         <w:keepNext/>
       </w:pPr>
-      <w:bookmarkStart w:id="14" w:name="_Toc242439988"/>
-      <w:r>
-        <w:t>4.3 Pattern 3</w:t>
-      </w:r>
-      <w:bookmarkEnd w:id="14"/>
+      <w:bookmarkStart w:id="13" w:name="_Toc242459800"/>
+      <w:r>
+        <w:t>4.3 Facade</w:t>
+      </w:r>
+      <w:bookmarkEnd w:id="13"/>
     </w:p>
     <w:tbl>
       <w:tblPr>
@@ -13185,12 +12541,7 @@
           </w:tcPr>
           <w:p>
             <w:r>
-              <w:rPr>
-                <w:i/>
-                <w:iCs/>
-                <w:color w:val="7A7A7A"/>
-              </w:rPr>
-              <w:t>[TODO: pattern name]</w:t>
+              <w:t>Facade</w:t>
             </w:r>
           </w:p>
         </w:tc>
@@ -13244,12 +12595,7 @@
           </w:tcPr>
           <w:p>
             <w:r>
-              <w:rPr>
-                <w:i/>
-                <w:iCs/>
-                <w:color w:val="7A7A7A"/>
-              </w:rPr>
-              <w:t>[TODO: What design problem does the pattern address?]</w:t>
+              <w:t>A single turn involves planning, memory, tools, a consistency check and the model. The controller should not have to orchestrate that.</w:t>
             </w:r>
           </w:p>
         </w:tc>
@@ -13303,12 +12649,17 @@
           </w:tcPr>
           <w:p>
             <w:r>
-              <w:rPr>
-                <w:i/>
-                <w:iCs/>
-                <w:color w:val="7A7A7A"/>
-              </w:rPr>
-              <w:t>[TODO: Which classes participate, and what role does each play?]</w:t>
+              <w:t>Facade: StoryAgent</w:t>
+            </w:r>
+          </w:p>
+          <w:p>
+            <w:r>
+              <w:t>Subsystem classes: PlotPlanner, MemoryManager, ConsistencyChecker, ToolRegistry, LLMClient</w:t>
+            </w:r>
+          </w:p>
+          <w:p>
+            <w:r>
+              <w:t>Clients: StoryController, SubmitTurnCommand</w:t>
             </w:r>
           </w:p>
         </w:tc>
@@ -13362,12 +12713,7 @@
           </w:tcPr>
           <w:p>
             <w:r>
-              <w:rPr>
-                <w:i/>
-                <w:iCs/>
-                <w:color w:val="7A7A7A"/>
-              </w:rPr>
-              <w:t>[TODO: Why is this pattern appropriate here?]</w:t>
+              <w:t>The controller needs only a few operations from the agent (generate a scenario, plan the pivotal events, take a turn, write an ending, write a recap) and has no reason to know how they are carried out. A facade offers those operations and keeps the order of the steps in one place.</w:t>
             </w:r>
           </w:p>
         </w:tc>
@@ -13421,12 +12767,7 @@
           </w:tcPr>
           <w:p>
             <w:r>
-              <w:rPr>
-                <w:i/>
-                <w:iCs/>
-                <w:color w:val="7A7A7A"/>
-              </w:rPr>
-              <w:t>[TODO: What would be more difficult if the pattern were not used?]</w:t>
+              <w:t>The controller would depend on five agent classes and on the order they have to be called in, so any change to how a turn is produced would also change the controller.</w:t>
             </w:r>
           </w:p>
         </w:tc>
@@ -13480,12 +12821,7 @@
           </w:tcPr>
           <w:p>
             <w:r>
-              <w:rPr>
-                <w:i/>
-                <w:iCs/>
-                <w:color w:val="7A7A7A"/>
-              </w:rPr>
-              <w:t>[TODO: F## list]</w:t>
+              <w:t>F01, F04, F05, F06, F07, F08, F09, F11, F12</w:t>
             </w:r>
           </w:p>
         </w:tc>
@@ -13501,11 +12837,12 @@
         <w:pStyle w:val="Heading2"/>
         <w:keepNext/>
       </w:pPr>
-      <w:bookmarkStart w:id="15" w:name="_Toc242439989"/>
-      <w:r>
-        <w:t>4.4 Pattern 4</w:t>
-      </w:r>
-      <w:bookmarkEnd w:id="15"/>
+      <w:bookmarkStart w:id="14" w:name="_Toc242459801"/>
+      <w:r>
+        <w:lastRenderedPageBreak/>
+        <w:t>4.4 MVC</w:t>
+      </w:r>
+      <w:bookmarkEnd w:id="14"/>
     </w:p>
     <w:tbl>
       <w:tblPr>
@@ -13577,12 +12914,7 @@
           </w:tcPr>
           <w:p>
             <w:r>
-              <w:rPr>
-                <w:i/>
-                <w:iCs/>
-                <w:color w:val="7A7A7A"/>
-              </w:rPr>
-              <w:t>[TODO: pattern name]</w:t>
+              <w:t>MVC</w:t>
             </w:r>
           </w:p>
         </w:tc>
@@ -13636,12 +12968,7 @@
           </w:tcPr>
           <w:p>
             <w:r>
-              <w:rPr>
-                <w:i/>
-                <w:iCs/>
-                <w:color w:val="7A7A7A"/>
-              </w:rPr>
-              <w:t>[TODO: What design problem does the pattern address?]</w:t>
+              <w:t>Two front ends, a GUI and a CLI, must reach the same functionality without duplicating logic.</w:t>
             </w:r>
           </w:p>
         </w:tc>
@@ -13695,12 +13022,17 @@
           </w:tcPr>
           <w:p>
             <w:r>
-              <w:rPr>
-                <w:i/>
-                <w:iCs/>
-                <w:color w:val="7A7A7A"/>
-              </w:rPr>
-              <w:t>[TODO: Which classes participate, and what role does each play?]</w:t>
+              <w:t>Model: StorySession and the classes it owns (Scenario, LoreBook, LoreEntry, Character, Relationship, Plot, PivotalEvent, Turn, LoreProposal)</w:t>
+            </w:r>
+          </w:p>
+          <w:p>
+            <w:r>
+              <w:t>View: StoryGUI, StoryCLI</w:t>
+            </w:r>
+          </w:p>
+          <w:p>
+            <w:r>
+              <w:t>Controller: StoryController</w:t>
             </w:r>
           </w:p>
         </w:tc>
@@ -13754,12 +13086,7 @@
           </w:tcPr>
           <w:p>
             <w:r>
-              <w:rPr>
-                <w:i/>
-                <w:iCs/>
-                <w:color w:val="7A7A7A"/>
-              </w:rPr>
-              <w:t>[TODO: Why is this pattern appropriate here?]</w:t>
+              <w:t>The project has to offer both a GUI and a CLI over the same features. Keeping the story state and the logic separate from the two front ends means each front end only displays state and forwards the user’s actions.</w:t>
             </w:r>
           </w:p>
         </w:tc>
@@ -13813,12 +13140,7 @@
           </w:tcPr>
           <w:p>
             <w:r>
-              <w:rPr>
-                <w:i/>
-                <w:iCs/>
-                <w:color w:val="7A7A7A"/>
-              </w:rPr>
-              <w:t>[TODO: What would be more difficult if the pattern were not used?]</w:t>
+              <w:t>Each front end would carry its own copy of the story logic, and the two would drift apart as features were added.</w:t>
             </w:r>
           </w:p>
         </w:tc>
@@ -13872,12 +13194,7 @@
           </w:tcPr>
           <w:p>
             <w:r>
-              <w:rPr>
-                <w:i/>
-                <w:iCs/>
-                <w:color w:val="7A7A7A"/>
-              </w:rPr>
-              <w:t>[TODO: F## list]</w:t>
+              <w:t>All features (F01 to F12)</w:t>
             </w:r>
           </w:p>
         </w:tc>
@@ -13893,11 +13210,11 @@
         <w:pStyle w:val="Heading2"/>
         <w:keepNext/>
       </w:pPr>
-      <w:bookmarkStart w:id="16" w:name="_Toc242439990"/>
-      <w:r>
-        <w:t>4.5 Pattern 5</w:t>
-      </w:r>
-      <w:bookmarkEnd w:id="16"/>
+      <w:bookmarkStart w:id="15" w:name="_Toc242459802"/>
+      <w:r>
+        <w:t>4.5 Observer</w:t>
+      </w:r>
+      <w:bookmarkEnd w:id="15"/>
     </w:p>
     <w:tbl>
       <w:tblPr>
@@ -13969,12 +13286,7 @@
           </w:tcPr>
           <w:p>
             <w:r>
-              <w:rPr>
-                <w:i/>
-                <w:iCs/>
-                <w:color w:val="7A7A7A"/>
-              </w:rPr>
-              <w:t>[TODO: pattern name]</w:t>
+              <w:t>Observer</w:t>
             </w:r>
           </w:p>
         </w:tc>
@@ -14028,12 +13340,7 @@
           </w:tcPr>
           <w:p>
             <w:r>
-              <w:rPr>
-                <w:i/>
-                <w:iCs/>
-                <w:color w:val="7A7A7A"/>
-              </w:rPr>
-              <w:t>[TODO: What design problem does the pattern address?]</w:t>
+              <w:t>The story state changes from several places (a turn, an approved proposal, an undo, a load), and every open front end has to refresh.</w:t>
             </w:r>
           </w:p>
         </w:tc>
@@ -14087,12 +13394,17 @@
           </w:tcPr>
           <w:p>
             <w:r>
-              <w:rPr>
-                <w:i/>
-                <w:iCs/>
-                <w:color w:val="7A7A7A"/>
-              </w:rPr>
-              <w:t>[TODO: Which classes participate, and what role does each play?]</w:t>
+              <w:t>Subject: StorySession</w:t>
+            </w:r>
+          </w:p>
+          <w:p>
+            <w:r>
+              <w:t>Observer: StoryObserver</w:t>
+            </w:r>
+          </w:p>
+          <w:p>
+            <w:r>
+              <w:t>Concrete observers: StoryGUI, StoryCLI</w:t>
             </w:r>
           </w:p>
         </w:tc>
@@ -14146,12 +13458,7 @@
           </w:tcPr>
           <w:p>
             <w:r>
-              <w:rPr>
-                <w:i/>
-                <w:iCs/>
-                <w:color w:val="7A7A7A"/>
-              </w:rPr>
-              <w:t>[TODO: Why is this pattern appropriate here?]</w:t>
+              <w:t>The state changes as a result of the agent’s actions as well as the user’s, since the agent raises proposals and warnings during a turn. A front end therefore cannot tell when to refresh from what the user did. The session notifies whichever observers are registered, without knowing which front end they are.</w:t>
             </w:r>
           </w:p>
         </w:tc>
@@ -14205,12 +13512,7 @@
           </w:tcPr>
           <w:p>
             <w:r>
-              <w:rPr>
-                <w:i/>
-                <w:iCs/>
-                <w:color w:val="7A7A7A"/>
-              </w:rPr>
-              <w:t>[TODO: What would be more difficult if the pattern were not used?]</w:t>
+              <w:t>Every method that changes state would need to know about, and call, each front end, which would tie the model to the views that MVC keeps apart.</w:t>
             </w:r>
           </w:p>
         </w:tc>
@@ -14264,12 +13566,7 @@
           </w:tcPr>
           <w:p>
             <w:r>
-              <w:rPr>
-                <w:i/>
-                <w:iCs/>
-                <w:color w:val="7A7A7A"/>
-              </w:rPr>
-              <w:t>[TODO: F## list]</w:t>
+              <w:t>F02, F03, F04, F07, F08, F10, F11</w:t>
             </w:r>
           </w:p>
         </w:tc>
@@ -14282,10 +13579,402 @@
     </w:p>
     <w:p>
       <w:pPr>
+        <w:rPr>
+          <w:b/>
+          <w:bCs/>
+          <w:color w:val="2F5496"/>
+          <w:sz w:val="26"/>
+          <w:szCs w:val="26"/>
+        </w:rPr>
+      </w:pPr>
+      <w:bookmarkStart w:id="16" w:name="_Toc242459803"/>
+      <w:r>
+        <w:br w:type="page"/>
+      </w:r>
+    </w:p>
+    <w:p>
+      <w:pPr>
+        <w:pStyle w:val="Heading2"/>
+        <w:keepNext/>
+      </w:pPr>
+      <w:r>
+        <w:lastRenderedPageBreak/>
+        <w:t>4.6 Strategy</w:t>
+      </w:r>
+      <w:bookmarkEnd w:id="16"/>
+    </w:p>
+    <w:tbl>
+      <w:tblPr>
+        <w:tblW w:w="9360" w:type="dxa"/>
+        <w:tblBorders>
+          <w:top w:val="single" w:sz="4" w:space="0" w:color="auto"/>
+          <w:left w:val="single" w:sz="4" w:space="0" w:color="auto"/>
+          <w:bottom w:val="single" w:sz="4" w:space="0" w:color="auto"/>
+          <w:right w:val="single" w:sz="4" w:space="0" w:color="auto"/>
+          <w:insideH w:val="single" w:sz="4" w:space="0" w:color="auto"/>
+          <w:insideV w:val="single" w:sz="4" w:space="0" w:color="auto"/>
+        </w:tblBorders>
+        <w:tblCellMar>
+          <w:left w:w="10" w:type="dxa"/>
+          <w:right w:w="10" w:type="dxa"/>
+        </w:tblCellMar>
+        <w:tblLook w:val="0000" w:firstRow="0" w:lastRow="0" w:firstColumn="0" w:lastColumn="0" w:noHBand="0" w:noVBand="0"/>
+      </w:tblPr>
+      <w:tblGrid>
+        <w:gridCol w:w="2500"/>
+        <w:gridCol w:w="6860"/>
+      </w:tblGrid>
+      <w:tr>
+        <w:trPr>
+          <w:cantSplit/>
+        </w:trPr>
+        <w:tc>
+          <w:tcPr>
+            <w:tcW w:w="2500" w:type="dxa"/>
+            <w:tcBorders>
+              <w:top w:val="single" w:sz="4" w:space="0" w:color="BFBFBF"/>
+              <w:left w:val="single" w:sz="4" w:space="0" w:color="BFBFBF"/>
+              <w:bottom w:val="single" w:sz="4" w:space="0" w:color="BFBFBF"/>
+              <w:right w:val="single" w:sz="4" w:space="0" w:color="BFBFBF"/>
+            </w:tcBorders>
+            <w:shd w:val="clear" w:color="auto" w:fill="F2F2F2"/>
+            <w:tcMar>
+              <w:top w:w="70" w:type="dxa"/>
+              <w:left w:w="110" w:type="dxa"/>
+              <w:bottom w:w="70" w:type="dxa"/>
+              <w:right w:w="110" w:type="dxa"/>
+            </w:tcMar>
+          </w:tcPr>
+          <w:p>
+            <w:r>
+              <w:rPr>
+                <w:b/>
+                <w:bCs/>
+              </w:rPr>
+              <w:t>Pattern</w:t>
+            </w:r>
+          </w:p>
+        </w:tc>
+        <w:tc>
+          <w:tcPr>
+            <w:tcW w:w="6860" w:type="dxa"/>
+            <w:tcBorders>
+              <w:top w:val="single" w:sz="4" w:space="0" w:color="BFBFBF"/>
+              <w:left w:val="single" w:sz="4" w:space="0" w:color="BFBFBF"/>
+              <w:bottom w:val="single" w:sz="4" w:space="0" w:color="BFBFBF"/>
+              <w:right w:val="single" w:sz="4" w:space="0" w:color="BFBFBF"/>
+            </w:tcBorders>
+            <w:tcMar>
+              <w:top w:w="70" w:type="dxa"/>
+              <w:left w:w="110" w:type="dxa"/>
+              <w:bottom w:w="70" w:type="dxa"/>
+              <w:right w:w="110" w:type="dxa"/>
+            </w:tcMar>
+          </w:tcPr>
+          <w:p>
+            <w:r>
+              <w:t>Strategy</w:t>
+            </w:r>
+          </w:p>
+        </w:tc>
+      </w:tr>
+      <w:tr>
+        <w:trPr>
+          <w:cantSplit/>
+        </w:trPr>
+        <w:tc>
+          <w:tcPr>
+            <w:tcW w:w="2500" w:type="dxa"/>
+            <w:tcBorders>
+              <w:top w:val="single" w:sz="4" w:space="0" w:color="BFBFBF"/>
+              <w:left w:val="single" w:sz="4" w:space="0" w:color="BFBFBF"/>
+              <w:bottom w:val="single" w:sz="4" w:space="0" w:color="BFBFBF"/>
+              <w:right w:val="single" w:sz="4" w:space="0" w:color="BFBFBF"/>
+            </w:tcBorders>
+            <w:shd w:val="clear" w:color="auto" w:fill="F2F2F2"/>
+            <w:tcMar>
+              <w:top w:w="70" w:type="dxa"/>
+              <w:left w:w="110" w:type="dxa"/>
+              <w:bottom w:w="70" w:type="dxa"/>
+              <w:right w:w="110" w:type="dxa"/>
+            </w:tcMar>
+          </w:tcPr>
+          <w:p>
+            <w:r>
+              <w:rPr>
+                <w:b/>
+                <w:bCs/>
+              </w:rPr>
+              <w:t>Design problem addressed</w:t>
+            </w:r>
+          </w:p>
+        </w:tc>
+        <w:tc>
+          <w:tcPr>
+            <w:tcW w:w="6860" w:type="dxa"/>
+            <w:tcBorders>
+              <w:top w:val="single" w:sz="4" w:space="0" w:color="BFBFBF"/>
+              <w:left w:val="single" w:sz="4" w:space="0" w:color="BFBFBF"/>
+              <w:bottom w:val="single" w:sz="4" w:space="0" w:color="BFBFBF"/>
+              <w:right w:val="single" w:sz="4" w:space="0" w:color="BFBFBF"/>
+            </w:tcBorders>
+            <w:tcMar>
+              <w:top w:w="70" w:type="dxa"/>
+              <w:left w:w="110" w:type="dxa"/>
+              <w:bottom w:w="70" w:type="dxa"/>
+              <w:right w:w="110" w:type="dxa"/>
+            </w:tcMar>
+          </w:tcPr>
+          <w:p>
+            <w:r>
+              <w:t>Do, Say and Story input are handled the same way, except for how the input is framed for the model.</w:t>
+            </w:r>
+          </w:p>
+        </w:tc>
+      </w:tr>
+      <w:tr>
+        <w:trPr>
+          <w:cantSplit/>
+        </w:trPr>
+        <w:tc>
+          <w:tcPr>
+            <w:tcW w:w="2500" w:type="dxa"/>
+            <w:tcBorders>
+              <w:top w:val="single" w:sz="4" w:space="0" w:color="BFBFBF"/>
+              <w:left w:val="single" w:sz="4" w:space="0" w:color="BFBFBF"/>
+              <w:bottom w:val="single" w:sz="4" w:space="0" w:color="BFBFBF"/>
+              <w:right w:val="single" w:sz="4" w:space="0" w:color="BFBFBF"/>
+            </w:tcBorders>
+            <w:shd w:val="clear" w:color="auto" w:fill="F2F2F2"/>
+            <w:tcMar>
+              <w:top w:w="70" w:type="dxa"/>
+              <w:left w:w="110" w:type="dxa"/>
+              <w:bottom w:w="70" w:type="dxa"/>
+              <w:right w:w="110" w:type="dxa"/>
+            </w:tcMar>
+          </w:tcPr>
+          <w:p>
+            <w:r>
+              <w:rPr>
+                <w:b/>
+                <w:bCs/>
+              </w:rPr>
+              <w:t>Participating classes and roles</w:t>
+            </w:r>
+          </w:p>
+        </w:tc>
+        <w:tc>
+          <w:tcPr>
+            <w:tcW w:w="6860" w:type="dxa"/>
+            <w:tcBorders>
+              <w:top w:val="single" w:sz="4" w:space="0" w:color="BFBFBF"/>
+              <w:left w:val="single" w:sz="4" w:space="0" w:color="BFBFBF"/>
+              <w:bottom w:val="single" w:sz="4" w:space="0" w:color="BFBFBF"/>
+              <w:right w:val="single" w:sz="4" w:space="0" w:color="BFBFBF"/>
+            </w:tcBorders>
+            <w:tcMar>
+              <w:top w:w="70" w:type="dxa"/>
+              <w:left w:w="110" w:type="dxa"/>
+              <w:bottom w:w="70" w:type="dxa"/>
+              <w:right w:w="110" w:type="dxa"/>
+            </w:tcMar>
+          </w:tcPr>
+          <w:p>
+            <w:r>
+              <w:t>Strategy: InputModeStrategy</w:t>
+            </w:r>
+          </w:p>
+          <w:p>
+            <w:r>
+              <w:t>Concrete strategies: DoModeStrategy, SayModeStrategy, StoryModeStrategy</w:t>
+            </w:r>
+          </w:p>
+          <w:p>
+            <w:r>
+              <w:t>Context: StoryAgent</w:t>
+            </w:r>
+          </w:p>
+          <w:p>
+            <w:r>
+              <w:t>StoryController holds the three strategies and selects one by the mode the user chose.</w:t>
+            </w:r>
+          </w:p>
+        </w:tc>
+      </w:tr>
+      <w:tr>
+        <w:trPr>
+          <w:cantSplit/>
+        </w:trPr>
+        <w:tc>
+          <w:tcPr>
+            <w:tcW w:w="2500" w:type="dxa"/>
+            <w:tcBorders>
+              <w:top w:val="single" w:sz="4" w:space="0" w:color="BFBFBF"/>
+              <w:left w:val="single" w:sz="4" w:space="0" w:color="BFBFBF"/>
+              <w:bottom w:val="single" w:sz="4" w:space="0" w:color="BFBFBF"/>
+              <w:right w:val="single" w:sz="4" w:space="0" w:color="BFBFBF"/>
+            </w:tcBorders>
+            <w:shd w:val="clear" w:color="auto" w:fill="F2F2F2"/>
+            <w:tcMar>
+              <w:top w:w="70" w:type="dxa"/>
+              <w:left w:w="110" w:type="dxa"/>
+              <w:bottom w:w="70" w:type="dxa"/>
+              <w:right w:w="110" w:type="dxa"/>
+            </w:tcMar>
+          </w:tcPr>
+          <w:p>
+            <w:r>
+              <w:rPr>
+                <w:b/>
+                <w:bCs/>
+              </w:rPr>
+              <w:t>Why it is appropriate</w:t>
+            </w:r>
+          </w:p>
+        </w:tc>
+        <w:tc>
+          <w:tcPr>
+            <w:tcW w:w="6860" w:type="dxa"/>
+            <w:tcBorders>
+              <w:top w:val="single" w:sz="4" w:space="0" w:color="BFBFBF"/>
+              <w:left w:val="single" w:sz="4" w:space="0" w:color="BFBFBF"/>
+              <w:bottom w:val="single" w:sz="4" w:space="0" w:color="BFBFBF"/>
+              <w:right w:val="single" w:sz="4" w:space="0" w:color="BFBFBF"/>
+            </w:tcBorders>
+            <w:tcMar>
+              <w:top w:w="70" w:type="dxa"/>
+              <w:left w:w="110" w:type="dxa"/>
+              <w:bottom w:w="70" w:type="dxa"/>
+              <w:right w:w="110" w:type="dxa"/>
+            </w:tcMar>
+          </w:tcPr>
+          <w:p>
+            <w:r>
+              <w:t>The three modes differ in one step only, and the user chooses between them at run time for every turn. Making each mode a small interchangeable object means the rest of the turn does not depend on which one is in use.</w:t>
+            </w:r>
+          </w:p>
+        </w:tc>
+      </w:tr>
+      <w:tr>
+        <w:trPr>
+          <w:cantSplit/>
+        </w:trPr>
+        <w:tc>
+          <w:tcPr>
+            <w:tcW w:w="2500" w:type="dxa"/>
+            <w:tcBorders>
+              <w:top w:val="single" w:sz="4" w:space="0" w:color="BFBFBF"/>
+              <w:left w:val="single" w:sz="4" w:space="0" w:color="BFBFBF"/>
+              <w:bottom w:val="single" w:sz="4" w:space="0" w:color="BFBFBF"/>
+              <w:right w:val="single" w:sz="4" w:space="0" w:color="BFBFBF"/>
+            </w:tcBorders>
+            <w:shd w:val="clear" w:color="auto" w:fill="F2F2F2"/>
+            <w:tcMar>
+              <w:top w:w="70" w:type="dxa"/>
+              <w:left w:w="110" w:type="dxa"/>
+              <w:bottom w:w="70" w:type="dxa"/>
+              <w:right w:w="110" w:type="dxa"/>
+            </w:tcMar>
+          </w:tcPr>
+          <w:p>
+            <w:r>
+              <w:rPr>
+                <w:b/>
+                <w:bCs/>
+              </w:rPr>
+              <w:t>Without the pattern</w:t>
+            </w:r>
+          </w:p>
+        </w:tc>
+        <w:tc>
+          <w:tcPr>
+            <w:tcW w:w="6860" w:type="dxa"/>
+            <w:tcBorders>
+              <w:top w:val="single" w:sz="4" w:space="0" w:color="BFBFBF"/>
+              <w:left w:val="single" w:sz="4" w:space="0" w:color="BFBFBF"/>
+              <w:bottom w:val="single" w:sz="4" w:space="0" w:color="BFBFBF"/>
+              <w:right w:val="single" w:sz="4" w:space="0" w:color="BFBFBF"/>
+            </w:tcBorders>
+            <w:tcMar>
+              <w:top w:w="70" w:type="dxa"/>
+              <w:left w:w="110" w:type="dxa"/>
+              <w:bottom w:w="70" w:type="dxa"/>
+              <w:right w:w="110" w:type="dxa"/>
+            </w:tcMar>
+          </w:tcPr>
+          <w:p>
+            <w:r>
+              <w:t>The agent would branch on the mode name wherever input is framed, and adding a mode would mean editing the agent.</w:t>
+            </w:r>
+          </w:p>
+        </w:tc>
+      </w:tr>
+      <w:tr>
+        <w:trPr>
+          <w:cantSplit/>
+        </w:trPr>
+        <w:tc>
+          <w:tcPr>
+            <w:tcW w:w="2500" w:type="dxa"/>
+            <w:tcBorders>
+              <w:top w:val="single" w:sz="4" w:space="0" w:color="BFBFBF"/>
+              <w:left w:val="single" w:sz="4" w:space="0" w:color="BFBFBF"/>
+              <w:bottom w:val="single" w:sz="4" w:space="0" w:color="BFBFBF"/>
+              <w:right w:val="single" w:sz="4" w:space="0" w:color="BFBFBF"/>
+            </w:tcBorders>
+            <w:shd w:val="clear" w:color="auto" w:fill="F2F2F2"/>
+            <w:tcMar>
+              <w:top w:w="70" w:type="dxa"/>
+              <w:left w:w="110" w:type="dxa"/>
+              <w:bottom w:w="70" w:type="dxa"/>
+              <w:right w:w="110" w:type="dxa"/>
+            </w:tcMar>
+          </w:tcPr>
+          <w:p>
+            <w:r>
+              <w:rPr>
+                <w:b/>
+                <w:bCs/>
+              </w:rPr>
+              <w:t>Related features</w:t>
+            </w:r>
+          </w:p>
+        </w:tc>
+        <w:tc>
+          <w:tcPr>
+            <w:tcW w:w="6860" w:type="dxa"/>
+            <w:tcBorders>
+              <w:top w:val="single" w:sz="4" w:space="0" w:color="BFBFBF"/>
+              <w:left w:val="single" w:sz="4" w:space="0" w:color="BFBFBF"/>
+              <w:bottom w:val="single" w:sz="4" w:space="0" w:color="BFBFBF"/>
+              <w:right w:val="single" w:sz="4" w:space="0" w:color="BFBFBF"/>
+            </w:tcBorders>
+            <w:tcMar>
+              <w:top w:w="70" w:type="dxa"/>
+              <w:left w:w="110" w:type="dxa"/>
+              <w:bottom w:w="70" w:type="dxa"/>
+              <w:right w:w="110" w:type="dxa"/>
+            </w:tcMar>
+          </w:tcPr>
+          <w:p>
+            <w:r>
+              <w:t>F04, F10</w:t>
+            </w:r>
+          </w:p>
+        </w:tc>
+      </w:tr>
+    </w:tbl>
+    <w:p>
+      <w:pPr>
+        <w:spacing w:after="120"/>
+      </w:pPr>
+    </w:p>
+    <w:p>
+      <w:pPr>
         <w:pStyle w:val="Heading1"/>
         <w:pageBreakBefore/>
       </w:pPr>
-      <w:bookmarkStart w:id="17" w:name="_Toc242439991"/>
+      <w:bookmarkStart w:id="17" w:name="_Toc242459804"/>
       <w:r>
         <w:lastRenderedPageBreak/>
         <w:t>5. Use-Case Diagram</w:t>
@@ -14378,7 +14067,7 @@
         <w:pStyle w:val="Heading2"/>
         <w:keepNext/>
       </w:pPr>
-      <w:bookmarkStart w:id="18" w:name="_Toc242439992"/>
+      <w:bookmarkStart w:id="18" w:name="_Toc242459805"/>
       <w:r>
         <w:t>5.1 Actors</w:t>
       </w:r>
@@ -14757,7 +14446,7 @@
         <w:pStyle w:val="Heading1"/>
         <w:pageBreakBefore/>
       </w:pPr>
-      <w:bookmarkStart w:id="19" w:name="_Toc242439993"/>
+      <w:bookmarkStart w:id="19" w:name="_Toc242459806"/>
       <w:r>
         <w:lastRenderedPageBreak/>
         <w:t>6. Detailed Use-Case Descriptions</w:t>
@@ -14777,7 +14466,7 @@
         <w:pStyle w:val="Heading2"/>
         <w:keepNext/>
       </w:pPr>
-      <w:bookmarkStart w:id="20" w:name="_Toc242439994"/>
+      <w:bookmarkStart w:id="20" w:name="_Toc242459807"/>
       <w:r>
         <w:t>6.1 UC01</w:t>
       </w:r>
@@ -15400,7 +15089,7 @@
         <w:pStyle w:val="Heading2"/>
         <w:keepNext/>
       </w:pPr>
-      <w:bookmarkStart w:id="21" w:name="_Toc242439995"/>
+      <w:bookmarkStart w:id="21" w:name="_Toc242459808"/>
       <w:r>
         <w:t>6.2 UC02</w:t>
       </w:r>
@@ -16023,7 +15712,7 @@
         <w:pStyle w:val="Heading2"/>
         <w:keepNext/>
       </w:pPr>
-      <w:bookmarkStart w:id="22" w:name="_Toc242439996"/>
+      <w:bookmarkStart w:id="22" w:name="_Toc242459809"/>
       <w:r>
         <w:t>6.3 UC03</w:t>
       </w:r>
@@ -16647,7 +16336,7 @@
         <w:pStyle w:val="Heading1"/>
         <w:pageBreakBefore/>
       </w:pPr>
-      <w:bookmarkStart w:id="23" w:name="_Toc242439997"/>
+      <w:bookmarkStart w:id="23" w:name="_Toc242459810"/>
       <w:r>
         <w:lastRenderedPageBreak/>
         <w:t>7. Sequence Diagrams</w:t>
@@ -16667,7 +16356,7 @@
         <w:pStyle w:val="Heading2"/>
         <w:keepNext/>
       </w:pPr>
-      <w:bookmarkStart w:id="24" w:name="_Toc242439998"/>
+      <w:bookmarkStart w:id="24" w:name="_Toc242459811"/>
       <w:r>
         <w:t>7.1 SD01</w:t>
       </w:r>
@@ -16806,7 +16495,7 @@
         <w:pStyle w:val="Heading2"/>
         <w:keepNext/>
       </w:pPr>
-      <w:bookmarkStart w:id="25" w:name="_Toc242439999"/>
+      <w:bookmarkStart w:id="25" w:name="_Toc242459812"/>
       <w:r>
         <w:t>7.2 SD02</w:t>
       </w:r>
@@ -16945,7 +16634,7 @@
         <w:pStyle w:val="Heading2"/>
         <w:keepNext/>
       </w:pPr>
-      <w:bookmarkStart w:id="26" w:name="_Toc242440000"/>
+      <w:bookmarkStart w:id="26" w:name="_Toc242459813"/>
       <w:r>
         <w:t>7.3 SD03</w:t>
       </w:r>
@@ -17095,7 +16784,7 @@
       <w:pPr>
         <w:pStyle w:val="Heading1"/>
       </w:pPr>
-      <w:bookmarkStart w:id="27" w:name="_Toc242440001"/>
+      <w:bookmarkStart w:id="27" w:name="_Toc242459814"/>
       <w:r>
         <w:lastRenderedPageBreak/>
         <w:t>8. Feature-to-Design Traceability Table</w:t>
@@ -19581,7 +19270,6 @@
                 <w:sz w:val="18"/>
                 <w:szCs w:val="18"/>
               </w:rPr>
-              <w:lastRenderedPageBreak/>
               <w:t>F11</w:t>
             </w:r>
           </w:p>
@@ -19800,6 +19488,7 @@
                 <w:sz w:val="18"/>
                 <w:szCs w:val="18"/>
               </w:rPr>
+              <w:lastRenderedPageBreak/>
               <w:t>F12</w:t>
             </w:r>
           </w:p>
@@ -20008,7 +19697,7 @@
       <w:pPr>
         <w:pStyle w:val="Heading1"/>
       </w:pPr>
-      <w:bookmarkStart w:id="28" w:name="_Toc242440002"/>
+      <w:bookmarkStart w:id="28" w:name="_Toc242459815"/>
       <w:r>
         <w:lastRenderedPageBreak/>
         <w:t>9. Feature Implementation Explanations</w:t>
@@ -20028,7 +19717,7 @@
         <w:pStyle w:val="Heading2"/>
         <w:keepNext/>
       </w:pPr>
-      <w:bookmarkStart w:id="29" w:name="_Toc242440003"/>
+      <w:bookmarkStart w:id="29" w:name="_Toc242459816"/>
       <w:r>
         <w:t>F01: Scenario Setup</w:t>
       </w:r>
@@ -20205,7 +19894,7 @@
         <w:pStyle w:val="Heading2"/>
         <w:keepNext/>
       </w:pPr>
-      <w:bookmarkStart w:id="30" w:name="_Toc242440004"/>
+      <w:bookmarkStart w:id="30" w:name="_Toc242459817"/>
       <w:r>
         <w:t>F02: Lore Entry Management</w:t>
       </w:r>
@@ -20382,7 +20071,7 @@
         <w:pStyle w:val="Heading2"/>
         <w:keepNext/>
       </w:pPr>
-      <w:bookmarkStart w:id="31" w:name="_Toc242440005"/>
+      <w:bookmarkStart w:id="31" w:name="_Toc242459818"/>
       <w:r>
         <w:t>F03: Character Management</w:t>
       </w:r>
@@ -20560,7 +20249,7 @@
         <w:pStyle w:val="Heading2"/>
         <w:keepNext/>
       </w:pPr>
-      <w:bookmarkStart w:id="32" w:name="_Toc242440006"/>
+      <w:bookmarkStart w:id="32" w:name="_Toc242459819"/>
       <w:r>
         <w:t>F04: Story Turn</w:t>
       </w:r>
@@ -20737,11 +20426,11 @@
         <w:pStyle w:val="Heading2"/>
         <w:keepNext/>
       </w:pPr>
-      <w:bookmarkStart w:id="34" w:name="_Toc242440008"/>
+      <w:bookmarkStart w:id="33" w:name="_Toc242459820"/>
       <w:r>
         <w:t>F05: Pivotal Events</w:t>
       </w:r>
-      <w:bookmarkEnd w:id="34"/>
+      <w:bookmarkEnd w:id="33"/>
     </w:p>
     <w:p>
       <w:pPr>
@@ -20893,7 +20582,6 @@
           <w:b/>
           <w:bCs/>
         </w:rPr>
-        <w:lastRenderedPageBreak/>
         <w:t>Execution</w:t>
       </w:r>
     </w:p>
@@ -20915,11 +20603,11 @@
         <w:pStyle w:val="Heading2"/>
         <w:keepNext/>
       </w:pPr>
-      <w:bookmarkStart w:id="35" w:name="_Toc242440009"/>
+      <w:bookmarkStart w:id="34" w:name="_Toc242459821"/>
       <w:r>
         <w:t>F06: Plot Steering</w:t>
       </w:r>
-      <w:bookmarkEnd w:id="35"/>
+      <w:bookmarkEnd w:id="34"/>
     </w:p>
     <w:p>
       <w:pPr>
@@ -21071,6 +20759,7 @@
           <w:b/>
           <w:bCs/>
         </w:rPr>
+        <w:lastRenderedPageBreak/>
         <w:t>Execution</w:t>
       </w:r>
     </w:p>
@@ -21092,11 +20781,11 @@
         <w:pStyle w:val="Heading2"/>
         <w:keepNext/>
       </w:pPr>
-      <w:bookmarkStart w:id="36" w:name="_Toc242440010"/>
+      <w:bookmarkStart w:id="35" w:name="_Toc242459822"/>
       <w:r>
         <w:t>F07: Lore Proposals</w:t>
       </w:r>
-      <w:bookmarkEnd w:id="36"/>
+      <w:bookmarkEnd w:id="35"/>
     </w:p>
     <w:p>
       <w:pPr>
@@ -21269,11 +20958,11 @@
         <w:pStyle w:val="Heading2"/>
         <w:keepNext/>
       </w:pPr>
-      <w:bookmarkStart w:id="37" w:name="_Toc242440011"/>
+      <w:bookmarkStart w:id="36" w:name="_Toc242459823"/>
       <w:r>
         <w:t>F08: Consistency Check</w:t>
       </w:r>
-      <w:bookmarkEnd w:id="37"/>
+      <w:bookmarkEnd w:id="36"/>
     </w:p>
     <w:p>
       <w:pPr>
@@ -21425,7 +21114,6 @@
           <w:b/>
           <w:bCs/>
         </w:rPr>
-        <w:lastRenderedPageBreak/>
         <w:t>Execution</w:t>
       </w:r>
     </w:p>
@@ -21447,11 +21135,11 @@
         <w:pStyle w:val="Heading2"/>
         <w:keepNext/>
       </w:pPr>
-      <w:bookmarkStart w:id="38" w:name="_Toc242440012"/>
+      <w:bookmarkStart w:id="37" w:name="_Toc242459824"/>
       <w:r>
         <w:t>F09: Story Memory Summarization</w:t>
       </w:r>
-      <w:bookmarkEnd w:id="38"/>
+      <w:bookmarkEnd w:id="37"/>
     </w:p>
     <w:p>
       <w:pPr>
@@ -21603,6 +21291,7 @@
           <w:b/>
           <w:bCs/>
         </w:rPr>
+        <w:lastRenderedPageBreak/>
         <w:t>Execution</w:t>
       </w:r>
     </w:p>
@@ -21624,11 +21313,11 @@
         <w:pStyle w:val="Heading2"/>
         <w:keepNext/>
       </w:pPr>
-      <w:bookmarkStart w:id="39" w:name="_Toc242440013"/>
+      <w:bookmarkStart w:id="38" w:name="_Toc242459825"/>
       <w:r>
         <w:t>F10: Undo / Retry / Edit Turn</w:t>
       </w:r>
-      <w:bookmarkEnd w:id="39"/>
+      <w:bookmarkEnd w:id="38"/>
     </w:p>
     <w:p>
       <w:pPr>
@@ -21801,11 +21490,11 @@
         <w:pStyle w:val="Heading2"/>
         <w:keepNext/>
       </w:pPr>
-      <w:bookmarkStart w:id="40" w:name="_Toc242440014"/>
+      <w:bookmarkStart w:id="39" w:name="_Toc242459826"/>
       <w:r>
         <w:t>F11: Save and Load Session</w:t>
       </w:r>
-      <w:bookmarkEnd w:id="40"/>
+      <w:bookmarkEnd w:id="39"/>
     </w:p>
     <w:p>
       <w:pPr>
@@ -21957,7 +21646,6 @@
           <w:b/>
           <w:bCs/>
         </w:rPr>
-        <w:lastRenderedPageBreak/>
         <w:t>Execution</w:t>
       </w:r>
     </w:p>
@@ -21979,11 +21667,11 @@
         <w:pStyle w:val="Heading2"/>
         <w:keepNext/>
       </w:pPr>
-      <w:bookmarkStart w:id="41" w:name="_Toc242440015"/>
+      <w:bookmarkStart w:id="40" w:name="_Toc242459827"/>
       <w:r>
         <w:t>F12: Ending Generation</w:t>
       </w:r>
-      <w:bookmarkEnd w:id="41"/>
+      <w:bookmarkEnd w:id="40"/>
     </w:p>
     <w:p>
       <w:pPr>
@@ -22135,6 +21823,7 @@
           <w:b/>
           <w:bCs/>
         </w:rPr>
+        <w:lastRenderedPageBreak/>
         <w:t>Execution</w:t>
       </w:r>
     </w:p>

</xml_diff>